<commit_message>
Corregir esquema HTTP del SharePoint 2013 existente en la guia de mIA
portal.sunsetbeachclub.local corre hoy en HTTP, sin certificado SSL: no hay
nada que reutilizar para mIA. Se aclara que el certificado para
mia-pre.sunsetbeachclub.local y la apertura del puerto 443 en el firewall
parten de cero, y se anade el riesgo correspondiente al anexo de pendientes.

Co-Authored-By: Claude Sonnet 5 <noreply@anthropic.com>
</commit_message>
<xml_diff>
--- a/docs/Guia_Instalacion_mIA_Preproduccion.docx
+++ b/docs/Guia_Instalacion_mIA_Preproduccion.docx
@@ -266,7 +266,7 @@
                 <w:sz w:val="20"/>
                 <w:szCs w:val="20"/>
               </w:rPr>
-              <w:t xml:space="preserve">SharePoint 2013 — https://portal.sunsetbeachclub.local</w:t>
+              <w:t xml:space="preserve">SharePoint 2013 — http://portal.sunsetbeachclub.local</w:t>
             </w:r>
           </w:p>
         </w:tc>
@@ -1357,7 +1357,7 @@
           <w:sz w:val="22"/>
           <w:szCs w:val="22"/>
         </w:rPr>
-        <w:t xml:space="preserve">Este documento describe, paso a paso, la instalación de mIA (asistente conversacional de RRHH de Sunset Beach Club) en el entorno de preproducción, sobre un Windows Server 2022 que ya tiene IIS en funcionamiento y que actualmente aloja SharePoint 2013 bajo la URL https://portal.sunsetbeachclub.local.</w:t>
+        <w:t xml:space="preserve">Este documento describe, paso a paso, la instalación de mIA (asistente conversacional de RRHH de Sunset Beach Club) en el entorno de preproducción, sobre un Windows Server 2022 que ya tiene IIS en funcionamiento y que actualmente aloja SharePoint 2013 bajo la URL http://portal.sunsetbeachclub.local.</w:t>
       </w:r>
     </w:p>
     <w:p>
@@ -2440,7 +2440,7 @@
                 <w:sz w:val="20"/>
                 <w:szCs w:val="20"/>
               </w:rPr>
-              <w:t xml:space="preserve">https://portal.sunsetbeachclub.local</w:t>
+              <w:t xml:space="preserve">http://portal.sunsetbeachclub.local</w:t>
             </w:r>
           </w:p>
         </w:tc>
@@ -2667,7 +2667,7 @@
                 <w:sz w:val="21"/>
                 <w:szCs w:val="21"/>
               </w:rPr>
-              <w:t xml:space="preserve">Al ser .local (y no .com), ambas URL son de uso exclusivamente interno: solo resuelven dentro de la red corporativa (normalmente porque sunsetbeachclub.local es el propio dominio de Active Directory), nunca desde internet. Además, ninguna CA pública puede emitir certificados SSL para nombres .local desde 2015 (lo prohíben las reglas del CA/Browser Forum): el certificado de mia-pre.sunsetbeachclub.local tiene que emitirlo obligatoriamente la CA interna/corporativa (presumiblemente la misma que ya certifica portal.sunsetbeachclub.local) o, en su defecto, ser autofirmado. Esto afecta directamente al paso 7.2 de esta guía.</w:t>
+              <w:t xml:space="preserve">Al ser .local (y no .com), ambas URL son de uso exclusivamente interno: solo resuelven dentro de la red corporativa (normalmente porque sunsetbeachclub.local es el propio dominio de Active Directory), nunca desde internet. Además, ninguna CA pública puede emitir certificados SSL para nombres .local desde 2015 (lo prohíben las reglas del CA/Browser Forum): el certificado de mia-pre.sunsetbeachclub.local tiene que emitirlo obligatoriamente la CA interna/corporativa (p. ej. Active Directory Certificate Services, si existe) o, en su defecto, ser autofirmado. Esto afecta directamente al paso 7.2 de esta guía. Nota adicional: portal.sunsetbeachclub.local (SharePoint 2013) corre hoy en HTTP, sin certificado — no hay por tanto un certificado ni un binding 443 ya existentes en este servidor que reutilizar para mIA; hay que solicitar u obtener uno desde cero (sección 7.2) y abrir el puerto 443 en el firewall (sección 7.7), que probablemente no esté abierto todavía.</w:t>
             </w:r>
           </w:p>
         </w:tc>
@@ -6258,6 +6258,71 @@
       </w:r>
       <w:bookmarkEnd w:id="26"/>
     </w:p>
+    <w:tbl>
+      <w:tblPr>
+        <w:tblW w:type="pct" w:w="5000"/>
+        <w:tblBorders>
+          <w:top w:val="single" w:color="auto" w:sz="4"/>
+          <w:left w:val="single" w:color="auto" w:sz="4"/>
+          <w:bottom w:val="single" w:color="auto" w:sz="4"/>
+          <w:right w:val="single" w:color="auto" w:sz="4"/>
+          <w:insideH w:val="single" w:color="auto" w:sz="4"/>
+          <w:insideV w:val="single" w:color="auto" w:sz="4"/>
+        </w:tblBorders>
+      </w:tblPr>
+      <w:tblGrid>
+        <w:gridCol w:w="9026"/>
+      </w:tblGrid>
+      <w:tr>
+        <w:tc>
+          <w:tcPr>
+            <w:tcBorders>
+              <w:top w:val="single" w:color="E59866" w:sz="12"/>
+              <w:left w:val="single" w:color="E59866" w:sz="12"/>
+              <w:bottom w:val="single" w:color="E59866" w:sz="12"/>
+              <w:right w:val="single" w:color="E59866" w:sz="12"/>
+            </w:tcBorders>
+            <w:shd w:fill="FDEBD0" w:val="clear"/>
+            <w:tcMar>
+              <w:top w:type="dxa" w:w="140"/>
+              <w:left w:type="dxa" w:w="220"/>
+              <w:bottom w:type="dxa" w:w="140"/>
+              <w:right w:type="dxa" w:w="220"/>
+            </w:tcMar>
+          </w:tcPr>
+          <w:p>
+            <w:pPr>
+              <w:spacing w:after="60"/>
+            </w:pPr>
+            <w:r>
+              <w:rPr>
+                <w:rFonts w:ascii="Calibri" w:cs="Calibri" w:eastAsia="Calibri" w:hAnsi="Calibri"/>
+                <w:b/>
+                <w:bCs/>
+                <w:color w:val="7D4F0A"/>
+                <w:sz w:val="22"/>
+                <w:szCs w:val="22"/>
+              </w:rPr>
+              <w:t xml:space="preserve">No hay un certificado que reutilizar</w:t>
+            </w:r>
+          </w:p>
+          <w:p>
+            <w:pPr>
+              <w:spacing w:after="0"/>
+            </w:pPr>
+            <w:r>
+              <w:rPr>
+                <w:rFonts w:ascii="Calibri" w:cs="Calibri" w:eastAsia="Calibri" w:hAnsi="Calibri"/>
+                <w:color w:val="5A3A08"/>
+                <w:sz w:val="21"/>
+                <w:szCs w:val="21"/>
+              </w:rPr>
+              <w:t xml:space="preserve">portal.sunsetbeachclub.local (SharePoint 2013) corre en HTTP, sin certificado SSL propio. Este paso parte de cero: hay que obtener o emitir un certificado nuevo para mia-pre.sunsetbeachclub.local, no copiar ni reutilizar nada del sitio de SharePoint.</w:t>
+            </w:r>
+          </w:p>
+        </w:tc>
+      </w:tr>
+    </w:tbl>
     <w:p>
       <w:pPr>
         <w:spacing w:after="160" w:line="276"/>
@@ -6268,7 +6333,7 @@
           <w:sz w:val="22"/>
           <w:szCs w:val="22"/>
         </w:rPr>
-        <w:t xml:space="preserve">Instala en el almacén de certificados del servidor (Equipo local → Personal → Certificados) un certificado válido para mia-pre.sunsetbeachclub.local, emitido por la CA interna/corporativa (p. ej. Active Directory Certificate Services) — presumiblemente la misma que ya certifica portal.sunsetbeachclub.local. Al ser un nombre .local, ninguna CA pública puede emitir aquí un certificado válido; la única alternativa si no hay CA interna disponible es uno autofirmado (y entonces distribuir su confianza a los equipos cliente, por GPO o manualmente, para evitar avisos del navegador). Selecciónalo en el binding https del paso anterior.</w:t>
+        <w:t xml:space="preserve">Instala en el almacén de certificados del servidor (Equipo local → Personal → Certificados) un certificado válido para mia-pre.sunsetbeachclub.local, emitido por la CA interna/corporativa (p. ej. Active Directory Certificate Services, si la organización ya tiene una desplegada — confírmalo con el equipo de IT/infraestructura). Al ser un nombre .local, ninguna CA pública puede emitir aquí un certificado válido; si no hay CA interna disponible, la alternativa es un certificado autofirmado (y entonces distribuir su confianza a los equipos cliente, por GPO o manualmente, para evitar avisos del navegador). Selecciónalo en el binding https del paso anterior.</w:t>
       </w:r>
     </w:p>
     <w:p>
@@ -7221,7 +7286,7 @@
           <w:sz w:val="22"/>
           <w:szCs w:val="22"/>
         </w:rPr>
-        <w:t xml:space="preserve">443 y 80 están permitidos para el proceso de IIS (w3wp.exe / http.sys) — habitualmente ya lo están si SharePoint ya es accesible por HTTPS.</w:t>
+        <w:t xml:space="preserve">80 ya está permitido (SharePoint 2013 ya es accesible por HTTP), pero 443 probablemente NO lo esté: al ser SharePoint 2013 solo HTTP, es muy posible que el 443 nunca se haya abierto en este servidor. Verifícalo y ábrelo explícitamente para el proceso de IIS (w3wp.exe / http.sys) — no asumas que ya está permitido.</w:t>
       </w:r>
     </w:p>
     <w:p>
@@ -9794,6 +9859,134 @@
                 <w:szCs w:val="20"/>
               </w:rPr>
               <w:t xml:space="preserve">Superficie de riesgo innecesaria; usar el principio de mínimo privilegio sobre .env, el .pfx y la base de datos</w:t>
+            </w:r>
+          </w:p>
+        </w:tc>
+      </w:tr>
+      <w:tr>
+        <w:tc>
+          <w:tcPr>
+            <w:tcW w:type="dxa" w:w="4100"/>
+            <w:tcBorders>
+              <w:top w:val="single" w:color="B7C6E6" w:sz="4"/>
+              <w:left w:val="single" w:color="B7C6E6" w:sz="4"/>
+              <w:bottom w:val="single" w:color="B7C6E6" w:sz="4"/>
+              <w:right w:val="single" w:color="B7C6E6" w:sz="4"/>
+            </w:tcBorders>
+            <w:shd w:fill="F2F2F2" w:val="clear"/>
+            <w:tcMar>
+              <w:top w:type="dxa" w:w="90"/>
+              <w:left w:type="dxa" w:w="140"/>
+              <w:bottom w:type="dxa" w:w="90"/>
+              <w:right w:type="dxa" w:w="140"/>
+            </w:tcMar>
+            <w:vAlign w:val="center"/>
+          </w:tcPr>
+          <w:p>
+            <w:r>
+              <w:rPr>
+                <w:rFonts w:ascii="Calibri" w:cs="Calibri" w:eastAsia="Calibri" w:hAnsi="Calibri"/>
+                <w:b w:val="false"/>
+                <w:bCs w:val="false"/>
+                <w:sz w:val="20"/>
+                <w:szCs w:val="20"/>
+              </w:rPr>
+              <w:t xml:space="preserve">Puerto 443 no abierto todavía en el firewall</w:t>
+            </w:r>
+          </w:p>
+        </w:tc>
+        <w:tc>
+          <w:tcPr>
+            <w:tcW w:type="dxa" w:w="4926"/>
+            <w:tcBorders>
+              <w:top w:val="single" w:color="B7C6E6" w:sz="4"/>
+              <w:left w:val="single" w:color="B7C6E6" w:sz="4"/>
+              <w:bottom w:val="single" w:color="B7C6E6" w:sz="4"/>
+              <w:right w:val="single" w:color="B7C6E6" w:sz="4"/>
+            </w:tcBorders>
+            <w:shd w:fill="F2F2F2" w:val="clear"/>
+            <w:tcMar>
+              <w:top w:type="dxa" w:w="90"/>
+              <w:left w:type="dxa" w:w="140"/>
+              <w:bottom w:type="dxa" w:w="90"/>
+              <w:right w:type="dxa" w:w="140"/>
+            </w:tcMar>
+            <w:vAlign w:val="center"/>
+          </w:tcPr>
+          <w:p>
+            <w:r>
+              <w:rPr>
+                <w:rFonts w:ascii="Calibri" w:cs="Calibri" w:eastAsia="Calibri" w:hAnsi="Calibri"/>
+                <w:b w:val="false"/>
+                <w:bCs w:val="false"/>
+                <w:sz w:val="20"/>
+                <w:szCs w:val="20"/>
+              </w:rPr>
+              <w:t xml:space="preserve">SharePoint 2013 solo usa HTTP (80): el 443 puede no haberse abierto nunca en este servidor; confirmarlo explícitamente (sección 7.7), no asumir que ya está permitido</w:t>
+            </w:r>
+          </w:p>
+        </w:tc>
+      </w:tr>
+      <w:tr>
+        <w:tc>
+          <w:tcPr>
+            <w:tcW w:type="dxa" w:w="4100"/>
+            <w:tcBorders>
+              <w:top w:val="single" w:color="B7C6E6" w:sz="4"/>
+              <w:left w:val="single" w:color="B7C6E6" w:sz="4"/>
+              <w:bottom w:val="single" w:color="B7C6E6" w:sz="4"/>
+              <w:right w:val="single" w:color="B7C6E6" w:sz="4"/>
+            </w:tcBorders>
+            <w:shd w:fill="FFFFFF" w:val="clear"/>
+            <w:tcMar>
+              <w:top w:type="dxa" w:w="90"/>
+              <w:left w:type="dxa" w:w="140"/>
+              <w:bottom w:type="dxa" w:w="90"/>
+              <w:right w:type="dxa" w:w="140"/>
+            </w:tcMar>
+            <w:vAlign w:val="center"/>
+          </w:tcPr>
+          <w:p>
+            <w:r>
+              <w:rPr>
+                <w:rFonts w:ascii="Calibri" w:cs="Calibri" w:eastAsia="Calibri" w:hAnsi="Calibri"/>
+                <w:b w:val="false"/>
+                <w:bCs w:val="false"/>
+                <w:sz w:val="20"/>
+                <w:szCs w:val="20"/>
+              </w:rPr>
+              <w:t xml:space="preserve">Sin CA interna desplegada en la organización</w:t>
+            </w:r>
+          </w:p>
+        </w:tc>
+        <w:tc>
+          <w:tcPr>
+            <w:tcW w:type="dxa" w:w="4926"/>
+            <w:tcBorders>
+              <w:top w:val="single" w:color="B7C6E6" w:sz="4"/>
+              <w:left w:val="single" w:color="B7C6E6" w:sz="4"/>
+              <w:bottom w:val="single" w:color="B7C6E6" w:sz="4"/>
+              <w:right w:val="single" w:color="B7C6E6" w:sz="4"/>
+            </w:tcBorders>
+            <w:shd w:fill="FFFFFF" w:val="clear"/>
+            <w:tcMar>
+              <w:top w:type="dxa" w:w="90"/>
+              <w:left w:type="dxa" w:w="140"/>
+              <w:bottom w:type="dxa" w:w="90"/>
+              <w:right w:type="dxa" w:w="140"/>
+            </w:tcMar>
+            <w:vAlign w:val="center"/>
+          </w:tcPr>
+          <w:p>
+            <w:r>
+              <w:rPr>
+                <w:rFonts w:ascii="Calibri" w:cs="Calibri" w:eastAsia="Calibri" w:hAnsi="Calibri"/>
+                <w:b w:val="false"/>
+                <w:bCs w:val="false"/>
+                <w:sz w:val="20"/>
+                <w:szCs w:val="20"/>
+              </w:rPr>
+              <w:t xml:space="preserve">Si no existe Active Directory Certificate Services (o similar), el certificado de mia-pre.sunsetbeachclub.local tendrá que ser autofirmado, con los avisos de navegador que eso implica</w:t>
             </w:r>
           </w:p>
         </w:tc>

</xml_diff>

<commit_message>
Anadir instalacion de Visual Studio Build Tools, PostgreSQL y pgvector
Verificadas y fijadas las versiones exactas a usar en preproduccion:
PostgreSQL 17.11-5 (instalador oficial de EDB) y pgvector v0.8.7 (fuente
oficial de GitHub). Corregido ademas un dato impreciso: pgvector no tiene
binarios precompilados para Windows, se compila con nmake usando Visual
Studio Build Tools contra la instalacion de PostgreSQL -de ahi que ese
prerrequisito ya estuviera en la guia-. Renumerados los pasos del backend
en consecuencia.

Co-Authored-By: Claude Sonnet 5 <noreply@anthropic.com>
</commit_message>
<xml_diff>
--- a/docs/Guia_Instalacion_mIA_Preproduccion.docx
+++ b/docs/Guia_Instalacion_mIA_Preproduccion.docx
@@ -628,7 +628,7 @@
           </w:pPr>
           <w:hyperlink w:history="1" w:anchor="_Toc10">
             <w:r>
-              <w:t xml:space="preserve">Paso 2 — Instalar Visual C++ Build Tools</w:t>
+              <w:t xml:space="preserve">Paso 2 — Instalar Visual Studio Build Tools</w:t>
             </w:r>
             <w:r>
               <w:tab/>
@@ -651,7 +651,7 @@
           </w:pPr>
           <w:hyperlink w:history="1" w:anchor="_Toc11">
             <w:r>
-              <w:t xml:space="preserve">Paso 3 — Instalar PostgreSQL y la extensión pgvector</w:t>
+              <w:t xml:space="preserve">Paso 3 — Instalar PostgreSQL</w:t>
             </w:r>
             <w:r>
               <w:tab/>
@@ -674,7 +674,7 @@
           </w:pPr>
           <w:hyperlink w:history="1" w:anchor="_Toc12">
             <w:r>
-              <w:t xml:space="preserve">Paso 4 — Copiar el código de la aplicación</w:t>
+              <w:t xml:space="preserve">Paso 4 — Compilar e instalar la extensión pgvector</w:t>
             </w:r>
             <w:r>
               <w:tab/>
@@ -697,7 +697,7 @@
           </w:pPr>
           <w:hyperlink w:history="1" w:anchor="_Toc13">
             <w:r>
-              <w:t xml:space="preserve">Paso 5 — Crear el entorno virtual e instalar dependencias</w:t>
+              <w:t xml:space="preserve">Paso 5 — Copiar el código de la aplicación</w:t>
             </w:r>
             <w:r>
               <w:tab/>
@@ -720,7 +720,7 @@
           </w:pPr>
           <w:hyperlink w:history="1" w:anchor="_Toc14">
             <w:r>
-              <w:t xml:space="preserve">Paso 6 — Configurar las variables de entorno (.env)</w:t>
+              <w:t xml:space="preserve">Paso 6 — Crear el entorno virtual e instalar dependencias</w:t>
             </w:r>
             <w:r>
               <w:tab/>
@@ -743,7 +743,7 @@
           </w:pPr>
           <w:hyperlink w:history="1" w:anchor="_Toc15">
             <w:r>
-              <w:t xml:space="preserve">Paso 7 — Aplicar las migraciones de base de datos</w:t>
+              <w:t xml:space="preserve">Paso 7 — Configurar las variables de entorno (.env)</w:t>
             </w:r>
             <w:r>
               <w:tab/>
@@ -766,7 +766,7 @@
           </w:pPr>
           <w:hyperlink w:history="1" w:anchor="_Toc16">
             <w:r>
-              <w:t xml:space="preserve">Paso 8 — Prueba en caliente (sin servicio todavía)</w:t>
+              <w:t xml:space="preserve">Paso 8 — Aplicar las migraciones de base de datos</w:t>
             </w:r>
             <w:r>
               <w:tab/>
@@ -789,7 +789,7 @@
           </w:pPr>
           <w:hyperlink w:history="1" w:anchor="_Toc17">
             <w:r>
-              <w:t xml:space="preserve">Paso 9 — Registrar el backend como servicio de Windows (NSSM)</w:t>
+              <w:t xml:space="preserve">Paso 9 — Prueba en caliente (sin servicio todavía)</w:t>
             </w:r>
             <w:r>
               <w:tab/>
@@ -797,6 +797,29 @@
             <w:r>
               <w:fldChar w:fldCharType="begin" w:dirty="true"/>
               <w:instrText xml:space="preserve">PAGEREF _Toc17 \h</w:instrText>
+              <w:fldChar w:fldCharType="separate"/>
+              <w:fldChar w:fldCharType="end"/>
+            </w:r>
+          </w:hyperlink>
+        </w:p>
+        <w:p>
+          <w:pPr>
+            <w:pStyle w:val="TOC3"/>
+            <w:tabs>
+              <w:tab w:val="right" w:pos="9026" w:leader="dot"/>
+            </w:tabs>
+            <w:ind w:left="440"/>
+          </w:pPr>
+          <w:hyperlink w:history="1" w:anchor="_Toc18">
+            <w:r>
+              <w:t xml:space="preserve">Paso 10 — Registrar el backend como servicio de Windows (NSSM)</w:t>
+            </w:r>
+            <w:r>
+              <w:tab/>
+            </w:r>
+            <w:r>
+              <w:fldChar w:fldCharType="begin" w:dirty="true"/>
+              <w:instrText xml:space="preserve">PAGEREF _Toc18 \h</w:instrText>
               <w:fldChar w:fldCharType="separate"/>
               <w:fldChar w:fldCharType="end"/>
             </w:r>
@@ -810,7 +833,7 @@
             </w:tabs>
             <w:ind w:left="220"/>
           </w:pPr>
-          <w:hyperlink w:history="1" w:anchor="_Toc18">
+          <w:hyperlink w:history="1" w:anchor="_Toc19">
             <w:r>
               <w:t xml:space="preserve">5.3 Tarea programada de sincronización con SharePoint Online</w:t>
             </w:r>
@@ -819,7 +842,7 @@
             </w:r>
             <w:r>
               <w:fldChar w:fldCharType="begin" w:dirty="true"/>
-              <w:instrText xml:space="preserve">PAGEREF _Toc18 \h</w:instrText>
+              <w:instrText xml:space="preserve">PAGEREF _Toc19 \h</w:instrText>
               <w:fldChar w:fldCharType="separate"/>
               <w:fldChar w:fldCharType="end"/>
             </w:r>
@@ -832,32 +855,9 @@
               <w:tab w:val="right" w:pos="9026" w:leader="dot"/>
             </w:tabs>
           </w:pPr>
-          <w:hyperlink w:history="1" w:anchor="_Toc19">
+          <w:hyperlink w:history="1" w:anchor="_Toc20">
             <w:r>
               <w:t xml:space="preserve">6. Instalación del frontend (Vite — mundos 2D / 3D / holograma)</w:t>
-            </w:r>
-            <w:r>
-              <w:tab/>
-            </w:r>
-            <w:r>
-              <w:fldChar w:fldCharType="begin" w:dirty="true"/>
-              <w:instrText xml:space="preserve">PAGEREF _Toc19 \h</w:instrText>
-              <w:fldChar w:fldCharType="separate"/>
-              <w:fldChar w:fldCharType="end"/>
-            </w:r>
-          </w:hyperlink>
-        </w:p>
-        <w:p>
-          <w:pPr>
-            <w:pStyle w:val="TOC2"/>
-            <w:tabs>
-              <w:tab w:val="right" w:pos="9026" w:leader="dot"/>
-            </w:tabs>
-            <w:ind w:left="220"/>
-          </w:pPr>
-          <w:hyperlink w:history="1" w:anchor="_Toc20">
-            <w:r>
-              <w:t xml:space="preserve">6.1 Prerrequisitos del frontend</w:t>
             </w:r>
             <w:r>
               <w:tab/>
@@ -880,7 +880,7 @@
           </w:pPr>
           <w:hyperlink w:history="1" w:anchor="_Toc21">
             <w:r>
-              <w:t xml:space="preserve">6.2 Paso a paso</w:t>
+              <w:t xml:space="preserve">6.1 Prerrequisitos del frontend</w:t>
             </w:r>
             <w:r>
               <w:tab/>
@@ -895,15 +895,15 @@
         </w:p>
         <w:p>
           <w:pPr>
-            <w:pStyle w:val="TOC3"/>
+            <w:pStyle w:val="TOC2"/>
             <w:tabs>
               <w:tab w:val="right" w:pos="9026" w:leader="dot"/>
             </w:tabs>
-            <w:ind w:left="440"/>
+            <w:ind w:left="220"/>
           </w:pPr>
           <w:hyperlink w:history="1" w:anchor="_Toc22">
             <w:r>
-              <w:t xml:space="preserve">Paso 1 — Instalar dependencias y compilar</w:t>
+              <w:t xml:space="preserve">6.2 Paso a paso</w:t>
             </w:r>
             <w:r>
               <w:tab/>
@@ -926,7 +926,7 @@
           </w:pPr>
           <w:hyperlink w:history="1" w:anchor="_Toc23">
             <w:r>
-              <w:t xml:space="preserve">Paso 2 — Publicar el contenido compilado</w:t>
+              <w:t xml:space="preserve">Paso 1 — Instalar dependencias y compilar</w:t>
             </w:r>
             <w:r>
               <w:tab/>
@@ -934,6 +934,29 @@
             <w:r>
               <w:fldChar w:fldCharType="begin" w:dirty="true"/>
               <w:instrText xml:space="preserve">PAGEREF _Toc23 \h</w:instrText>
+              <w:fldChar w:fldCharType="separate"/>
+              <w:fldChar w:fldCharType="end"/>
+            </w:r>
+          </w:hyperlink>
+        </w:p>
+        <w:p>
+          <w:pPr>
+            <w:pStyle w:val="TOC3"/>
+            <w:tabs>
+              <w:tab w:val="right" w:pos="9026" w:leader="dot"/>
+            </w:tabs>
+            <w:ind w:left="440"/>
+          </w:pPr>
+          <w:hyperlink w:history="1" w:anchor="_Toc24">
+            <w:r>
+              <w:t xml:space="preserve">Paso 2 — Publicar el contenido compilado</w:t>
+            </w:r>
+            <w:r>
+              <w:tab/>
+            </w:r>
+            <w:r>
+              <w:fldChar w:fldCharType="begin" w:dirty="true"/>
+              <w:instrText xml:space="preserve">PAGEREF _Toc24 \h</w:instrText>
               <w:fldChar w:fldCharType="separate"/>
               <w:fldChar w:fldCharType="end"/>
             </w:r>
@@ -946,32 +969,9 @@
               <w:tab w:val="right" w:pos="9026" w:leader="dot"/>
             </w:tabs>
           </w:pPr>
-          <w:hyperlink w:history="1" w:anchor="_Toc24">
+          <w:hyperlink w:history="1" w:anchor="_Toc25">
             <w:r>
               <w:t xml:space="preserve">7. Configuración de IIS: sitio, binding y proxy inverso</w:t>
-            </w:r>
-            <w:r>
-              <w:tab/>
-            </w:r>
-            <w:r>
-              <w:fldChar w:fldCharType="begin" w:dirty="true"/>
-              <w:instrText xml:space="preserve">PAGEREF _Toc24 \h</w:instrText>
-              <w:fldChar w:fldCharType="separate"/>
-              <w:fldChar w:fldCharType="end"/>
-            </w:r>
-          </w:hyperlink>
-        </w:p>
-        <w:p>
-          <w:pPr>
-            <w:pStyle w:val="TOC2"/>
-            <w:tabs>
-              <w:tab w:val="right" w:pos="9026" w:leader="dot"/>
-            </w:tabs>
-            <w:ind w:left="220"/>
-          </w:pPr>
-          <w:hyperlink w:history="1" w:anchor="_Toc25">
-            <w:r>
-              <w:t xml:space="preserve">7.1 Crear el sitio IIS para mIA</w:t>
             </w:r>
             <w:r>
               <w:tab/>
@@ -994,7 +994,7 @@
           </w:pPr>
           <w:hyperlink w:history="1" w:anchor="_Toc26">
             <w:r>
-              <w:t xml:space="preserve">7.2 Certificado SSL</w:t>
+              <w:t xml:space="preserve">7.1 Crear el sitio IIS para mIA</w:t>
             </w:r>
             <w:r>
               <w:tab/>
@@ -1017,7 +1017,7 @@
           </w:pPr>
           <w:hyperlink w:history="1" w:anchor="_Toc27">
             <w:r>
-              <w:t xml:space="preserve">7.3 Instalar los módulos ARR y URL Rewrite</w:t>
+              <w:t xml:space="preserve">7.2 Certificado SSL</w:t>
             </w:r>
             <w:r>
               <w:tab/>
@@ -1040,7 +1040,7 @@
           </w:pPr>
           <w:hyperlink w:history="1" w:anchor="_Toc28">
             <w:r>
-              <w:t xml:space="preserve">7.4 Regla de proxy inverso hacia el backend</w:t>
+              <w:t xml:space="preserve">7.3 Instalar los módulos ARR y URL Rewrite</w:t>
             </w:r>
             <w:r>
               <w:tab/>
@@ -1063,7 +1063,7 @@
           </w:pPr>
           <w:hyperlink w:history="1" w:anchor="_Toc29">
             <w:r>
-              <w:t xml:space="preserve">7.5 Redirección HTTP → HTTPS</w:t>
+              <w:t xml:space="preserve">7.4 Regla de proxy inverso hacia el backend</w:t>
             </w:r>
             <w:r>
               <w:tab/>
@@ -1086,7 +1086,7 @@
           </w:pPr>
           <w:hyperlink w:history="1" w:anchor="_Toc30">
             <w:r>
-              <w:t xml:space="preserve">7.6 Publicación del frontend y la ruta /mia/</w:t>
+              <w:t xml:space="preserve">7.5 Redirección HTTP → HTTPS</w:t>
             </w:r>
             <w:r>
               <w:tab/>
@@ -1109,7 +1109,7 @@
           </w:pPr>
           <w:hyperlink w:history="1" w:anchor="_Toc31">
             <w:r>
-              <w:t xml:space="preserve">7.7 Firewall de Windows en el propio servidor</w:t>
+              <w:t xml:space="preserve">7.6 Publicación del frontend y la ruta /mia/</w:t>
             </w:r>
             <w:r>
               <w:tab/>
@@ -1124,14 +1124,15 @@
         </w:p>
         <w:p>
           <w:pPr>
-            <w:pStyle w:val="TOC1"/>
+            <w:pStyle w:val="TOC2"/>
             <w:tabs>
               <w:tab w:val="right" w:pos="9026" w:leader="dot"/>
             </w:tabs>
+            <w:ind w:left="220"/>
           </w:pPr>
           <w:hyperlink w:history="1" w:anchor="_Toc32">
             <w:r>
-              <w:t xml:space="preserve">8. DNS</w:t>
+              <w:t xml:space="preserve">7.7 Firewall de Windows en el propio servidor</w:t>
             </w:r>
             <w:r>
               <w:tab/>
@@ -1153,7 +1154,7 @@
           </w:pPr>
           <w:hyperlink w:history="1" w:anchor="_Toc33">
             <w:r>
-              <w:t xml:space="preserve">9. Validación y pruebas de aceptación</w:t>
+              <w:t xml:space="preserve">8. DNS</w:t>
             </w:r>
             <w:r>
               <w:tab/>
@@ -1175,7 +1176,7 @@
           </w:pPr>
           <w:hyperlink w:history="1" w:anchor="_Toc34">
             <w:r>
-              <w:t xml:space="preserve">Anexo A — Variables de entorno (.env) de referencia</w:t>
+              <w:t xml:space="preserve">9. Validación y pruebas de aceptación</w:t>
             </w:r>
             <w:r>
               <w:tab/>
@@ -1197,7 +1198,7 @@
           </w:pPr>
           <w:hyperlink w:history="1" w:anchor="_Toc35">
             <w:r>
-              <w:t xml:space="preserve">Anexo B — Comandos de referencia rápida</w:t>
+              <w:t xml:space="preserve">Anexo A — Variables de entorno (.env) de referencia</w:t>
             </w:r>
             <w:r>
               <w:tab/>
@@ -1212,15 +1213,14 @@
         </w:p>
         <w:p>
           <w:pPr>
-            <w:pStyle w:val="TOC3"/>
+            <w:pStyle w:val="TOC1"/>
             <w:tabs>
               <w:tab w:val="right" w:pos="9026" w:leader="dot"/>
             </w:tabs>
-            <w:ind w:left="440"/>
           </w:pPr>
           <w:hyperlink w:history="1" w:anchor="_Toc36">
             <w:r>
-              <w:t xml:space="preserve">Backend</w:t>
+              <w:t xml:space="preserve">Anexo B — Comandos de referencia rápida</w:t>
             </w:r>
             <w:r>
               <w:tab/>
@@ -1243,7 +1243,7 @@
           </w:pPr>
           <w:hyperlink w:history="1" w:anchor="_Toc37">
             <w:r>
-              <w:t xml:space="preserve">Base de datos</w:t>
+              <w:t xml:space="preserve">Backend</w:t>
             </w:r>
             <w:r>
               <w:tab/>
@@ -1266,7 +1266,7 @@
           </w:pPr>
           <w:hyperlink w:history="1" w:anchor="_Toc38">
             <w:r>
-              <w:t xml:space="preserve">Sincronización SharePoint</w:t>
+              <w:t xml:space="preserve">Base de datos</w:t>
             </w:r>
             <w:r>
               <w:tab/>
@@ -1289,7 +1289,7 @@
           </w:pPr>
           <w:hyperlink w:history="1" w:anchor="_Toc39">
             <w:r>
-              <w:t xml:space="preserve">Frontend</w:t>
+              <w:t xml:space="preserve">Sincronización SharePoint</w:t>
             </w:r>
             <w:r>
               <w:tab/>
@@ -1297,6 +1297,29 @@
             <w:r>
               <w:fldChar w:fldCharType="begin" w:dirty="true"/>
               <w:instrText xml:space="preserve">PAGEREF _Toc39 \h</w:instrText>
+              <w:fldChar w:fldCharType="separate"/>
+              <w:fldChar w:fldCharType="end"/>
+            </w:r>
+          </w:hyperlink>
+        </w:p>
+        <w:p>
+          <w:pPr>
+            <w:pStyle w:val="TOC3"/>
+            <w:tabs>
+              <w:tab w:val="right" w:pos="9026" w:leader="dot"/>
+            </w:tabs>
+            <w:ind w:left="440"/>
+          </w:pPr>
+          <w:hyperlink w:history="1" w:anchor="_Toc40">
+            <w:r>
+              <w:t xml:space="preserve">Frontend</w:t>
+            </w:r>
+            <w:r>
+              <w:tab/>
+            </w:r>
+            <w:r>
+              <w:fldChar w:fldCharType="begin" w:dirty="true"/>
+              <w:instrText xml:space="preserve">PAGEREF _Toc40 \h</w:instrText>
               <w:fldChar w:fldCharType="separate"/>
               <w:fldChar w:fldCharType="end"/>
             </w:r>
@@ -1309,7 +1332,7 @@
               <w:tab w:val="right" w:pos="9026" w:leader="dot"/>
             </w:tabs>
           </w:pPr>
-          <w:hyperlink w:history="1" w:anchor="_Toc40">
+          <w:hyperlink w:history="1" w:anchor="_Toc41">
             <w:r>
               <w:t xml:space="preserve">10. Riesgos y pendientes conocidos</w:t>
             </w:r>
@@ -1318,7 +1341,7 @@
             </w:r>
             <w:r>
               <w:fldChar w:fldCharType="begin" w:dirty="true"/>
-              <w:instrText xml:space="preserve">PAGEREF _Toc40 \h</w:instrText>
+              <w:instrText xml:space="preserve">PAGEREF _Toc41 \h</w:instrText>
               <w:fldChar w:fldCharType="separate"/>
               <w:fldChar w:fldCharType="end"/>
             </w:r>
@@ -3692,7 +3715,7 @@
                 <w:sz w:val="20"/>
                 <w:szCs w:val="20"/>
               </w:rPr>
-              <w:t xml:space="preserve">Visual C++ Build Tools</w:t>
+              <w:t xml:space="preserve">Visual Studio Build Tools</w:t>
             </w:r>
           </w:p>
         </w:tc>
@@ -3723,7 +3746,7 @@
                 <w:sz w:val="20"/>
                 <w:szCs w:val="20"/>
               </w:rPr>
-              <w:t xml:space="preserve">Última (Visual Studio Build Tools)</w:t>
+              <w:t xml:space="preserve">2022 (workload "Desktop development with C++")</w:t>
             </w:r>
           </w:p>
         </w:tc>
@@ -3754,7 +3777,7 @@
                 <w:sz w:val="20"/>
                 <w:szCs w:val="20"/>
               </w:rPr>
-              <w:t xml:space="preserve">Compilación de dependencias nativas (cryptography, pydantic-core, spaCy). Instalar el workload "Desktop development with C++"</w:t>
+              <w:t xml:space="preserve">Compila las dependencias nativas de Python (cryptography, pydantic-core, spaCy) Y la extensión pgvector, que en Windows se construye desde el código fuente con nmake (no hay binarios oficiales precompilados)</w:t>
             </w:r>
           </w:p>
         </w:tc>
@@ -3818,7 +3841,7 @@
                 <w:sz w:val="20"/>
                 <w:szCs w:val="20"/>
               </w:rPr>
-              <w:t xml:space="preserve">16 o 17 x64</w:t>
+              <w:t xml:space="preserve">17.11-5 x64 (EDB)</w:t>
             </w:r>
           </w:p>
         </w:tc>
@@ -3849,7 +3872,7 @@
                 <w:sz w:val="20"/>
                 <w:szCs w:val="20"/>
               </w:rPr>
-              <w:t xml:space="preserve">Base de datos. Instalador oficial de EDB para Windows</w:t>
+              <w:t xml:space="preserve">Base de datos. Instalador oficial de EnterpriseDB para Windows</w:t>
             </w:r>
           </w:p>
         </w:tc>
@@ -3882,7 +3905,7 @@
                 <w:sz w:val="20"/>
                 <w:szCs w:val="20"/>
               </w:rPr>
-              <w:t xml:space="preserve">Extensión pgvector</w:t>
+              <w:t xml:space="preserve">pgvector</w:t>
             </w:r>
           </w:p>
         </w:tc>
@@ -3913,7 +3936,7 @@
                 <w:sz w:val="20"/>
                 <w:szCs w:val="20"/>
               </w:rPr>
-              <w:t xml:space="preserve">La que corresponda a la versión de PostgreSQL instalada</w:t>
+              <w:t xml:space="preserve">v0.8.7 (código fuente oficial)</w:t>
             </w:r>
           </w:p>
         </w:tc>
@@ -3944,7 +3967,7 @@
                 <w:sz w:val="20"/>
                 <w:szCs w:val="20"/>
               </w:rPr>
-              <w:t xml:space="preserve">Búsqueda semántica (CVs, documentos). Binarios precompilados para Windows</w:t>
+              <w:t xml:space="preserve">Búsqueda semántica (CVs, documentos). Se compila con nmake usando Visual Studio Build Tools, contra la instalación de PostgreSQL del paso anterior</w:t>
             </w:r>
           </w:p>
         </w:tc>
@@ -3977,7 +4000,7 @@
                 <w:sz w:val="20"/>
                 <w:szCs w:val="20"/>
               </w:rPr>
-              <w:t xml:space="preserve">Git (opcional)</w:t>
+              <w:t xml:space="preserve">Git</w:t>
             </w:r>
           </w:p>
         </w:tc>
@@ -4039,7 +4062,7 @@
                 <w:sz w:val="20"/>
                 <w:szCs w:val="20"/>
               </w:rPr>
-              <w:t xml:space="preserve">Si el código se trae por clonado en vez de copia manual</w:t>
+              <w:t xml:space="preserve">Para clonar el código fuente de pgvector (alternativa: usar directamente el .zip de la release oficial, sin git)</w:t>
             </w:r>
           </w:p>
         </w:tc>
@@ -4239,7 +4262,7 @@
       </w:pPr>
       <w:bookmarkStart w:name="_Toc10" w:id="10"/>
       <w:r>
-        <w:t xml:space="preserve">Paso 2 — Instalar Visual C++ Build Tools</w:t>
+        <w:t xml:space="preserve">Paso 2 — Instalar Visual Studio Build Tools</w:t>
       </w:r>
       <w:bookmarkEnd w:id="10"/>
     </w:p>
@@ -4253,108 +4276,7 @@
           <w:sz w:val="22"/>
           <w:szCs w:val="22"/>
         </w:rPr>
-        <w:t xml:space="preserve">Instala Visual Studio Build Tools con el workload "Desktop development with C++". Necesario para que pip pueda compilar las dependencias nativas del proyecto.</w:t>
-      </w:r>
-    </w:p>
-    <w:p>
-      <w:pPr>
-        <w:pStyle w:val="Heading3"/>
-        <w:spacing w:after="100" w:before="200"/>
-      </w:pPr>
-      <w:bookmarkStart w:name="_Toc11" w:id="11"/>
-      <w:r>
-        <w:t xml:space="preserve">Paso 3 — Instalar PostgreSQL y la extensión pgvector</w:t>
-      </w:r>
-      <w:bookmarkEnd w:id="11"/>
-    </w:p>
-    <w:p>
-      <w:pPr>
-        <w:pStyle w:val="ListParagraph"/>
-        <w:numPr>
-          <w:ilvl w:val="0"/>
-          <w:numId w:val="3"/>
-        </w:numPr>
-        <w:spacing w:after="140"/>
-      </w:pPr>
-      <w:r>
-        <w:rPr>
-          <w:rFonts w:ascii="Calibri" w:cs="Calibri" w:eastAsia="Calibri" w:hAnsi="Calibri"/>
-          <w:sz w:val="22"/>
-          <w:szCs w:val="22"/>
-        </w:rPr>
-        <w:t xml:space="preserve">Ejecuta el instalador de PostgreSQL (16 o 17, x64). Anota el puerto (5432 por defecto) y la contraseña del usuario postgres.</w:t>
-      </w:r>
-    </w:p>
-    <w:p>
-      <w:pPr>
-        <w:pStyle w:val="ListParagraph"/>
-        <w:numPr>
-          <w:ilvl w:val="0"/>
-          <w:numId w:val="3"/>
-        </w:numPr>
-        <w:spacing w:after="140"/>
-      </w:pPr>
-      <w:r>
-        <w:rPr>
-          <w:rFonts w:ascii="Calibri" w:cs="Calibri" w:eastAsia="Calibri" w:hAnsi="Calibri"/>
-          <w:sz w:val="22"/>
-          <w:szCs w:val="22"/>
-        </w:rPr>
-        <w:t xml:space="preserve">Descarga los binarios de pgvector para Windows que coincidan EXACTAMENTE con la versión de PostgreSQL instalada.</w:t>
-      </w:r>
-    </w:p>
-    <w:p>
-      <w:pPr>
-        <w:pStyle w:val="ListParagraph"/>
-        <w:numPr>
-          <w:ilvl w:val="0"/>
-          <w:numId w:val="3"/>
-        </w:numPr>
-        <w:spacing w:after="140"/>
-      </w:pPr>
-      <w:r>
-        <w:rPr>
-          <w:rFonts w:ascii="Calibri" w:cs="Calibri" w:eastAsia="Calibri" w:hAnsi="Calibri"/>
-          <w:sz w:val="22"/>
-          <w:szCs w:val="22"/>
-        </w:rPr>
-        <w:t xml:space="preserve">Copia los ficheros de pgvector en las carpetas lib\ y share\extension\ del directorio de instalación de PostgreSQL (p. ej. C:\Program Files\PostgreSQL\16\).</w:t>
-      </w:r>
-    </w:p>
-    <w:p>
-      <w:pPr>
-        <w:pStyle w:val="ListParagraph"/>
-        <w:numPr>
-          <w:ilvl w:val="0"/>
-          <w:numId w:val="3"/>
-        </w:numPr>
-        <w:spacing w:after="140"/>
-      </w:pPr>
-      <w:r>
-        <w:rPr>
-          <w:rFonts w:ascii="Calibri" w:cs="Calibri" w:eastAsia="Calibri" w:hAnsi="Calibri"/>
-          <w:sz w:val="22"/>
-          <w:szCs w:val="22"/>
-        </w:rPr>
-        <w:t xml:space="preserve">Reinicia el servicio de PostgreSQL (postgresql-x64-16, en Servicios de Windows).</w:t>
-      </w:r>
-    </w:p>
-    <w:p>
-      <w:pPr>
-        <w:pStyle w:val="ListParagraph"/>
-        <w:numPr>
-          <w:ilvl w:val="0"/>
-          <w:numId w:val="3"/>
-        </w:numPr>
-        <w:spacing w:after="140"/>
-      </w:pPr>
-      <w:r>
-        <w:rPr>
-          <w:rFonts w:ascii="Calibri" w:cs="Calibri" w:eastAsia="Calibri" w:hAnsi="Calibri"/>
-          <w:sz w:val="22"/>
-          <w:szCs w:val="22"/>
-        </w:rPr>
-        <w:t xml:space="preserve">Crea el rol y la base de datos de la aplicación, usando psql o pgAdmin:</w:t>
+        <w:t xml:space="preserve">Necesario para compilar las dependencias nativas de Python y, en el paso siguiente, la propia extensión pgvector. Descarga el instalador oficial (bootstrapper) desde Microsoft e instala el workload de C++ en modo silencioso:</w:t>
       </w:r>
     </w:p>
     <w:tbl>
@@ -4394,7 +4316,7 @@
                 <w:sz w:val="19"/>
                 <w:szCs w:val="19"/>
               </w:rPr>
-              <w:t xml:space="preserve">CREATE ROLE mia WITH LOGIN PASSWORD 'una-password-fuerte';</w:t>
+              <w:t xml:space="preserve">vs_buildtools.exe --quiet --wait --norestart --nocache ^</w:t>
             </w:r>
           </w:p>
           <w:p>
@@ -4408,7 +4330,21 @@
                 <w:sz w:val="19"/>
                 <w:szCs w:val="19"/>
               </w:rPr>
-              <w:t xml:space="preserve">CREATE DATABASE mia OWNER mia;</w:t>
+              <w:t xml:space="preserve">  --add Microsoft.VisualStudio.Workload.VCTools ^</w:t>
+            </w:r>
+          </w:p>
+          <w:p>
+            <w:pPr>
+              <w:spacing w:after="0"/>
+            </w:pPr>
+            <w:r>
+              <w:rPr>
+                <w:rFonts w:ascii="Consolas" w:cs="Consolas" w:eastAsia="Consolas" w:hAnsi="Consolas"/>
+                <w:color w:val="E8E8E8"/>
+                <w:sz w:val="19"/>
+                <w:szCs w:val="19"/>
+              </w:rPr>
+              <w:t xml:space="preserve">  --includeRecommended</w:t>
             </w:r>
           </w:p>
         </w:tc>
@@ -4424,7 +4360,7 @@
           <w:sz w:val="22"/>
           <w:szCs w:val="22"/>
         </w:rPr>
-        <w:t xml:space="preserve">La extensión vector la crea automáticamente la primera migración de Alembic (0011_migracion_a_pgvector) en el paso 8 — no es necesario crearla a mano. Si ese paso fallara por permisos, créala una vez como postgres y después: ALTER EXTENSION vector OWNER TO mia;</w:t>
+        <w:t xml:space="preserve">(El instalador descarga los componentes del workload en el momento de ejecutarse: el servidor necesita salida a internet durante este paso.)</w:t>
       </w:r>
     </w:p>
     <w:p>
@@ -4432,15 +4368,20 @@
         <w:pStyle w:val="Heading3"/>
         <w:spacing w:after="100" w:before="200"/>
       </w:pPr>
-      <w:bookmarkStart w:name="_Toc12" w:id="12"/>
-      <w:r>
-        <w:t xml:space="preserve">Paso 4 — Copiar el código de la aplicación</w:t>
-      </w:r>
-      <w:bookmarkEnd w:id="12"/>
-    </w:p>
-    <w:p>
-      <w:pPr>
-        <w:spacing w:after="160" w:line="276"/>
+      <w:bookmarkStart w:name="_Toc11" w:id="11"/>
+      <w:r>
+        <w:t xml:space="preserve">Paso 3 — Instalar PostgreSQL</w:t>
+      </w:r>
+      <w:bookmarkEnd w:id="11"/>
+    </w:p>
+    <w:p>
+      <w:pPr>
+        <w:pStyle w:val="ListParagraph"/>
+        <w:numPr>
+          <w:ilvl w:val="0"/>
+          <w:numId w:val="3"/>
+        </w:numPr>
+        <w:spacing w:after="140"/>
       </w:pPr>
       <w:r>
         <w:rPr>
@@ -4448,7 +4389,43 @@
           <w:sz w:val="22"/>
           <w:szCs w:val="22"/>
         </w:rPr>
-        <w:t xml:space="preserve">Copia el repositorio a una ruta sin espacios ni tildes, por ejemplo:</w:t>
+        <w:t xml:space="preserve">Ejecuta el instalador oficial de EDB para Windows: postgresql-17.11-5-windows-x64.exe. Anota el puerto (5432 por defecto) y la contraseña del usuario postgres.</w:t>
+      </w:r>
+    </w:p>
+    <w:p>
+      <w:pPr>
+        <w:pStyle w:val="ListParagraph"/>
+        <w:numPr>
+          <w:ilvl w:val="0"/>
+          <w:numId w:val="3"/>
+        </w:numPr>
+        <w:spacing w:after="140"/>
+      </w:pPr>
+      <w:r>
+        <w:rPr>
+          <w:rFonts w:ascii="Calibri" w:cs="Calibri" w:eastAsia="Calibri" w:hAnsi="Calibri"/>
+          <w:sz w:val="22"/>
+          <w:szCs w:val="22"/>
+        </w:rPr>
+        <w:t xml:space="preserve">Confirma que queda instalado en C:\Program Files\PostgreSQL\17\ (ruta que se usa en el paso siguiente).</w:t>
+      </w:r>
+    </w:p>
+    <w:p>
+      <w:pPr>
+        <w:pStyle w:val="ListParagraph"/>
+        <w:numPr>
+          <w:ilvl w:val="0"/>
+          <w:numId w:val="3"/>
+        </w:numPr>
+        <w:spacing w:after="140"/>
+      </w:pPr>
+      <w:r>
+        <w:rPr>
+          <w:rFonts w:ascii="Calibri" w:cs="Calibri" w:eastAsia="Calibri" w:hAnsi="Calibri"/>
+          <w:sz w:val="22"/>
+          <w:szCs w:val="22"/>
+        </w:rPr>
+        <w:t xml:space="preserve">Crea el rol y la base de datos de la aplicación, usando psql o pgAdmin:</w:t>
       </w:r>
     </w:p>
     <w:tbl>
@@ -4488,7 +4465,21 @@
                 <w:sz w:val="19"/>
                 <w:szCs w:val="19"/>
               </w:rPr>
-              <w:t xml:space="preserve">C:\apps\mia\current\</w:t>
+              <w:t xml:space="preserve">CREATE ROLE mia WITH LOGIN PASSWORD 'una-password-fuerte';</w:t>
+            </w:r>
+          </w:p>
+          <w:p>
+            <w:pPr>
+              <w:spacing w:after="0"/>
+            </w:pPr>
+            <w:r>
+              <w:rPr>
+                <w:rFonts w:ascii="Consolas" w:cs="Consolas" w:eastAsia="Consolas" w:hAnsi="Consolas"/>
+                <w:color w:val="E8E8E8"/>
+                <w:sz w:val="19"/>
+                <w:szCs w:val="19"/>
+              </w:rPr>
+              <w:t xml:space="preserve">CREATE DATABASE mia OWNER mia;</w:t>
             </w:r>
           </w:p>
         </w:tc>
@@ -4499,11 +4490,11 @@
         <w:pStyle w:val="Heading3"/>
         <w:spacing w:after="100" w:before="200"/>
       </w:pPr>
-      <w:bookmarkStart w:name="_Toc13" w:id="13"/>
-      <w:r>
-        <w:t xml:space="preserve">Paso 5 — Crear el entorno virtual e instalar dependencias</w:t>
-      </w:r>
-      <w:bookmarkEnd w:id="13"/>
+      <w:bookmarkStart w:name="_Toc12" w:id="12"/>
+      <w:r>
+        <w:t xml:space="preserve">Paso 4 — Compilar e instalar la extensión pgvector</w:t>
+      </w:r>
+      <w:bookmarkEnd w:id="12"/>
     </w:p>
     <w:tbl>
       <w:tblPr>
@@ -4523,68 +4514,48 @@
       <w:tr>
         <w:tc>
           <w:tcPr>
-            <w:shd w:fill="2B2B2B" w:val="clear"/>
+            <w:tcBorders>
+              <w:top w:val="single" w:color="E59866" w:sz="12"/>
+              <w:left w:val="single" w:color="E59866" w:sz="12"/>
+              <w:bottom w:val="single" w:color="E59866" w:sz="12"/>
+              <w:right w:val="single" w:color="E59866" w:sz="12"/>
+            </w:tcBorders>
+            <w:shd w:fill="FDEBD0" w:val="clear"/>
             <w:tcMar>
               <w:top w:type="dxa" w:w="140"/>
-              <w:left w:type="dxa" w:w="200"/>
+              <w:left w:type="dxa" w:w="220"/>
               <w:bottom w:type="dxa" w:w="140"/>
-              <w:right w:type="dxa" w:w="200"/>
-            </w:tcMar>
-          </w:tcPr>
+              <w:right w:type="dxa" w:w="220"/>
+            </w:tcMar>
+          </w:tcPr>
+          <w:p>
+            <w:pPr>
+              <w:spacing w:after="60"/>
+            </w:pPr>
+            <w:r>
+              <w:rPr>
+                <w:rFonts w:ascii="Calibri" w:cs="Calibri" w:eastAsia="Calibri" w:hAnsi="Calibri"/>
+                <w:b/>
+                <w:bCs/>
+                <w:color w:val="7D4F0A"/>
+                <w:sz w:val="22"/>
+                <w:szCs w:val="22"/>
+              </w:rPr>
+              <w:t xml:space="preserve">No hay binarios oficiales para Windows</w:t>
+            </w:r>
+          </w:p>
           <w:p>
             <w:pPr>
               <w:spacing w:after="0"/>
             </w:pPr>
             <w:r>
               <w:rPr>
-                <w:rFonts w:ascii="Consolas" w:cs="Consolas" w:eastAsia="Consolas" w:hAnsi="Consolas"/>
-                <w:color w:val="E8E8E8"/>
-                <w:sz w:val="19"/>
-                <w:szCs w:val="19"/>
-              </w:rPr>
-              <w:t xml:space="preserve">cd C:\apps\mia\current</w:t>
-            </w:r>
-          </w:p>
-          <w:p>
-            <w:pPr>
-              <w:spacing w:after="0"/>
-            </w:pPr>
-            <w:r>
-              <w:rPr>
-                <w:rFonts w:ascii="Consolas" w:cs="Consolas" w:eastAsia="Consolas" w:hAnsi="Consolas"/>
-                <w:color w:val="E8E8E8"/>
-                <w:sz w:val="19"/>
-                <w:szCs w:val="19"/>
-              </w:rPr>
-              <w:t xml:space="preserve">python -m venv .venv</w:t>
-            </w:r>
-          </w:p>
-          <w:p>
-            <w:pPr>
-              <w:spacing w:after="0"/>
-            </w:pPr>
-            <w:r>
-              <w:rPr>
-                <w:rFonts w:ascii="Consolas" w:cs="Consolas" w:eastAsia="Consolas" w:hAnsi="Consolas"/>
-                <w:color w:val="E8E8E8"/>
-                <w:sz w:val="19"/>
-                <w:szCs w:val="19"/>
-              </w:rPr>
-              <w:t xml:space="preserve">.venv\Scripts\Activate.ps1</w:t>
-            </w:r>
-          </w:p>
-          <w:p>
-            <w:pPr>
-              <w:spacing w:after="0"/>
-            </w:pPr>
-            <w:r>
-              <w:rPr>
-                <w:rFonts w:ascii="Consolas" w:cs="Consolas" w:eastAsia="Consolas" w:hAnsi="Consolas"/>
-                <w:color w:val="E8E8E8"/>
-                <w:sz w:val="19"/>
-                <w:szCs w:val="19"/>
-              </w:rPr>
-              <w:t xml:space="preserve">pip install -e .</w:t>
+                <w:rFonts w:ascii="Calibri" w:cs="Calibri" w:eastAsia="Calibri" w:hAnsi="Calibri"/>
+                <w:color w:val="5A3A08"/>
+                <w:sz w:val="21"/>
+                <w:szCs w:val="21"/>
+              </w:rPr>
+              <w:t xml:space="preserve">pgvector no distribuye binarios precompilados para Windows: la propia documentación oficial del proyecto indica compilarlo desde el código fuente con nmake, usando Visual Studio Build Tools (paso 2) contra la instalación de PostgreSQL del paso 3. Por eso ambos pasos van en este orden.</w:t>
             </w:r>
           </w:p>
         </w:tc>
@@ -4592,7 +4563,12 @@
     </w:tbl>
     <w:p>
       <w:pPr>
-        <w:spacing w:after="160" w:line="276"/>
+        <w:pStyle w:val="ListParagraph"/>
+        <w:numPr>
+          <w:ilvl w:val="0"/>
+          <w:numId w:val="3"/>
+        </w:numPr>
+        <w:spacing w:after="140"/>
       </w:pPr>
       <w:r>
         <w:rPr>
@@ -4600,23 +4576,17 @@
           <w:sz w:val="22"/>
           <w:szCs w:val="22"/>
         </w:rPr>
-        <w:t xml:space="preserve">No instales los extras [dev] ni [azure] en el servidor de preproducción: son para desarrollo local y para Azure respectivamente.</w:t>
-      </w:r>
-    </w:p>
-    <w:p>
-      <w:pPr>
-        <w:pStyle w:val="Heading3"/>
-        <w:spacing w:after="100" w:before="200"/>
-      </w:pPr>
-      <w:bookmarkStart w:name="_Toc14" w:id="14"/>
-      <w:r>
-        <w:t xml:space="preserve">Paso 6 — Configurar las variables de entorno (.env)</w:t>
-      </w:r>
-      <w:bookmarkEnd w:id="14"/>
-    </w:p>
-    <w:p>
-      <w:pPr>
-        <w:spacing w:after="160" w:line="276"/>
+        <w:t xml:space="preserve">Abre "x64 Native Tools Command Prompt for VS 2022" como administrador (lo instala Visual Studio Build Tools; aparece en el menú de inicio).</w:t>
+      </w:r>
+    </w:p>
+    <w:p>
+      <w:pPr>
+        <w:pStyle w:val="ListParagraph"/>
+        <w:numPr>
+          <w:ilvl w:val="0"/>
+          <w:numId w:val="3"/>
+        </w:numPr>
+        <w:spacing w:after="140"/>
       </w:pPr>
       <w:r>
         <w:rPr>
@@ -4624,97 +4594,7 @@
           <w:sz w:val="22"/>
           <w:szCs w:val="22"/>
         </w:rPr>
-        <w:t xml:space="preserve">Copia .env.example a .env en la raíz del proyecto y completa los valores reales. Las variables más relevantes para preproducción se detallan en el Anexo A. Resumen de las decisiones clave:</w:t>
-      </w:r>
-    </w:p>
-    <w:p>
-      <w:pPr>
-        <w:pStyle w:val="ListParagraph"/>
-        <w:numPr>
-          <w:ilvl w:val="0"/>
-          <w:numId w:val="2"/>
-        </w:numPr>
-        <w:spacing w:after="100"/>
-      </w:pPr>
-      <w:r>
-        <w:rPr>
-          <w:rFonts w:ascii="Calibri" w:cs="Calibri" w:eastAsia="Calibri" w:hAnsi="Calibri"/>
-          <w:sz w:val="22"/>
-          <w:szCs w:val="22"/>
-        </w:rPr>
-        <w:t xml:space="preserve">MIA_HOST=127.0.0.1 y MIA_PORT=8000 — el backend NO se expone directamente; IIS hace de proxy.</w:t>
-      </w:r>
-    </w:p>
-    <w:p>
-      <w:pPr>
-        <w:pStyle w:val="ListParagraph"/>
-        <w:numPr>
-          <w:ilvl w:val="0"/>
-          <w:numId w:val="2"/>
-        </w:numPr>
-        <w:spacing w:after="100"/>
-      </w:pPr>
-      <w:r>
-        <w:rPr>
-          <w:rFonts w:ascii="Calibri" w:cs="Calibri" w:eastAsia="Calibri" w:hAnsi="Calibri"/>
-          <w:sz w:val="22"/>
-          <w:szCs w:val="22"/>
-        </w:rPr>
-        <w:t xml:space="preserve">No definir MIA_COMPAT_PORT en preproducción (solo se usa en desarrollo local).</w:t>
-      </w:r>
-    </w:p>
-    <w:p>
-      <w:pPr>
-        <w:pStyle w:val="ListParagraph"/>
-        <w:numPr>
-          <w:ilvl w:val="0"/>
-          <w:numId w:val="2"/>
-        </w:numPr>
-        <w:spacing w:after="100"/>
-      </w:pPr>
-      <w:r>
-        <w:rPr>
-          <w:rFonts w:ascii="Calibri" w:cs="Calibri" w:eastAsia="Calibri" w:hAnsi="Calibri"/>
-          <w:sz w:val="22"/>
-          <w:szCs w:val="22"/>
-        </w:rPr>
-        <w:t xml:space="preserve">MIA_DATABASE_URL apuntando al rol y base de datos creados en el Paso 3.</w:t>
-      </w:r>
-    </w:p>
-    <w:p>
-      <w:pPr>
-        <w:pStyle w:val="ListParagraph"/>
-        <w:numPr>
-          <w:ilvl w:val="0"/>
-          <w:numId w:val="2"/>
-        </w:numPr>
-        <w:spacing w:after="100"/>
-      </w:pPr>
-      <w:r>
-        <w:rPr>
-          <w:rFonts w:ascii="Calibri" w:cs="Calibri" w:eastAsia="Calibri" w:hAnsi="Calibri"/>
-          <w:sz w:val="22"/>
-          <w:szCs w:val="22"/>
-        </w:rPr>
-        <w:t xml:space="preserve">MIA_SHAREPOINT__* con el tenant, client id y certificado reales de la aplicación de Entra ID para SharePoint Online.</w:t>
-      </w:r>
-    </w:p>
-    <w:p>
-      <w:pPr>
-        <w:pStyle w:val="ListParagraph"/>
-        <w:numPr>
-          <w:ilvl w:val="0"/>
-          <w:numId w:val="2"/>
-        </w:numPr>
-        <w:spacing w:after="100"/>
-      </w:pPr>
-      <w:r>
-        <w:rPr>
-          <w:rFonts w:ascii="Calibri" w:cs="Calibri" w:eastAsia="Calibri" w:hAnsi="Calibri"/>
-          <w:sz w:val="22"/>
-          <w:szCs w:val="22"/>
-        </w:rPr>
-        <w:t xml:space="preserve">MIA_DATA__PSEUDONYM_KEY — generar una clave nueva y no cambiarla después (afecta a los seudónimos de DNI/NIE ya sincronizados).</w:t>
+        <w:t xml:space="preserve">Obtén el código fuente de la versión v0.8.7 (la estable en el momento de escribir esta guía) — por clonado:</w:t>
       </w:r>
     </w:p>
     <w:tbl>
@@ -4754,7 +4634,49 @@
                 <w:sz w:val="19"/>
                 <w:szCs w:val="19"/>
               </w:rPr>
-              <w:t xml:space="preserve">python -c "import secrets; print(secrets.token_urlsafe(32))"</w:t>
+              <w:t xml:space="preserve">set "PGROOT=C:\Program Files\PostgreSQL\17"</w:t>
+            </w:r>
+          </w:p>
+          <w:p>
+            <w:pPr>
+              <w:spacing w:after="0"/>
+            </w:pPr>
+            <w:r>
+              <w:rPr>
+                <w:rFonts w:ascii="Consolas" w:cs="Consolas" w:eastAsia="Consolas" w:hAnsi="Consolas"/>
+                <w:color w:val="E8E8E8"/>
+                <w:sz w:val="19"/>
+                <w:szCs w:val="19"/>
+              </w:rPr>
+              <w:t xml:space="preserve">cd %TEMP%</w:t>
+            </w:r>
+          </w:p>
+          <w:p>
+            <w:pPr>
+              <w:spacing w:after="0"/>
+            </w:pPr>
+            <w:r>
+              <w:rPr>
+                <w:rFonts w:ascii="Consolas" w:cs="Consolas" w:eastAsia="Consolas" w:hAnsi="Consolas"/>
+                <w:color w:val="E8E8E8"/>
+                <w:sz w:val="19"/>
+                <w:szCs w:val="19"/>
+              </w:rPr>
+              <w:t xml:space="preserve">git clone --branch v0.8.7 https://github.com/pgvector/pgvector.git</w:t>
+            </w:r>
+          </w:p>
+          <w:p>
+            <w:pPr>
+              <w:spacing w:after="0"/>
+            </w:pPr>
+            <w:r>
+              <w:rPr>
+                <w:rFonts w:ascii="Consolas" w:cs="Consolas" w:eastAsia="Consolas" w:hAnsi="Consolas"/>
+                <w:color w:val="E8E8E8"/>
+                <w:sz w:val="19"/>
+                <w:szCs w:val="19"/>
+              </w:rPr>
+              <w:t xml:space="preserve">cd pgvector</w:t>
             </w:r>
           </w:p>
         </w:tc>
@@ -4762,12 +4684,7 @@
     </w:tbl>
     <w:p>
       <w:pPr>
-        <w:pStyle w:val="ListParagraph"/>
-        <w:numPr>
-          <w:ilvl w:val="0"/>
-          <w:numId w:val="2"/>
-        </w:numPr>
-        <w:spacing w:after="100"/>
+        <w:spacing w:after="160" w:line="276"/>
       </w:pPr>
       <w:r>
         <w:rPr>
@@ -4775,7 +4692,25 @@
           <w:sz w:val="22"/>
           <w:szCs w:val="22"/>
         </w:rPr>
-        <w:t xml:space="preserve">MIA_AUTH__MODE — no dejar en "dev" (identidad fija de pruebas); configurar "entra" si ya existe el registro de la aplicación en Entra ID.</w:t>
+        <w:t xml:space="preserve">(Alternativa sin git: descarga el .zip de la release oficial —github.com/pgvector/pgvector, etiqueta v0.8.7— y descomprímelo en esa misma carpeta.)</w:t>
+      </w:r>
+    </w:p>
+    <w:p>
+      <w:pPr>
+        <w:pStyle w:val="ListParagraph"/>
+        <w:numPr>
+          <w:ilvl w:val="0"/>
+          <w:numId w:val="3"/>
+        </w:numPr>
+        <w:spacing w:after="140"/>
+      </w:pPr>
+      <w:r>
+        <w:rPr>
+          <w:rFonts w:ascii="Calibri" w:cs="Calibri" w:eastAsia="Calibri" w:hAnsi="Calibri"/>
+          <w:sz w:val="22"/>
+          <w:szCs w:val="22"/>
+        </w:rPr>
+        <w:t xml:space="preserve">Compila e instala:</w:t>
       </w:r>
     </w:p>
     <w:tbl>
@@ -4796,48 +4731,40 @@
       <w:tr>
         <w:tc>
           <w:tcPr>
-            <w:tcBorders>
-              <w:top w:val="single" w:color="E59866" w:sz="12"/>
-              <w:left w:val="single" w:color="E59866" w:sz="12"/>
-              <w:bottom w:val="single" w:color="E59866" w:sz="12"/>
-              <w:right w:val="single" w:color="E59866" w:sz="12"/>
-            </w:tcBorders>
-            <w:shd w:fill="FDEBD0" w:val="clear"/>
+            <w:shd w:fill="2B2B2B" w:val="clear"/>
             <w:tcMar>
               <w:top w:type="dxa" w:w="140"/>
-              <w:left w:type="dxa" w:w="220"/>
+              <w:left w:type="dxa" w:w="200"/>
               <w:bottom w:type="dxa" w:w="140"/>
-              <w:right w:type="dxa" w:w="220"/>
-            </w:tcMar>
-          </w:tcPr>
-          <w:p>
-            <w:pPr>
-              <w:spacing w:after="60"/>
-            </w:pPr>
-            <w:r>
-              <w:rPr>
-                <w:rFonts w:ascii="Calibri" w:cs="Calibri" w:eastAsia="Calibri" w:hAnsi="Calibri"/>
-                <w:b/>
-                <w:bCs/>
-                <w:color w:val="7D4F0A"/>
-                <w:sz w:val="22"/>
-                <w:szCs w:val="22"/>
-              </w:rPr>
-              <w:t xml:space="preserve">Seguridad del fichero .env y del certificado</w:t>
-            </w:r>
-          </w:p>
+              <w:right w:type="dxa" w:w="200"/>
+            </w:tcMar>
+          </w:tcPr>
           <w:p>
             <w:pPr>
               <w:spacing w:after="0"/>
             </w:pPr>
             <w:r>
               <w:rPr>
-                <w:rFonts w:ascii="Calibri" w:cs="Calibri" w:eastAsia="Calibri" w:hAnsi="Calibri"/>
-                <w:color w:val="5A3A08"/>
-                <w:sz w:val="21"/>
-                <w:szCs w:val="21"/>
-              </w:rPr>
-              <w:t xml:space="preserve">Restringe los permisos NTFS de .env y del certificado .pfx solo a la cuenta de servicio y a los administradores (nunca "Everyone" ni "Users"). No copies estos valores a tickets, chats ni repositorios.</w:t>
+                <w:rFonts w:ascii="Consolas" w:cs="Consolas" w:eastAsia="Consolas" w:hAnsi="Consolas"/>
+                <w:color w:val="E8E8E8"/>
+                <w:sz w:val="19"/>
+                <w:szCs w:val="19"/>
+              </w:rPr>
+              <w:t xml:space="preserve">nmake /F Makefile.win</w:t>
+            </w:r>
+          </w:p>
+          <w:p>
+            <w:pPr>
+              <w:spacing w:after="0"/>
+            </w:pPr>
+            <w:r>
+              <w:rPr>
+                <w:rFonts w:ascii="Consolas" w:cs="Consolas" w:eastAsia="Consolas" w:hAnsi="Consolas"/>
+                <w:color w:val="E8E8E8"/>
+                <w:sz w:val="19"/>
+                <w:szCs w:val="19"/>
+              </w:rPr>
+              <w:t xml:space="preserve">nmake /F Makefile.win install</w:t>
             </w:r>
           </w:p>
         </w:tc>
@@ -4845,14 +4772,58 @@
     </w:tbl>
     <w:p>
       <w:pPr>
+        <w:pStyle w:val="ListParagraph"/>
+        <w:numPr>
+          <w:ilvl w:val="0"/>
+          <w:numId w:val="3"/>
+        </w:numPr>
+        <w:spacing w:after="140"/>
+      </w:pPr>
+      <w:r>
+        <w:rPr>
+          <w:rFonts w:ascii="Calibri" w:cs="Calibri" w:eastAsia="Calibri" w:hAnsi="Calibri"/>
+          <w:sz w:val="22"/>
+          <w:szCs w:val="22"/>
+        </w:rPr>
+        <w:t xml:space="preserve">Reinicia el servicio de PostgreSQL (postgresql-x64-17, en Servicios de Windows) para que detecte la extensión.</w:t>
+      </w:r>
+    </w:p>
+    <w:p>
+      <w:pPr>
+        <w:spacing w:after="160" w:line="276"/>
+      </w:pPr>
+      <w:r>
+        <w:rPr>
+          <w:rFonts w:ascii="Calibri" w:cs="Calibri" w:eastAsia="Calibri" w:hAnsi="Calibri"/>
+          <w:sz w:val="22"/>
+          <w:szCs w:val="22"/>
+        </w:rPr>
+        <w:t xml:space="preserve">La extensión vector en la base de datos la crea automáticamente la primera migración de Alembic (0011_migracion_a_pgvector) en el paso 8 — no es necesario ejecutar CREATE EXTENSION a mano. Si ese paso fallara por permisos, créala una vez como postgres y después: ALTER EXTENSION vector OWNER TO mia;</w:t>
+      </w:r>
+    </w:p>
+    <w:p>
+      <w:pPr>
         <w:pStyle w:val="Heading3"/>
         <w:spacing w:after="100" w:before="200"/>
       </w:pPr>
-      <w:bookmarkStart w:name="_Toc15" w:id="15"/>
-      <w:r>
-        <w:t xml:space="preserve">Paso 7 — Aplicar las migraciones de base de datos</w:t>
-      </w:r>
-      <w:bookmarkEnd w:id="15"/>
+      <w:bookmarkStart w:name="_Toc13" w:id="13"/>
+      <w:r>
+        <w:t xml:space="preserve">Paso 5 — Copiar el código de la aplicación</w:t>
+      </w:r>
+      <w:bookmarkEnd w:id="13"/>
+    </w:p>
+    <w:p>
+      <w:pPr>
+        <w:spacing w:after="160" w:line="276"/>
+      </w:pPr>
+      <w:r>
+        <w:rPr>
+          <w:rFonts w:ascii="Calibri" w:cs="Calibri" w:eastAsia="Calibri" w:hAnsi="Calibri"/>
+          <w:sz w:val="22"/>
+          <w:szCs w:val="22"/>
+        </w:rPr>
+        <w:t xml:space="preserve">Copia el repositorio a una ruta sin espacios ni tildes, por ejemplo:</w:t>
+      </w:r>
     </w:p>
     <w:tbl>
       <w:tblPr>
@@ -4891,7 +4862,7 @@
                 <w:sz w:val="19"/>
                 <w:szCs w:val="19"/>
               </w:rPr>
-              <w:t xml:space="preserve">alembic upgrade head</w:t>
+              <w:t xml:space="preserve">C:\apps\mia\current\</w:t>
             </w:r>
           </w:p>
         </w:tc>
@@ -4902,11 +4873,11 @@
         <w:pStyle w:val="Heading3"/>
         <w:spacing w:after="100" w:before="200"/>
       </w:pPr>
-      <w:bookmarkStart w:name="_Toc16" w:id="16"/>
-      <w:r>
-        <w:t xml:space="preserve">Paso 8 — Prueba en caliente (sin servicio todavía)</w:t>
-      </w:r>
-      <w:bookmarkEnd w:id="16"/>
+      <w:bookmarkStart w:name="_Toc14" w:id="14"/>
+      <w:r>
+        <w:t xml:space="preserve">Paso 6 — Crear el entorno virtual e instalar dependencias</w:t>
+      </w:r>
+      <w:bookmarkEnd w:id="14"/>
     </w:p>
     <w:tbl>
       <w:tblPr>
@@ -4945,7 +4916,49 @@
                 <w:sz w:val="19"/>
                 <w:szCs w:val="19"/>
               </w:rPr>
-              <w:t xml:space="preserve">python -m mia</w:t>
+              <w:t xml:space="preserve">cd C:\apps\mia\current</w:t>
+            </w:r>
+          </w:p>
+          <w:p>
+            <w:pPr>
+              <w:spacing w:after="0"/>
+            </w:pPr>
+            <w:r>
+              <w:rPr>
+                <w:rFonts w:ascii="Consolas" w:cs="Consolas" w:eastAsia="Consolas" w:hAnsi="Consolas"/>
+                <w:color w:val="E8E8E8"/>
+                <w:sz w:val="19"/>
+                <w:szCs w:val="19"/>
+              </w:rPr>
+              <w:t xml:space="preserve">python -m venv .venv</w:t>
+            </w:r>
+          </w:p>
+          <w:p>
+            <w:pPr>
+              <w:spacing w:after="0"/>
+            </w:pPr>
+            <w:r>
+              <w:rPr>
+                <w:rFonts w:ascii="Consolas" w:cs="Consolas" w:eastAsia="Consolas" w:hAnsi="Consolas"/>
+                <w:color w:val="E8E8E8"/>
+                <w:sz w:val="19"/>
+                <w:szCs w:val="19"/>
+              </w:rPr>
+              <w:t xml:space="preserve">.venv\Scripts\Activate.ps1</w:t>
+            </w:r>
+          </w:p>
+          <w:p>
+            <w:pPr>
+              <w:spacing w:after="0"/>
+            </w:pPr>
+            <w:r>
+              <w:rPr>
+                <w:rFonts w:ascii="Consolas" w:cs="Consolas" w:eastAsia="Consolas" w:hAnsi="Consolas"/>
+                <w:color w:val="E8E8E8"/>
+                <w:sz w:val="19"/>
+                <w:szCs w:val="19"/>
+              </w:rPr>
+              <w:t xml:space="preserve">pip install -e .</w:t>
             </w:r>
           </w:p>
         </w:tc>
@@ -4961,7 +4974,31 @@
           <w:sz w:val="22"/>
           <w:szCs w:val="22"/>
         </w:rPr>
-        <w:t xml:space="preserve">Con el proceso en marcha, comprueba en el propio servidor:</w:t>
+        <w:t xml:space="preserve">No instales los extras [dev] ni [azure] en el servidor de preproducción: son para desarrollo local y para Azure respectivamente.</w:t>
+      </w:r>
+    </w:p>
+    <w:p>
+      <w:pPr>
+        <w:pStyle w:val="Heading3"/>
+        <w:spacing w:after="100" w:before="200"/>
+      </w:pPr>
+      <w:bookmarkStart w:name="_Toc15" w:id="15"/>
+      <w:r>
+        <w:t xml:space="preserve">Paso 7 — Configurar las variables de entorno (.env)</w:t>
+      </w:r>
+      <w:bookmarkEnd w:id="15"/>
+    </w:p>
+    <w:p>
+      <w:pPr>
+        <w:spacing w:after="160" w:line="276"/>
+      </w:pPr>
+      <w:r>
+        <w:rPr>
+          <w:rFonts w:ascii="Calibri" w:cs="Calibri" w:eastAsia="Calibri" w:hAnsi="Calibri"/>
+          <w:sz w:val="22"/>
+          <w:szCs w:val="22"/>
+        </w:rPr>
+        <w:t xml:space="preserve">Copia .env.example a .env en la raíz del proyecto y completa los valores reales. Las variables más relevantes para preproducción se detallan en el Anexo A. Resumen de las decisiones clave:</w:t>
       </w:r>
     </w:p>
     <w:p>
@@ -4979,7 +5016,7 @@
           <w:sz w:val="22"/>
           <w:szCs w:val="22"/>
         </w:rPr>
-        <w:t xml:space="preserve">http://127.0.0.1:8000/health/live → 200 OK</w:t>
+        <w:t xml:space="preserve">MIA_HOST=127.0.0.1 y MIA_PORT=8000 — el backend NO se expone directamente; IIS hace de proxy.</w:t>
       </w:r>
     </w:p>
     <w:p>
@@ -4997,7 +5034,7 @@
           <w:sz w:val="22"/>
           <w:szCs w:val="22"/>
         </w:rPr>
-        <w:t xml:space="preserve">http://127.0.0.1:8000/health/ready → 200 OK (confirma conexión real a la base de datos)</w:t>
+        <w:t xml:space="preserve">No definir MIA_COMPAT_PORT en preproducción (solo se usa en desarrollo local).</w:t>
       </w:r>
     </w:p>
     <w:p>
@@ -5015,12 +5052,17 @@
           <w:sz w:val="22"/>
           <w:szCs w:val="22"/>
         </w:rPr>
-        <w:t xml:space="preserve">http://127.0.0.1:8000/docs → documentación interactiva de la API</w:t>
-      </w:r>
-    </w:p>
-    <w:p>
-      <w:pPr>
-        <w:spacing w:after="160" w:line="276"/>
+        <w:t xml:space="preserve">MIA_DATABASE_URL apuntando al rol y base de datos creados en el Paso 3.</w:t>
+      </w:r>
+    </w:p>
+    <w:p>
+      <w:pPr>
+        <w:pStyle w:val="ListParagraph"/>
+        <w:numPr>
+          <w:ilvl w:val="0"/>
+          <w:numId w:val="2"/>
+        </w:numPr>
+        <w:spacing w:after="100"/>
       </w:pPr>
       <w:r>
         <w:rPr>
@@ -5028,19 +5070,26 @@
           <w:sz w:val="22"/>
           <w:szCs w:val="22"/>
         </w:rPr>
-        <w:t xml:space="preserve">Detén el proceso con Ctrl+C una vez verificado.</w:t>
-      </w:r>
-    </w:p>
-    <w:p>
-      <w:pPr>
-        <w:pStyle w:val="Heading3"/>
-        <w:spacing w:after="100" w:before="200"/>
-      </w:pPr>
-      <w:bookmarkStart w:name="_Toc17" w:id="17"/>
-      <w:r>
-        <w:t xml:space="preserve">Paso 9 — Registrar el backend como servicio de Windows (NSSM)</w:t>
-      </w:r>
-      <w:bookmarkEnd w:id="17"/>
+        <w:t xml:space="preserve">MIA_SHAREPOINT__* con el tenant, client id y certificado reales de la aplicación de Entra ID para SharePoint Online.</w:t>
+      </w:r>
+    </w:p>
+    <w:p>
+      <w:pPr>
+        <w:pStyle w:val="ListParagraph"/>
+        <w:numPr>
+          <w:ilvl w:val="0"/>
+          <w:numId w:val="2"/>
+        </w:numPr>
+        <w:spacing w:after="100"/>
+      </w:pPr>
+      <w:r>
+        <w:rPr>
+          <w:rFonts w:ascii="Calibri" w:cs="Calibri" w:eastAsia="Calibri" w:hAnsi="Calibri"/>
+          <w:sz w:val="22"/>
+          <w:szCs w:val="22"/>
+        </w:rPr>
+        <w:t xml:space="preserve">MIA_DATA__PSEUDONYM_KEY — generar una clave nueva y no cambiarla después (afecta a los seudónimos de DNI/NIE ya sincronizados).</w:t>
+      </w:r>
     </w:p>
     <w:tbl>
       <w:tblPr>
@@ -5079,91 +5128,7 @@
                 <w:sz w:val="19"/>
                 <w:szCs w:val="19"/>
               </w:rPr>
-              <w:t xml:space="preserve">nssm install mia-api</w:t>
-            </w:r>
-          </w:p>
-          <w:p>
-            <w:pPr>
-              <w:spacing w:after="0"/>
-            </w:pPr>
-            <w:r>
-              <w:rPr>
-                <w:rFonts w:ascii="Consolas" w:cs="Consolas" w:eastAsia="Consolas" w:hAnsi="Consolas"/>
-                <w:color w:val="E8E8E8"/>
-                <w:sz w:val="19"/>
-                <w:szCs w:val="19"/>
-              </w:rPr>
-              <w:t xml:space="preserve">  Path:               C:\apps\mia\current\.venv\Scripts\python.exe</w:t>
-            </w:r>
-          </w:p>
-          <w:p>
-            <w:pPr>
-              <w:spacing w:after="0"/>
-            </w:pPr>
-            <w:r>
-              <w:rPr>
-                <w:rFonts w:ascii="Consolas" w:cs="Consolas" w:eastAsia="Consolas" w:hAnsi="Consolas"/>
-                <w:color w:val="E8E8E8"/>
-                <w:sz w:val="19"/>
-                <w:szCs w:val="19"/>
-              </w:rPr>
-              <w:t xml:space="preserve">  Arguments:          -m mia</w:t>
-            </w:r>
-          </w:p>
-          <w:p>
-            <w:pPr>
-              <w:spacing w:after="0"/>
-            </w:pPr>
-            <w:r>
-              <w:rPr>
-                <w:rFonts w:ascii="Consolas" w:cs="Consolas" w:eastAsia="Consolas" w:hAnsi="Consolas"/>
-                <w:color w:val="E8E8E8"/>
-                <w:sz w:val="19"/>
-                <w:szCs w:val="19"/>
-              </w:rPr>
-              <w:t xml:space="preserve">  Startup directory:  C:\apps\mia\current</w:t>
-            </w:r>
-          </w:p>
-          <w:p>
-            <w:pPr>
-              <w:spacing w:after="0"/>
-            </w:pPr>
-            <w:r>
-              <w:rPr>
-                <w:rFonts w:ascii="Consolas" w:cs="Consolas" w:eastAsia="Consolas" w:hAnsi="Consolas"/>
-                <w:color w:val="E8E8E8"/>
-                <w:sz w:val="19"/>
-                <w:szCs w:val="19"/>
-              </w:rPr>
-              <w:t xml:space="preserve">  (pestaña I/O) stdout/stderr -&gt; C:\apps\mia\logs\mia-api.log</w:t>
-            </w:r>
-          </w:p>
-          <w:p>
-            <w:pPr>
-              <w:spacing w:after="0"/>
-            </w:pPr>
-            <w:r>
-              <w:rPr>
-                <w:rFonts w:ascii="Consolas" w:cs="Consolas" w:eastAsia="Consolas" w:hAnsi="Consolas"/>
-                <w:color w:val="E8E8E8"/>
-                <w:sz w:val="19"/>
-                <w:szCs w:val="19"/>
-              </w:rPr>
-              <w:t xml:space="preserve"> </w:t>
-            </w:r>
-          </w:p>
-          <w:p>
-            <w:pPr>
-              <w:spacing w:after="0"/>
-            </w:pPr>
-            <w:r>
-              <w:rPr>
-                <w:rFonts w:ascii="Consolas" w:cs="Consolas" w:eastAsia="Consolas" w:hAnsi="Consolas"/>
-                <w:color w:val="E8E8E8"/>
-                <w:sz w:val="19"/>
-                <w:szCs w:val="19"/>
-              </w:rPr>
-              <w:t xml:space="preserve">nssm start mia-api</w:t>
+              <w:t xml:space="preserve">python -c "import secrets; print(secrets.token_urlsafe(32))"</w:t>
             </w:r>
           </w:p>
         </w:tc>
@@ -5171,7 +5136,12 @@
     </w:tbl>
     <w:p>
       <w:pPr>
-        <w:spacing w:after="160" w:line="276"/>
+        <w:pStyle w:val="ListParagraph"/>
+        <w:numPr>
+          <w:ilvl w:val="0"/>
+          <w:numId w:val="2"/>
+        </w:numPr>
+        <w:spacing w:after="100"/>
       </w:pPr>
       <w:r>
         <w:rPr>
@@ -5179,62 +5149,7 @@
           <w:sz w:val="22"/>
           <w:szCs w:val="22"/>
         </w:rPr>
-        <w:t xml:space="preserve">Configura el servicio para que se ejecute con la cuenta de servicio dedicada (pestaña "Log on" de NSSM o del propio servicio de Windows), no con una cuenta personal ni con "Local System" si el .env tiene permisos restringidos a otra cuenta.</w:t>
-      </w:r>
-    </w:p>
-    <w:p>
-      <w:pPr>
-        <w:spacing w:after="160" w:line="276"/>
-      </w:pPr>
-      <w:r>
-        <w:rPr>
-          <w:rFonts w:ascii="Calibri" w:cs="Calibri" w:eastAsia="Calibri" w:hAnsi="Calibri"/>
-          <w:sz w:val="22"/>
-          <w:szCs w:val="22"/>
-        </w:rPr>
-        <w:t xml:space="preserve">Verifica que el servicio arranca solo tras un reinicio del servidor y que se reinicia automáticamente si el proceso cae (pestaña "Exit actions" de NSSM).</w:t>
-      </w:r>
-    </w:p>
-    <w:p>
-      <w:pPr>
-        <w:pStyle w:val="Heading2"/>
-        <w:spacing w:after="150" w:before="300"/>
-      </w:pPr>
-      <w:bookmarkStart w:name="_Toc18" w:id="18"/>
-      <w:r>
-        <w:t xml:space="preserve">5.3 Tarea programada de sincronización con SharePoint Online</w:t>
-      </w:r>
-      <w:bookmarkEnd w:id="18"/>
-    </w:p>
-    <w:p>
-      <w:pPr>
-        <w:spacing w:after="160" w:line="276"/>
-      </w:pPr>
-      <w:r>
-        <w:rPr>
-          <w:rFonts w:ascii="Calibri" w:cs="Calibri" w:eastAsia="Calibri" w:hAnsi="Calibri"/>
-          <w:sz w:val="22"/>
-          <w:szCs w:val="22"/>
-        </w:rPr>
-        <w:t xml:space="preserve">En Azure esta tarea la ejecuta un Container Apps Job cada 10 minutos; en Windows Server se recrea con el Programador de tareas.</w:t>
-      </w:r>
-    </w:p>
-    <w:p>
-      <w:pPr>
-        <w:pStyle w:val="ListParagraph"/>
-        <w:numPr>
-          <w:ilvl w:val="0"/>
-          <w:numId w:val="4"/>
-        </w:numPr>
-        <w:spacing w:after="140"/>
-      </w:pPr>
-      <w:r>
-        <w:rPr>
-          <w:rFonts w:ascii="Calibri" w:cs="Calibri" w:eastAsia="Calibri" w:hAnsi="Calibri"/>
-          <w:sz w:val="22"/>
-          <w:szCs w:val="22"/>
-        </w:rPr>
-        <w:t xml:space="preserve">Antes de automatizar, valida a mano el acceso:</w:t>
+        <w:t xml:space="preserve">MIA_AUTH__MODE — no dejar en "dev" (identidad fija de pruebas); configurar "entra" si ya existe el registro de la aplicación en Entra ID.</w:t>
       </w:r>
     </w:p>
     <w:tbl>
@@ -5255,68 +5170,48 @@
       <w:tr>
         <w:tc>
           <w:tcPr>
-            <w:shd w:fill="2B2B2B" w:val="clear"/>
+            <w:tcBorders>
+              <w:top w:val="single" w:color="E59866" w:sz="12"/>
+              <w:left w:val="single" w:color="E59866" w:sz="12"/>
+              <w:bottom w:val="single" w:color="E59866" w:sz="12"/>
+              <w:right w:val="single" w:color="E59866" w:sz="12"/>
+            </w:tcBorders>
+            <w:shd w:fill="FDEBD0" w:val="clear"/>
             <w:tcMar>
               <w:top w:type="dxa" w:w="140"/>
-              <w:left w:type="dxa" w:w="200"/>
+              <w:left w:type="dxa" w:w="220"/>
               <w:bottom w:type="dxa" w:w="140"/>
-              <w:right w:type="dxa" w:w="200"/>
-            </w:tcMar>
-          </w:tcPr>
+              <w:right w:type="dxa" w:w="220"/>
+            </w:tcMar>
+          </w:tcPr>
+          <w:p>
+            <w:pPr>
+              <w:spacing w:after="60"/>
+            </w:pPr>
+            <w:r>
+              <w:rPr>
+                <w:rFonts w:ascii="Calibri" w:cs="Calibri" w:eastAsia="Calibri" w:hAnsi="Calibri"/>
+                <w:b/>
+                <w:bCs/>
+                <w:color w:val="7D4F0A"/>
+                <w:sz w:val="22"/>
+                <w:szCs w:val="22"/>
+              </w:rPr>
+              <w:t xml:space="preserve">Seguridad del fichero .env y del certificado</w:t>
+            </w:r>
+          </w:p>
           <w:p>
             <w:pPr>
               <w:spacing w:after="0"/>
             </w:pPr>
             <w:r>
               <w:rPr>
-                <w:rFonts w:ascii="Consolas" w:cs="Consolas" w:eastAsia="Consolas" w:hAnsi="Consolas"/>
-                <w:color w:val="E8E8E8"/>
-                <w:sz w:val="19"/>
-                <w:szCs w:val="19"/>
-              </w:rPr>
-              <w:t xml:space="preserve">cd C:\apps\mia\current</w:t>
-            </w:r>
-          </w:p>
-          <w:p>
-            <w:pPr>
-              <w:spacing w:after="0"/>
-            </w:pPr>
-            <w:r>
-              <w:rPr>
-                <w:rFonts w:ascii="Consolas" w:cs="Consolas" w:eastAsia="Consolas" w:hAnsi="Consolas"/>
-                <w:color w:val="E8E8E8"/>
-                <w:sz w:val="19"/>
-                <w:szCs w:val="19"/>
-              </w:rPr>
-              <w:t xml:space="preserve">.venv\Scripts\Activate.ps1</w:t>
-            </w:r>
-          </w:p>
-          <w:p>
-            <w:pPr>
-              <w:spacing w:after="0"/>
-            </w:pPr>
-            <w:r>
-              <w:rPr>
-                <w:rFonts w:ascii="Consolas" w:cs="Consolas" w:eastAsia="Consolas" w:hAnsi="Consolas"/>
-                <w:color w:val="E8E8E8"/>
-                <w:sz w:val="19"/>
-                <w:szCs w:val="19"/>
-              </w:rPr>
-              <w:t xml:space="preserve">python -m mia.ingestion.sync --check</w:t>
-            </w:r>
-          </w:p>
-          <w:p>
-            <w:pPr>
-              <w:spacing w:after="0"/>
-            </w:pPr>
-            <w:r>
-              <w:rPr>
-                <w:rFonts w:ascii="Consolas" w:cs="Consolas" w:eastAsia="Consolas" w:hAnsi="Consolas"/>
-                <w:color w:val="E8E8E8"/>
-                <w:sz w:val="19"/>
-                <w:szCs w:val="19"/>
-              </w:rPr>
-              <w:t xml:space="preserve">python -m mia.ingestion.sync --full</w:t>
+                <w:rFonts w:ascii="Calibri" w:cs="Calibri" w:eastAsia="Calibri" w:hAnsi="Calibri"/>
+                <w:color w:val="5A3A08"/>
+                <w:sz w:val="21"/>
+                <w:szCs w:val="21"/>
+              </w:rPr>
+              <w:t xml:space="preserve">Restringe los permisos NTFS de .env y del certificado .pfx solo a la cuenta de servicio y a los administradores (nunca "Everyone" ni "Users"). No copies estos valores a tickets, chats ni repositorios.</w:t>
             </w:r>
           </w:p>
         </w:tc>
@@ -5324,21 +5219,14 @@
     </w:tbl>
     <w:p>
       <w:pPr>
-        <w:pStyle w:val="ListParagraph"/>
-        <w:numPr>
-          <w:ilvl w:val="0"/>
-          <w:numId w:val="4"/>
-        </w:numPr>
-        <w:spacing w:after="140"/>
-      </w:pPr>
-      <w:r>
-        <w:rPr>
-          <w:rFonts w:ascii="Calibri" w:cs="Calibri" w:eastAsia="Calibri" w:hAnsi="Calibri"/>
-          <w:sz w:val="22"/>
-          <w:szCs w:val="22"/>
-        </w:rPr>
-        <w:t xml:space="preserve">Crea la tarea programada (ajusta /ru a la cuenta de servicio con permisos sobre el .env):</w:t>
-      </w:r>
+        <w:pStyle w:val="Heading3"/>
+        <w:spacing w:after="100" w:before="200"/>
+      </w:pPr>
+      <w:bookmarkStart w:name="_Toc16" w:id="16"/>
+      <w:r>
+        <w:t xml:space="preserve">Paso 8 — Aplicar las migraciones de base de datos</w:t>
+      </w:r>
+      <w:bookmarkEnd w:id="16"/>
     </w:p>
     <w:tbl>
       <w:tblPr>
@@ -5377,9 +5265,49 @@
                 <w:sz w:val="19"/>
                 <w:szCs w:val="19"/>
               </w:rPr>
-              <w:t xml:space="preserve">schtasks /create /tn "mIA - Sync SharePoint" ^</w:t>
-            </w:r>
-          </w:p>
+              <w:t xml:space="preserve">alembic upgrade head</w:t>
+            </w:r>
+          </w:p>
+        </w:tc>
+      </w:tr>
+    </w:tbl>
+    <w:p>
+      <w:pPr>
+        <w:pStyle w:val="Heading3"/>
+        <w:spacing w:after="100" w:before="200"/>
+      </w:pPr>
+      <w:bookmarkStart w:name="_Toc17" w:id="17"/>
+      <w:r>
+        <w:t xml:space="preserve">Paso 9 — Prueba en caliente (sin servicio todavía)</w:t>
+      </w:r>
+      <w:bookmarkEnd w:id="17"/>
+    </w:p>
+    <w:tbl>
+      <w:tblPr>
+        <w:tblW w:type="pct" w:w="5000"/>
+        <w:tblBorders>
+          <w:top w:val="single" w:color="auto" w:sz="4"/>
+          <w:left w:val="single" w:color="auto" w:sz="4"/>
+          <w:bottom w:val="single" w:color="auto" w:sz="4"/>
+          <w:right w:val="single" w:color="auto" w:sz="4"/>
+          <w:insideH w:val="single" w:color="auto" w:sz="4"/>
+          <w:insideV w:val="single" w:color="auto" w:sz="4"/>
+        </w:tblBorders>
+      </w:tblPr>
+      <w:tblGrid>
+        <w:gridCol w:w="9026"/>
+      </w:tblGrid>
+      <w:tr>
+        <w:tc>
+          <w:tcPr>
+            <w:shd w:fill="2B2B2B" w:val="clear"/>
+            <w:tcMar>
+              <w:top w:type="dxa" w:w="140"/>
+              <w:left w:type="dxa" w:w="200"/>
+              <w:bottom w:type="dxa" w:w="140"/>
+              <w:right w:type="dxa" w:w="200"/>
+            </w:tcMar>
+          </w:tcPr>
           <w:p>
             <w:pPr>
               <w:spacing w:after="0"/>
@@ -5391,9 +5319,129 @@
                 <w:sz w:val="19"/>
                 <w:szCs w:val="19"/>
               </w:rPr>
-              <w:t xml:space="preserve">  /tr "C:\apps\mia\current\.venv\Scripts\python.exe -m mia.ingestion.sync" ^</w:t>
-            </w:r>
-          </w:p>
+              <w:t xml:space="preserve">python -m mia</w:t>
+            </w:r>
+          </w:p>
+        </w:tc>
+      </w:tr>
+    </w:tbl>
+    <w:p>
+      <w:pPr>
+        <w:spacing w:after="160" w:line="276"/>
+      </w:pPr>
+      <w:r>
+        <w:rPr>
+          <w:rFonts w:ascii="Calibri" w:cs="Calibri" w:eastAsia="Calibri" w:hAnsi="Calibri"/>
+          <w:sz w:val="22"/>
+          <w:szCs w:val="22"/>
+        </w:rPr>
+        <w:t xml:space="preserve">Con el proceso en marcha, comprueba en el propio servidor:</w:t>
+      </w:r>
+    </w:p>
+    <w:p>
+      <w:pPr>
+        <w:pStyle w:val="ListParagraph"/>
+        <w:numPr>
+          <w:ilvl w:val="0"/>
+          <w:numId w:val="2"/>
+        </w:numPr>
+        <w:spacing w:after="100"/>
+      </w:pPr>
+      <w:r>
+        <w:rPr>
+          <w:rFonts w:ascii="Calibri" w:cs="Calibri" w:eastAsia="Calibri" w:hAnsi="Calibri"/>
+          <w:sz w:val="22"/>
+          <w:szCs w:val="22"/>
+        </w:rPr>
+        <w:t xml:space="preserve">http://127.0.0.1:8000/health/live → 200 OK</w:t>
+      </w:r>
+    </w:p>
+    <w:p>
+      <w:pPr>
+        <w:pStyle w:val="ListParagraph"/>
+        <w:numPr>
+          <w:ilvl w:val="0"/>
+          <w:numId w:val="2"/>
+        </w:numPr>
+        <w:spacing w:after="100"/>
+      </w:pPr>
+      <w:r>
+        <w:rPr>
+          <w:rFonts w:ascii="Calibri" w:cs="Calibri" w:eastAsia="Calibri" w:hAnsi="Calibri"/>
+          <w:sz w:val="22"/>
+          <w:szCs w:val="22"/>
+        </w:rPr>
+        <w:t xml:space="preserve">http://127.0.0.1:8000/health/ready → 200 OK (confirma conexión real a la base de datos)</w:t>
+      </w:r>
+    </w:p>
+    <w:p>
+      <w:pPr>
+        <w:pStyle w:val="ListParagraph"/>
+        <w:numPr>
+          <w:ilvl w:val="0"/>
+          <w:numId w:val="2"/>
+        </w:numPr>
+        <w:spacing w:after="100"/>
+      </w:pPr>
+      <w:r>
+        <w:rPr>
+          <w:rFonts w:ascii="Calibri" w:cs="Calibri" w:eastAsia="Calibri" w:hAnsi="Calibri"/>
+          <w:sz w:val="22"/>
+          <w:szCs w:val="22"/>
+        </w:rPr>
+        <w:t xml:space="preserve">http://127.0.0.1:8000/docs → documentación interactiva de la API</w:t>
+      </w:r>
+    </w:p>
+    <w:p>
+      <w:pPr>
+        <w:spacing w:after="160" w:line="276"/>
+      </w:pPr>
+      <w:r>
+        <w:rPr>
+          <w:rFonts w:ascii="Calibri" w:cs="Calibri" w:eastAsia="Calibri" w:hAnsi="Calibri"/>
+          <w:sz w:val="22"/>
+          <w:szCs w:val="22"/>
+        </w:rPr>
+        <w:t xml:space="preserve">Detén el proceso con Ctrl+C una vez verificado.</w:t>
+      </w:r>
+    </w:p>
+    <w:p>
+      <w:pPr>
+        <w:pStyle w:val="Heading3"/>
+        <w:spacing w:after="100" w:before="200"/>
+      </w:pPr>
+      <w:bookmarkStart w:name="_Toc18" w:id="18"/>
+      <w:r>
+        <w:t xml:space="preserve">Paso 10 — Registrar el backend como servicio de Windows (NSSM)</w:t>
+      </w:r>
+      <w:bookmarkEnd w:id="18"/>
+    </w:p>
+    <w:tbl>
+      <w:tblPr>
+        <w:tblW w:type="pct" w:w="5000"/>
+        <w:tblBorders>
+          <w:top w:val="single" w:color="auto" w:sz="4"/>
+          <w:left w:val="single" w:color="auto" w:sz="4"/>
+          <w:bottom w:val="single" w:color="auto" w:sz="4"/>
+          <w:right w:val="single" w:color="auto" w:sz="4"/>
+          <w:insideH w:val="single" w:color="auto" w:sz="4"/>
+          <w:insideV w:val="single" w:color="auto" w:sz="4"/>
+        </w:tblBorders>
+      </w:tblPr>
+      <w:tblGrid>
+        <w:gridCol w:w="9026"/>
+      </w:tblGrid>
+      <w:tr>
+        <w:tc>
+          <w:tcPr>
+            <w:shd w:fill="2B2B2B" w:val="clear"/>
+            <w:tcMar>
+              <w:top w:type="dxa" w:w="140"/>
+              <w:left w:type="dxa" w:w="200"/>
+              <w:bottom w:type="dxa" w:w="140"/>
+              <w:right w:type="dxa" w:w="200"/>
+            </w:tcMar>
+          </w:tcPr>
           <w:p>
             <w:pPr>
               <w:spacing w:after="0"/>
@@ -5405,12 +5453,146 @@
                 <w:sz w:val="19"/>
                 <w:szCs w:val="19"/>
               </w:rPr>
-              <w:t xml:space="preserve">  /sc minute /mo 10 /ru DOMINIO\cuenta-servicio-mia</w:t>
+              <w:t xml:space="preserve">nssm install mia-api</w:t>
+            </w:r>
+          </w:p>
+          <w:p>
+            <w:pPr>
+              <w:spacing w:after="0"/>
+            </w:pPr>
+            <w:r>
+              <w:rPr>
+                <w:rFonts w:ascii="Consolas" w:cs="Consolas" w:eastAsia="Consolas" w:hAnsi="Consolas"/>
+                <w:color w:val="E8E8E8"/>
+                <w:sz w:val="19"/>
+                <w:szCs w:val="19"/>
+              </w:rPr>
+              <w:t xml:space="preserve">  Path:               C:\apps\mia\current\.venv\Scripts\python.exe</w:t>
+            </w:r>
+          </w:p>
+          <w:p>
+            <w:pPr>
+              <w:spacing w:after="0"/>
+            </w:pPr>
+            <w:r>
+              <w:rPr>
+                <w:rFonts w:ascii="Consolas" w:cs="Consolas" w:eastAsia="Consolas" w:hAnsi="Consolas"/>
+                <w:color w:val="E8E8E8"/>
+                <w:sz w:val="19"/>
+                <w:szCs w:val="19"/>
+              </w:rPr>
+              <w:t xml:space="preserve">  Arguments:          -m mia</w:t>
+            </w:r>
+          </w:p>
+          <w:p>
+            <w:pPr>
+              <w:spacing w:after="0"/>
+            </w:pPr>
+            <w:r>
+              <w:rPr>
+                <w:rFonts w:ascii="Consolas" w:cs="Consolas" w:eastAsia="Consolas" w:hAnsi="Consolas"/>
+                <w:color w:val="E8E8E8"/>
+                <w:sz w:val="19"/>
+                <w:szCs w:val="19"/>
+              </w:rPr>
+              <w:t xml:space="preserve">  Startup directory:  C:\apps\mia\current</w:t>
+            </w:r>
+          </w:p>
+          <w:p>
+            <w:pPr>
+              <w:spacing w:after="0"/>
+            </w:pPr>
+            <w:r>
+              <w:rPr>
+                <w:rFonts w:ascii="Consolas" w:cs="Consolas" w:eastAsia="Consolas" w:hAnsi="Consolas"/>
+                <w:color w:val="E8E8E8"/>
+                <w:sz w:val="19"/>
+                <w:szCs w:val="19"/>
+              </w:rPr>
+              <w:t xml:space="preserve">  (pestaña I/O) stdout/stderr -&gt; C:\apps\mia\logs\mia-api.log</w:t>
+            </w:r>
+          </w:p>
+          <w:p>
+            <w:pPr>
+              <w:spacing w:after="0"/>
+            </w:pPr>
+            <w:r>
+              <w:rPr>
+                <w:rFonts w:ascii="Consolas" w:cs="Consolas" w:eastAsia="Consolas" w:hAnsi="Consolas"/>
+                <w:color w:val="E8E8E8"/>
+                <w:sz w:val="19"/>
+                <w:szCs w:val="19"/>
+              </w:rPr>
+              <w:t xml:space="preserve"> </w:t>
+            </w:r>
+          </w:p>
+          <w:p>
+            <w:pPr>
+              <w:spacing w:after="0"/>
+            </w:pPr>
+            <w:r>
+              <w:rPr>
+                <w:rFonts w:ascii="Consolas" w:cs="Consolas" w:eastAsia="Consolas" w:hAnsi="Consolas"/>
+                <w:color w:val="E8E8E8"/>
+                <w:sz w:val="19"/>
+                <w:szCs w:val="19"/>
+              </w:rPr>
+              <w:t xml:space="preserve">nssm start mia-api</w:t>
             </w:r>
           </w:p>
         </w:tc>
       </w:tr>
     </w:tbl>
+    <w:p>
+      <w:pPr>
+        <w:spacing w:after="160" w:line="276"/>
+      </w:pPr>
+      <w:r>
+        <w:rPr>
+          <w:rFonts w:ascii="Calibri" w:cs="Calibri" w:eastAsia="Calibri" w:hAnsi="Calibri"/>
+          <w:sz w:val="22"/>
+          <w:szCs w:val="22"/>
+        </w:rPr>
+        <w:t xml:space="preserve">Configura el servicio para que se ejecute con la cuenta de servicio dedicada (pestaña "Log on" de NSSM o del propio servicio de Windows), no con una cuenta personal ni con "Local System" si el .env tiene permisos restringidos a otra cuenta.</w:t>
+      </w:r>
+    </w:p>
+    <w:p>
+      <w:pPr>
+        <w:spacing w:after="160" w:line="276"/>
+      </w:pPr>
+      <w:r>
+        <w:rPr>
+          <w:rFonts w:ascii="Calibri" w:cs="Calibri" w:eastAsia="Calibri" w:hAnsi="Calibri"/>
+          <w:sz w:val="22"/>
+          <w:szCs w:val="22"/>
+        </w:rPr>
+        <w:t xml:space="preserve">Verifica que el servicio arranca solo tras un reinicio del servidor y que se reinicia automáticamente si el proceso cae (pestaña "Exit actions" de NSSM).</w:t>
+      </w:r>
+    </w:p>
+    <w:p>
+      <w:pPr>
+        <w:pStyle w:val="Heading2"/>
+        <w:spacing w:after="150" w:before="300"/>
+      </w:pPr>
+      <w:bookmarkStart w:name="_Toc19" w:id="19"/>
+      <w:r>
+        <w:t xml:space="preserve">5.3 Tarea programada de sincronización con SharePoint Online</w:t>
+      </w:r>
+      <w:bookmarkEnd w:id="19"/>
+    </w:p>
+    <w:p>
+      <w:pPr>
+        <w:spacing w:after="160" w:line="276"/>
+      </w:pPr>
+      <w:r>
+        <w:rPr>
+          <w:rFonts w:ascii="Calibri" w:cs="Calibri" w:eastAsia="Calibri" w:hAnsi="Calibri"/>
+          <w:sz w:val="22"/>
+          <w:szCs w:val="22"/>
+        </w:rPr>
+        <w:t xml:space="preserve">En Azure esta tarea la ejecuta un Container Apps Job cada 10 minutos; en Windows Server se recrea con el Programador de tareas.</w:t>
+      </w:r>
+    </w:p>
     <w:p>
       <w:pPr>
         <w:pStyle w:val="ListParagraph"/>
@@ -5426,6 +5608,198 @@
           <w:sz w:val="22"/>
           <w:szCs w:val="22"/>
         </w:rPr>
+        <w:t xml:space="preserve">Antes de automatizar, valida a mano el acceso:</w:t>
+      </w:r>
+    </w:p>
+    <w:tbl>
+      <w:tblPr>
+        <w:tblW w:type="pct" w:w="5000"/>
+        <w:tblBorders>
+          <w:top w:val="single" w:color="auto" w:sz="4"/>
+          <w:left w:val="single" w:color="auto" w:sz="4"/>
+          <w:bottom w:val="single" w:color="auto" w:sz="4"/>
+          <w:right w:val="single" w:color="auto" w:sz="4"/>
+          <w:insideH w:val="single" w:color="auto" w:sz="4"/>
+          <w:insideV w:val="single" w:color="auto" w:sz="4"/>
+        </w:tblBorders>
+      </w:tblPr>
+      <w:tblGrid>
+        <w:gridCol w:w="9026"/>
+      </w:tblGrid>
+      <w:tr>
+        <w:tc>
+          <w:tcPr>
+            <w:shd w:fill="2B2B2B" w:val="clear"/>
+            <w:tcMar>
+              <w:top w:type="dxa" w:w="140"/>
+              <w:left w:type="dxa" w:w="200"/>
+              <w:bottom w:type="dxa" w:w="140"/>
+              <w:right w:type="dxa" w:w="200"/>
+            </w:tcMar>
+          </w:tcPr>
+          <w:p>
+            <w:pPr>
+              <w:spacing w:after="0"/>
+            </w:pPr>
+            <w:r>
+              <w:rPr>
+                <w:rFonts w:ascii="Consolas" w:cs="Consolas" w:eastAsia="Consolas" w:hAnsi="Consolas"/>
+                <w:color w:val="E8E8E8"/>
+                <w:sz w:val="19"/>
+                <w:szCs w:val="19"/>
+              </w:rPr>
+              <w:t xml:space="preserve">cd C:\apps\mia\current</w:t>
+            </w:r>
+          </w:p>
+          <w:p>
+            <w:pPr>
+              <w:spacing w:after="0"/>
+            </w:pPr>
+            <w:r>
+              <w:rPr>
+                <w:rFonts w:ascii="Consolas" w:cs="Consolas" w:eastAsia="Consolas" w:hAnsi="Consolas"/>
+                <w:color w:val="E8E8E8"/>
+                <w:sz w:val="19"/>
+                <w:szCs w:val="19"/>
+              </w:rPr>
+              <w:t xml:space="preserve">.venv\Scripts\Activate.ps1</w:t>
+            </w:r>
+          </w:p>
+          <w:p>
+            <w:pPr>
+              <w:spacing w:after="0"/>
+            </w:pPr>
+            <w:r>
+              <w:rPr>
+                <w:rFonts w:ascii="Consolas" w:cs="Consolas" w:eastAsia="Consolas" w:hAnsi="Consolas"/>
+                <w:color w:val="E8E8E8"/>
+                <w:sz w:val="19"/>
+                <w:szCs w:val="19"/>
+              </w:rPr>
+              <w:t xml:space="preserve">python -m mia.ingestion.sync --check</w:t>
+            </w:r>
+          </w:p>
+          <w:p>
+            <w:pPr>
+              <w:spacing w:after="0"/>
+            </w:pPr>
+            <w:r>
+              <w:rPr>
+                <w:rFonts w:ascii="Consolas" w:cs="Consolas" w:eastAsia="Consolas" w:hAnsi="Consolas"/>
+                <w:color w:val="E8E8E8"/>
+                <w:sz w:val="19"/>
+                <w:szCs w:val="19"/>
+              </w:rPr>
+              <w:t xml:space="preserve">python -m mia.ingestion.sync --full</w:t>
+            </w:r>
+          </w:p>
+        </w:tc>
+      </w:tr>
+    </w:tbl>
+    <w:p>
+      <w:pPr>
+        <w:pStyle w:val="ListParagraph"/>
+        <w:numPr>
+          <w:ilvl w:val="0"/>
+          <w:numId w:val="4"/>
+        </w:numPr>
+        <w:spacing w:after="140"/>
+      </w:pPr>
+      <w:r>
+        <w:rPr>
+          <w:rFonts w:ascii="Calibri" w:cs="Calibri" w:eastAsia="Calibri" w:hAnsi="Calibri"/>
+          <w:sz w:val="22"/>
+          <w:szCs w:val="22"/>
+        </w:rPr>
+        <w:t xml:space="preserve">Crea la tarea programada (ajusta /ru a la cuenta de servicio con permisos sobre el .env):</w:t>
+      </w:r>
+    </w:p>
+    <w:tbl>
+      <w:tblPr>
+        <w:tblW w:type="pct" w:w="5000"/>
+        <w:tblBorders>
+          <w:top w:val="single" w:color="auto" w:sz="4"/>
+          <w:left w:val="single" w:color="auto" w:sz="4"/>
+          <w:bottom w:val="single" w:color="auto" w:sz="4"/>
+          <w:right w:val="single" w:color="auto" w:sz="4"/>
+          <w:insideH w:val="single" w:color="auto" w:sz="4"/>
+          <w:insideV w:val="single" w:color="auto" w:sz="4"/>
+        </w:tblBorders>
+      </w:tblPr>
+      <w:tblGrid>
+        <w:gridCol w:w="9026"/>
+      </w:tblGrid>
+      <w:tr>
+        <w:tc>
+          <w:tcPr>
+            <w:shd w:fill="2B2B2B" w:val="clear"/>
+            <w:tcMar>
+              <w:top w:type="dxa" w:w="140"/>
+              <w:left w:type="dxa" w:w="200"/>
+              <w:bottom w:type="dxa" w:w="140"/>
+              <w:right w:type="dxa" w:w="200"/>
+            </w:tcMar>
+          </w:tcPr>
+          <w:p>
+            <w:pPr>
+              <w:spacing w:after="0"/>
+            </w:pPr>
+            <w:r>
+              <w:rPr>
+                <w:rFonts w:ascii="Consolas" w:cs="Consolas" w:eastAsia="Consolas" w:hAnsi="Consolas"/>
+                <w:color w:val="E8E8E8"/>
+                <w:sz w:val="19"/>
+                <w:szCs w:val="19"/>
+              </w:rPr>
+              <w:t xml:space="preserve">schtasks /create /tn "mIA - Sync SharePoint" ^</w:t>
+            </w:r>
+          </w:p>
+          <w:p>
+            <w:pPr>
+              <w:spacing w:after="0"/>
+            </w:pPr>
+            <w:r>
+              <w:rPr>
+                <w:rFonts w:ascii="Consolas" w:cs="Consolas" w:eastAsia="Consolas" w:hAnsi="Consolas"/>
+                <w:color w:val="E8E8E8"/>
+                <w:sz w:val="19"/>
+                <w:szCs w:val="19"/>
+              </w:rPr>
+              <w:t xml:space="preserve">  /tr "C:\apps\mia\current\.venv\Scripts\python.exe -m mia.ingestion.sync" ^</w:t>
+            </w:r>
+          </w:p>
+          <w:p>
+            <w:pPr>
+              <w:spacing w:after="0"/>
+            </w:pPr>
+            <w:r>
+              <w:rPr>
+                <w:rFonts w:ascii="Consolas" w:cs="Consolas" w:eastAsia="Consolas" w:hAnsi="Consolas"/>
+                <w:color w:val="E8E8E8"/>
+                <w:sz w:val="19"/>
+                <w:szCs w:val="19"/>
+              </w:rPr>
+              <w:t xml:space="preserve">  /sc minute /mo 10 /ru DOMINIO\cuenta-servicio-mia</w:t>
+            </w:r>
+          </w:p>
+        </w:tc>
+      </w:tr>
+    </w:tbl>
+    <w:p>
+      <w:pPr>
+        <w:pStyle w:val="ListParagraph"/>
+        <w:numPr>
+          <w:ilvl w:val="0"/>
+          <w:numId w:val="4"/>
+        </w:numPr>
+        <w:spacing w:after="140"/>
+      </w:pPr>
+      <w:r>
+        <w:rPr>
+          <w:rFonts w:ascii="Calibri" w:cs="Calibri" w:eastAsia="Calibri" w:hAnsi="Calibri"/>
+          <w:sz w:val="22"/>
+          <w:szCs w:val="22"/>
+        </w:rPr>
         <w:t xml:space="preserve">Comprueba en el Programador de tareas que la primera ejecución termina sin error y revisa el log del backend.</w:t>
       </w:r>
     </w:p>
@@ -5439,22 +5813,22 @@
         <w:pStyle w:val="Heading1"/>
         <w:spacing w:after="200" w:before="400"/>
       </w:pPr>
-      <w:bookmarkStart w:name="_Toc19" w:id="19"/>
+      <w:bookmarkStart w:name="_Toc20" w:id="20"/>
       <w:r>
         <w:t xml:space="preserve">6. Instalación del frontend (Vite — mundos 2D / 3D / holograma)</w:t>
       </w:r>
-      <w:bookmarkEnd w:id="19"/>
+      <w:bookmarkEnd w:id="20"/>
     </w:p>
     <w:p>
       <w:pPr>
         <w:pStyle w:val="Heading2"/>
         <w:spacing w:after="150" w:before="300"/>
       </w:pPr>
-      <w:bookmarkStart w:name="_Toc20" w:id="20"/>
+      <w:bookmarkStart w:name="_Toc21" w:id="21"/>
       <w:r>
         <w:t xml:space="preserve">6.1 Prerrequisitos del frontend</w:t>
       </w:r>
-      <w:bookmarkEnd w:id="20"/>
+      <w:bookmarkEnd w:id="21"/>
     </w:p>
     <w:tbl>
       <w:tblPr>
@@ -5783,22 +6157,22 @@
         <w:pStyle w:val="Heading2"/>
         <w:spacing w:after="150" w:before="300"/>
       </w:pPr>
-      <w:bookmarkStart w:name="_Toc21" w:id="21"/>
+      <w:bookmarkStart w:name="_Toc22" w:id="22"/>
       <w:r>
         <w:t xml:space="preserve">6.2 Paso a paso</w:t>
       </w:r>
-      <w:bookmarkEnd w:id="21"/>
+      <w:bookmarkEnd w:id="22"/>
     </w:p>
     <w:p>
       <w:pPr>
         <w:pStyle w:val="Heading3"/>
         <w:spacing w:after="100" w:before="200"/>
       </w:pPr>
-      <w:bookmarkStart w:name="_Toc22" w:id="22"/>
+      <w:bookmarkStart w:name="_Toc23" w:id="23"/>
       <w:r>
         <w:t xml:space="preserve">Paso 1 — Instalar dependencias y compilar</w:t>
       </w:r>
-      <w:bookmarkEnd w:id="22"/>
+      <w:bookmarkEnd w:id="23"/>
     </w:p>
     <w:tbl>
       <w:tblPr>
@@ -5954,11 +6328,11 @@
         <w:pStyle w:val="Heading3"/>
         <w:spacing w:after="100" w:before="200"/>
       </w:pPr>
-      <w:bookmarkStart w:name="_Toc23" w:id="23"/>
+      <w:bookmarkStart w:name="_Toc24" w:id="24"/>
       <w:r>
         <w:t xml:space="preserve">Paso 2 — Publicar el contenido compilado</w:t>
       </w:r>
-      <w:bookmarkEnd w:id="23"/>
+      <w:bookmarkEnd w:id="24"/>
     </w:p>
     <w:p>
       <w:pPr>
@@ -6039,11 +6413,11 @@
         <w:pStyle w:val="Heading1"/>
         <w:spacing w:after="200" w:before="400"/>
       </w:pPr>
-      <w:bookmarkStart w:name="_Toc24" w:id="24"/>
+      <w:bookmarkStart w:name="_Toc25" w:id="25"/>
       <w:r>
         <w:t xml:space="preserve">7. Configuración de IIS: sitio, binding y proxy inverso</w:t>
       </w:r>
-      <w:bookmarkEnd w:id="24"/>
+      <w:bookmarkEnd w:id="25"/>
     </w:p>
     <w:tbl>
       <w:tblPr>
@@ -6115,11 +6489,11 @@
         <w:pStyle w:val="Heading2"/>
         <w:spacing w:after="150" w:before="300"/>
       </w:pPr>
-      <w:bookmarkStart w:name="_Toc25" w:id="25"/>
+      <w:bookmarkStart w:name="_Toc26" w:id="26"/>
       <w:r>
         <w:t xml:space="preserve">7.1 Crear el sitio IIS para mIA</w:t>
       </w:r>
-      <w:bookmarkEnd w:id="25"/>
+      <w:bookmarkEnd w:id="26"/>
     </w:p>
     <w:p>
       <w:pPr>
@@ -6252,11 +6626,11 @@
         <w:pStyle w:val="Heading2"/>
         <w:spacing w:after="150" w:before="300"/>
       </w:pPr>
-      <w:bookmarkStart w:name="_Toc26" w:id="26"/>
+      <w:bookmarkStart w:name="_Toc27" w:id="27"/>
       <w:r>
         <w:t xml:space="preserve">7.2 Certificado SSL</w:t>
       </w:r>
-      <w:bookmarkEnd w:id="26"/>
+      <w:bookmarkEnd w:id="27"/>
     </w:p>
     <w:tbl>
       <w:tblPr>
@@ -6341,11 +6715,11 @@
         <w:pStyle w:val="Heading2"/>
         <w:spacing w:after="150" w:before="300"/>
       </w:pPr>
-      <w:bookmarkStart w:name="_Toc27" w:id="27"/>
+      <w:bookmarkStart w:name="_Toc28" w:id="28"/>
       <w:r>
         <w:t xml:space="preserve">7.3 Instalar los módulos ARR y URL Rewrite</w:t>
       </w:r>
-      <w:bookmarkEnd w:id="27"/>
+      <w:bookmarkEnd w:id="28"/>
     </w:p>
     <w:p>
       <w:pPr>
@@ -6414,11 +6788,11 @@
         <w:pStyle w:val="Heading2"/>
         <w:spacing w:after="150" w:before="300"/>
       </w:pPr>
-      <w:bookmarkStart w:name="_Toc28" w:id="28"/>
+      <w:bookmarkStart w:name="_Toc29" w:id="29"/>
       <w:r>
         <w:t xml:space="preserve">7.4 Regla de proxy inverso hacia el backend</w:t>
       </w:r>
-      <w:bookmarkEnd w:id="28"/>
+      <w:bookmarkEnd w:id="29"/>
     </w:p>
     <w:p>
       <w:pPr>
@@ -6805,7 +7179,7 @@
           <w:sz w:val="22"/>
           <w:szCs w:val="22"/>
         </w:rPr>
-        <w:t xml:space="preserve">(Ajusta el comando configurado en el servicio NSSM del paso 5.2-9 si cambias de python -m mia a este arranque. Se pierde el doble puerto de compatibilidad, que no es necesario en preproducción.)</w:t>
+        <w:t xml:space="preserve">(Ajusta el comando configurado en el servicio NSSM del paso 5.2-10 si cambias de python -m mia a este arranque. Se pierde el doble puerto de compatibilidad, que no es necesario en preproducción.)</w:t>
       </w:r>
     </w:p>
     <w:p>
@@ -6813,11 +7187,11 @@
         <w:pStyle w:val="Heading2"/>
         <w:spacing w:after="150" w:before="300"/>
       </w:pPr>
-      <w:bookmarkStart w:name="_Toc29" w:id="29"/>
+      <w:bookmarkStart w:name="_Toc30" w:id="30"/>
       <w:r>
         <w:t xml:space="preserve">7.5 Redirección HTTP → HTTPS</w:t>
       </w:r>
-      <w:bookmarkEnd w:id="29"/>
+      <w:bookmarkEnd w:id="30"/>
     </w:p>
     <w:p>
       <w:pPr>
@@ -6837,11 +7211,11 @@
         <w:pStyle w:val="Heading2"/>
         <w:spacing w:after="150" w:before="300"/>
       </w:pPr>
-      <w:bookmarkStart w:name="_Toc30" w:id="30"/>
+      <w:bookmarkStart w:name="_Toc31" w:id="31"/>
       <w:r>
         <w:t xml:space="preserve">7.6 Publicación del frontend y la ruta /mia/</w:t>
       </w:r>
-      <w:bookmarkEnd w:id="30"/>
+      <w:bookmarkEnd w:id="31"/>
     </w:p>
     <w:p>
       <w:pPr>
@@ -7252,11 +7626,11 @@
         <w:pStyle w:val="Heading2"/>
         <w:spacing w:after="150" w:before="300"/>
       </w:pPr>
-      <w:bookmarkStart w:name="_Toc31" w:id="31"/>
+      <w:bookmarkStart w:name="_Toc32" w:id="32"/>
       <w:r>
         <w:t xml:space="preserve">7.7 Firewall de Windows en el propio servidor</w:t>
       </w:r>
-      <w:bookmarkEnd w:id="31"/>
+      <w:bookmarkEnd w:id="32"/>
     </w:p>
     <w:p>
       <w:pPr>
@@ -7317,11 +7691,11 @@
         <w:pStyle w:val="Heading1"/>
         <w:spacing w:after="200" w:before="400"/>
       </w:pPr>
-      <w:bookmarkStart w:name="_Toc32" w:id="32"/>
+      <w:bookmarkStart w:name="_Toc33" w:id="33"/>
       <w:r>
         <w:t xml:space="preserve">8. DNS</w:t>
       </w:r>
-      <w:bookmarkEnd w:id="32"/>
+      <w:bookmarkEnd w:id="33"/>
     </w:p>
     <w:p>
       <w:pPr>
@@ -7611,11 +7985,11 @@
         <w:pStyle w:val="Heading1"/>
         <w:spacing w:after="200" w:before="400"/>
       </w:pPr>
-      <w:bookmarkStart w:name="_Toc33" w:id="33"/>
+      <w:bookmarkStart w:name="_Toc34" w:id="34"/>
       <w:r>
         <w:t xml:space="preserve">9. Validación y pruebas de aceptación</w:t>
       </w:r>
-      <w:bookmarkEnd w:id="33"/>
+      <w:bookmarkEnd w:id="34"/>
     </w:p>
     <w:p>
       <w:pPr>
@@ -7802,11 +8176,11 @@
         <w:pStyle w:val="Heading1"/>
         <w:spacing w:after="200" w:before="400"/>
       </w:pPr>
-      <w:bookmarkStart w:name="_Toc34" w:id="34"/>
+      <w:bookmarkStart w:name="_Toc35" w:id="35"/>
       <w:r>
         <w:t xml:space="preserve">Anexo A — Variables de entorno (.env) de referencia</w:t>
       </w:r>
-      <w:bookmarkEnd w:id="34"/>
+      <w:bookmarkEnd w:id="35"/>
     </w:p>
     <w:p>
       <w:pPr>
@@ -9085,22 +9459,22 @@
         <w:pStyle w:val="Heading1"/>
         <w:spacing w:after="200" w:before="400"/>
       </w:pPr>
-      <w:bookmarkStart w:name="_Toc35" w:id="35"/>
+      <w:bookmarkStart w:name="_Toc36" w:id="36"/>
       <w:r>
         <w:t xml:space="preserve">Anexo B — Comandos de referencia rápida</w:t>
       </w:r>
-      <w:bookmarkEnd w:id="35"/>
+      <w:bookmarkEnd w:id="36"/>
     </w:p>
     <w:p>
       <w:pPr>
         <w:pStyle w:val="Heading3"/>
         <w:spacing w:after="100" w:before="200"/>
       </w:pPr>
-      <w:bookmarkStart w:name="_Toc36" w:id="36"/>
+      <w:bookmarkStart w:name="_Toc37" w:id="37"/>
       <w:r>
         <w:t xml:space="preserve">Backend</w:t>
       </w:r>
-      <w:bookmarkEnd w:id="36"/>
+      <w:bookmarkEnd w:id="37"/>
     </w:p>
     <w:tbl>
       <w:tblPr>
@@ -9192,11 +9566,11 @@
         <w:pStyle w:val="Heading3"/>
         <w:spacing w:after="100" w:before="200"/>
       </w:pPr>
-      <w:bookmarkStart w:name="_Toc37" w:id="37"/>
+      <w:bookmarkStart w:name="_Toc38" w:id="38"/>
       <w:r>
         <w:t xml:space="preserve">Base de datos</w:t>
       </w:r>
-      <w:bookmarkEnd w:id="37"/>
+      <w:bookmarkEnd w:id="38"/>
     </w:p>
     <w:tbl>
       <w:tblPr>
@@ -9288,11 +9662,11 @@
         <w:pStyle w:val="Heading3"/>
         <w:spacing w:after="100" w:before="200"/>
       </w:pPr>
-      <w:bookmarkStart w:name="_Toc38" w:id="38"/>
+      <w:bookmarkStart w:name="_Toc39" w:id="39"/>
       <w:r>
         <w:t xml:space="preserve">Sincronización SharePoint</w:t>
       </w:r>
-      <w:bookmarkEnd w:id="38"/>
+      <w:bookmarkEnd w:id="39"/>
     </w:p>
     <w:tbl>
       <w:tblPr>
@@ -9370,11 +9744,11 @@
         <w:pStyle w:val="Heading3"/>
         <w:spacing w:after="100" w:before="200"/>
       </w:pPr>
-      <w:bookmarkStart w:name="_Toc39" w:id="39"/>
+      <w:bookmarkStart w:name="_Toc40" w:id="40"/>
       <w:r>
         <w:t xml:space="preserve">Frontend</w:t>
       </w:r>
-      <w:bookmarkEnd w:id="39"/>
+      <w:bookmarkEnd w:id="40"/>
     </w:p>
     <w:tbl>
       <w:tblPr>
@@ -9452,11 +9826,11 @@
         <w:pStyle w:val="Heading1"/>
         <w:spacing w:after="200" w:before="400"/>
       </w:pPr>
-      <w:bookmarkStart w:name="_Toc40" w:id="40"/>
+      <w:bookmarkStart w:name="_Toc41" w:id="41"/>
       <w:r>
         <w:t xml:space="preserve">10. Riesgos y pendientes conocidos</w:t>
       </w:r>
-      <w:bookmarkEnd w:id="40"/>
+      <w:bookmarkEnd w:id="41"/>
     </w:p>
     <w:tbl>
       <w:tblPr>

</xml_diff>

<commit_message>
Fijar versiones exactas de NSSM, Node.js, URL Rewrite y ARR en la guia
Confirmadas y verificadas (con checksum oficial cuando aplica): NSSM 2.24,
Node.js v24.22.0 LTS (Krypton), IIS URL Rewrite 2.1 y Application Request
Routing 3.0, todas descargadas de sus fuentes oficiales.

Co-Authored-By: Claude Sonnet 5 <noreply@anthropic.com>
</commit_message>
<xml_diff>
--- a/docs/Guia_Instalacion_mIA_Preproduccion.docx
+++ b/docs/Guia_Instalacion_mIA_Preproduccion.docx
@@ -4126,7 +4126,7 @@
                 <w:sz w:val="20"/>
                 <w:szCs w:val="20"/>
               </w:rPr>
-              <w:t xml:space="preserve">Última</w:t>
+              <w:t xml:space="preserve">2.24</w:t>
             </w:r>
           </w:p>
         </w:tc>
@@ -5415,6 +5415,19 @@
         <w:t xml:space="preserve">Paso 10 — Registrar el backend como servicio de Windows (NSSM)</w:t>
       </w:r>
       <w:bookmarkEnd w:id="18"/>
+    </w:p>
+    <w:p>
+      <w:pPr>
+        <w:spacing w:after="160" w:line="276"/>
+      </w:pPr>
+      <w:r>
+        <w:rPr>
+          <w:rFonts w:ascii="Calibri" w:cs="Calibri" w:eastAsia="Calibri" w:hAnsi="Calibri"/>
+          <w:sz w:val="22"/>
+          <w:szCs w:val="22"/>
+        </w:rPr>
+        <w:t xml:space="preserve">Descomprime la release oficial (nssm 2.24, de nssm.cc) en una ruta estable del servidor, por ejemplo C:\apps\nssm\, y usa el ejecutable de win64\nssm.exe:</w:t>
+      </w:r>
     </w:p>
     <w:tbl>
       <w:tblPr>
@@ -6007,7 +6020,7 @@
                 <w:sz w:val="20"/>
                 <w:szCs w:val="20"/>
               </w:rPr>
-              <w:t xml:space="preserve">LTS (20.x o superior)</w:t>
+              <w:t xml:space="preserve">v24.22.0 LTS "Krypton"</w:t>
             </w:r>
           </w:p>
         </w:tc>
@@ -6038,7 +6051,7 @@
                 <w:sz w:val="20"/>
                 <w:szCs w:val="20"/>
               </w:rPr>
-              <w:t xml:space="preserve">Entorno de compilación de Vite. Instalador oficial desde nodejs.org</w:t>
+              <w:t xml:space="preserve">Entorno de compilación de Vite. Instalador oficial (.msi) desde nodejs.org</w:t>
             </w:r>
           </w:p>
         </w:tc>
@@ -6731,17 +6744,226 @@
           <w:sz w:val="22"/>
           <w:szCs w:val="22"/>
         </w:rPr>
-        <w:t xml:space="preserve">Si no están ya instalados en el servidor, descarga e instala, desde el sitio oficial de IIS (iis.net), los módulos:</w:t>
-      </w:r>
-    </w:p>
-    <w:p>
-      <w:pPr>
-        <w:pStyle w:val="ListParagraph"/>
-        <w:numPr>
-          <w:ilvl w:val="0"/>
-          <w:numId w:val="2"/>
-        </w:numPr>
-        <w:spacing w:after="100"/>
+        <w:t xml:space="preserve">Si no están ya instalados en el servidor, descarga e instala, desde Microsoft, los dos módulos (en este orden: primero URL Rewrite, después ARR) y reinicia IIS (iisreset) al terminar:</w:t>
+      </w:r>
+    </w:p>
+    <w:tbl>
+      <w:tblPr>
+        <w:tblW w:type="dxa" w:w="9026"/>
+        <w:tblBorders>
+          <w:top w:val="single" w:color="auto" w:sz="4"/>
+          <w:left w:val="single" w:color="auto" w:sz="4"/>
+          <w:bottom w:val="single" w:color="auto" w:sz="4"/>
+          <w:right w:val="single" w:color="auto" w:sz="4"/>
+          <w:insideH w:val="single" w:color="auto" w:sz="4"/>
+          <w:insideV w:val="single" w:color="auto" w:sz="4"/>
+        </w:tblBorders>
+      </w:tblPr>
+      <w:tblGrid>
+        <w:gridCol w:w="2300"/>
+        <w:gridCol w:w="6726"/>
+      </w:tblGrid>
+      <w:tr>
+        <w:trPr>
+          <w:tblHeader/>
+        </w:trPr>
+        <w:tc>
+          <w:tcPr>
+            <w:tcW w:type="dxa" w:w="2300"/>
+            <w:tcBorders>
+              <w:top w:val="single" w:color="B7C6E6" w:sz="4"/>
+              <w:left w:val="single" w:color="B7C6E6" w:sz="4"/>
+              <w:bottom w:val="single" w:color="B7C6E6" w:sz="4"/>
+              <w:right w:val="single" w:color="B7C6E6" w:sz="4"/>
+            </w:tcBorders>
+            <w:shd w:fill="1F3864" w:val="clear"/>
+            <w:tcMar>
+              <w:top w:type="dxa" w:w="100"/>
+              <w:left w:type="dxa" w:w="140"/>
+              <w:bottom w:type="dxa" w:w="100"/>
+              <w:right w:type="dxa" w:w="140"/>
+            </w:tcMar>
+            <w:vAlign w:val="center"/>
+          </w:tcPr>
+          <w:p>
+            <w:r>
+              <w:rPr>
+                <w:rFonts w:ascii="Calibri" w:cs="Calibri" w:eastAsia="Calibri" w:hAnsi="Calibri"/>
+                <w:b/>
+                <w:bCs/>
+                <w:color w:val="FFFFFF"/>
+                <w:sz w:val="20"/>
+                <w:szCs w:val="20"/>
+              </w:rPr>
+              <w:t xml:space="preserve">Módulo</w:t>
+            </w:r>
+          </w:p>
+        </w:tc>
+        <w:tc>
+          <w:tcPr>
+            <w:tcW w:type="dxa" w:w="6726"/>
+            <w:tcBorders>
+              <w:top w:val="single" w:color="B7C6E6" w:sz="4"/>
+              <w:left w:val="single" w:color="B7C6E6" w:sz="4"/>
+              <w:bottom w:val="single" w:color="B7C6E6" w:sz="4"/>
+              <w:right w:val="single" w:color="B7C6E6" w:sz="4"/>
+            </w:tcBorders>
+            <w:shd w:fill="1F3864" w:val="clear"/>
+            <w:tcMar>
+              <w:top w:type="dxa" w:w="100"/>
+              <w:left w:type="dxa" w:w="140"/>
+              <w:bottom w:type="dxa" w:w="100"/>
+              <w:right w:type="dxa" w:w="140"/>
+            </w:tcMar>
+            <w:vAlign w:val="center"/>
+          </w:tcPr>
+          <w:p>
+            <w:r>
+              <w:rPr>
+                <w:rFonts w:ascii="Calibri" w:cs="Calibri" w:eastAsia="Calibri" w:hAnsi="Calibri"/>
+                <w:b/>
+                <w:bCs/>
+                <w:color w:val="FFFFFF"/>
+                <w:sz w:val="20"/>
+                <w:szCs w:val="20"/>
+              </w:rPr>
+              <w:t xml:space="preserve">Instalador (x64)</w:t>
+            </w:r>
+          </w:p>
+        </w:tc>
+      </w:tr>
+      <w:tr>
+        <w:tc>
+          <w:tcPr>
+            <w:tcW w:type="dxa" w:w="2300"/>
+            <w:tcBorders>
+              <w:top w:val="single" w:color="B7C6E6" w:sz="4"/>
+              <w:left w:val="single" w:color="B7C6E6" w:sz="4"/>
+              <w:bottom w:val="single" w:color="B7C6E6" w:sz="4"/>
+              <w:right w:val="single" w:color="B7C6E6" w:sz="4"/>
+            </w:tcBorders>
+            <w:shd w:fill="FFFFFF" w:val="clear"/>
+            <w:tcMar>
+              <w:top w:type="dxa" w:w="90"/>
+              <w:left w:type="dxa" w:w="140"/>
+              <w:bottom w:type="dxa" w:w="90"/>
+              <w:right w:type="dxa" w:w="140"/>
+            </w:tcMar>
+            <w:vAlign w:val="center"/>
+          </w:tcPr>
+          <w:p>
+            <w:r>
+              <w:rPr>
+                <w:rFonts w:ascii="Calibri" w:cs="Calibri" w:eastAsia="Calibri" w:hAnsi="Calibri"/>
+                <w:b w:val="false"/>
+                <w:bCs w:val="false"/>
+                <w:sz w:val="20"/>
+                <w:szCs w:val="20"/>
+              </w:rPr>
+              <w:t xml:space="preserve">URL Rewrite 2.1</w:t>
+            </w:r>
+          </w:p>
+        </w:tc>
+        <w:tc>
+          <w:tcPr>
+            <w:tcW w:type="dxa" w:w="6726"/>
+            <w:tcBorders>
+              <w:top w:val="single" w:color="B7C6E6" w:sz="4"/>
+              <w:left w:val="single" w:color="B7C6E6" w:sz="4"/>
+              <w:bottom w:val="single" w:color="B7C6E6" w:sz="4"/>
+              <w:right w:val="single" w:color="B7C6E6" w:sz="4"/>
+            </w:tcBorders>
+            <w:shd w:fill="FFFFFF" w:val="clear"/>
+            <w:tcMar>
+              <w:top w:type="dxa" w:w="90"/>
+              <w:left w:type="dxa" w:w="140"/>
+              <w:bottom w:type="dxa" w:w="90"/>
+              <w:right w:type="dxa" w:w="140"/>
+            </w:tcMar>
+            <w:vAlign w:val="center"/>
+          </w:tcPr>
+          <w:p>
+            <w:r>
+              <w:rPr>
+                <w:rFonts w:ascii="Calibri" w:cs="Calibri" w:eastAsia="Calibri" w:hAnsi="Calibri"/>
+                <w:b w:val="false"/>
+                <w:bCs w:val="false"/>
+                <w:sz w:val="20"/>
+                <w:szCs w:val="20"/>
+              </w:rPr>
+              <w:t xml:space="preserve">rewrite_amd64_en-US.msi — download.microsoft.com</w:t>
+            </w:r>
+          </w:p>
+        </w:tc>
+      </w:tr>
+      <w:tr>
+        <w:tc>
+          <w:tcPr>
+            <w:tcW w:type="dxa" w:w="2300"/>
+            <w:tcBorders>
+              <w:top w:val="single" w:color="B7C6E6" w:sz="4"/>
+              <w:left w:val="single" w:color="B7C6E6" w:sz="4"/>
+              <w:bottom w:val="single" w:color="B7C6E6" w:sz="4"/>
+              <w:right w:val="single" w:color="B7C6E6" w:sz="4"/>
+            </w:tcBorders>
+            <w:shd w:fill="F2F2F2" w:val="clear"/>
+            <w:tcMar>
+              <w:top w:type="dxa" w:w="90"/>
+              <w:left w:type="dxa" w:w="140"/>
+              <w:bottom w:type="dxa" w:w="90"/>
+              <w:right w:type="dxa" w:w="140"/>
+            </w:tcMar>
+            <w:vAlign w:val="center"/>
+          </w:tcPr>
+          <w:p>
+            <w:r>
+              <w:rPr>
+                <w:rFonts w:ascii="Calibri" w:cs="Calibri" w:eastAsia="Calibri" w:hAnsi="Calibri"/>
+                <w:b w:val="false"/>
+                <w:bCs w:val="false"/>
+                <w:sz w:val="20"/>
+                <w:szCs w:val="20"/>
+              </w:rPr>
+              <w:t xml:space="preserve">Application Request Routing (ARR) 3.0</w:t>
+            </w:r>
+          </w:p>
+        </w:tc>
+        <w:tc>
+          <w:tcPr>
+            <w:tcW w:type="dxa" w:w="6726"/>
+            <w:tcBorders>
+              <w:top w:val="single" w:color="B7C6E6" w:sz="4"/>
+              <w:left w:val="single" w:color="B7C6E6" w:sz="4"/>
+              <w:bottom w:val="single" w:color="B7C6E6" w:sz="4"/>
+              <w:right w:val="single" w:color="B7C6E6" w:sz="4"/>
+            </w:tcBorders>
+            <w:shd w:fill="F2F2F2" w:val="clear"/>
+            <w:tcMar>
+              <w:top w:type="dxa" w:w="90"/>
+              <w:left w:type="dxa" w:w="140"/>
+              <w:bottom w:type="dxa" w:w="90"/>
+              <w:right w:type="dxa" w:w="140"/>
+            </w:tcMar>
+            <w:vAlign w:val="center"/>
+          </w:tcPr>
+          <w:p>
+            <w:r>
+              <w:rPr>
+                <w:rFonts w:ascii="Calibri" w:cs="Calibri" w:eastAsia="Calibri" w:hAnsi="Calibri"/>
+                <w:b w:val="false"/>
+                <w:bCs w:val="false"/>
+                <w:sz w:val="20"/>
+                <w:szCs w:val="20"/>
+              </w:rPr>
+              <w:t xml:space="preserve">requestRouter_amd64.msi — download.microsoft.com</w:t>
+            </w:r>
+          </w:p>
+        </w:tc>
+      </w:tr>
+    </w:tbl>
+    <w:p>
+      <w:pPr>
+        <w:spacing w:after="160" w:line="276"/>
       </w:pPr>
       <w:r>
         <w:rPr>
@@ -6749,27 +6971,94 @@
           <w:sz w:val="22"/>
           <w:szCs w:val="22"/>
         </w:rPr>
-        <w:t xml:space="preserve">URL Rewrite</w:t>
-      </w:r>
-    </w:p>
-    <w:p>
-      <w:pPr>
-        <w:pStyle w:val="ListParagraph"/>
-        <w:numPr>
-          <w:ilvl w:val="0"/>
-          <w:numId w:val="2"/>
-        </w:numPr>
-        <w:spacing w:after="100"/>
-      </w:pPr>
-      <w:r>
-        <w:rPr>
-          <w:rFonts w:ascii="Calibri" w:cs="Calibri" w:eastAsia="Calibri" w:hAnsi="Calibri"/>
-          <w:sz w:val="22"/>
-          <w:szCs w:val="22"/>
-        </w:rPr>
-        <w:t xml:space="preserve">Application Request Routing (ARR)</w:t>
-      </w:r>
-    </w:p>
+        <w:t xml:space="preserve">Verifica la integridad del instalador antes de ejecutarlo en el servidor, comparando su hash SHA1 contra el valor publicado:</w:t>
+      </w:r>
+    </w:p>
+    <w:tbl>
+      <w:tblPr>
+        <w:tblW w:type="pct" w:w="5000"/>
+        <w:tblBorders>
+          <w:top w:val="single" w:color="auto" w:sz="4"/>
+          <w:left w:val="single" w:color="auto" w:sz="4"/>
+          <w:bottom w:val="single" w:color="auto" w:sz="4"/>
+          <w:right w:val="single" w:color="auto" w:sz="4"/>
+          <w:insideH w:val="single" w:color="auto" w:sz="4"/>
+          <w:insideV w:val="single" w:color="auto" w:sz="4"/>
+        </w:tblBorders>
+      </w:tblPr>
+      <w:tblGrid>
+        <w:gridCol w:w="9026"/>
+      </w:tblGrid>
+      <w:tr>
+        <w:tc>
+          <w:tcPr>
+            <w:shd w:fill="2B2B2B" w:val="clear"/>
+            <w:tcMar>
+              <w:top w:type="dxa" w:w="140"/>
+              <w:left w:type="dxa" w:w="200"/>
+              <w:bottom w:type="dxa" w:w="140"/>
+              <w:right w:type="dxa" w:w="200"/>
+            </w:tcMar>
+          </w:tcPr>
+          <w:p>
+            <w:pPr>
+              <w:spacing w:after="0"/>
+            </w:pPr>
+            <w:r>
+              <w:rPr>
+                <w:rFonts w:ascii="Consolas" w:cs="Consolas" w:eastAsia="Consolas" w:hAnsi="Consolas"/>
+                <w:color w:val="E8E8E8"/>
+                <w:sz w:val="19"/>
+                <w:szCs w:val="19"/>
+              </w:rPr>
+              <w:t xml:space="preserve">Get-FileHash rewrite_amd64_en-US.msi -Algorithm SHA1</w:t>
+            </w:r>
+          </w:p>
+          <w:p>
+            <w:pPr>
+              <w:spacing w:after="0"/>
+            </w:pPr>
+            <w:r>
+              <w:rPr>
+                <w:rFonts w:ascii="Consolas" w:cs="Consolas" w:eastAsia="Consolas" w:hAnsi="Consolas"/>
+                <w:color w:val="E8E8E8"/>
+                <w:sz w:val="19"/>
+                <w:szCs w:val="19"/>
+              </w:rPr>
+              <w:t xml:space="preserve">  # 8F41A67FA49110155969DCCFF265B8623A66448F</w:t>
+            </w:r>
+          </w:p>
+          <w:p>
+            <w:pPr>
+              <w:spacing w:after="0"/>
+            </w:pPr>
+            <w:r>
+              <w:rPr>
+                <w:rFonts w:ascii="Consolas" w:cs="Consolas" w:eastAsia="Consolas" w:hAnsi="Consolas"/>
+                <w:color w:val="E8E8E8"/>
+                <w:sz w:val="19"/>
+                <w:szCs w:val="19"/>
+              </w:rPr>
+              <w:t xml:space="preserve">Get-FileHash requestRouter_amd64.msi -Algorithm SHA1</w:t>
+            </w:r>
+          </w:p>
+          <w:p>
+            <w:pPr>
+              <w:spacing w:after="0"/>
+            </w:pPr>
+            <w:r>
+              <w:rPr>
+                <w:rFonts w:ascii="Consolas" w:cs="Consolas" w:eastAsia="Consolas" w:hAnsi="Consolas"/>
+                <w:color w:val="E8E8E8"/>
+                <w:sz w:val="19"/>
+                <w:szCs w:val="19"/>
+              </w:rPr>
+              <w:t xml:space="preserve">  # 8B258C3D62AC41192F1D01BA9FCFEDD8421320BA</w:t>
+            </w:r>
+          </w:p>
+        </w:tc>
+      </w:tr>
+    </w:tbl>
     <w:p>
       <w:pPr>
         <w:spacing w:after="160" w:line="276"/>

</xml_diff>

<commit_message>
Detallar los pasos de instalacion de cada instalador y su verificacion
Anadidos los comandos de instalacion desatendida (PostgreSQL, Node.js,
URL Rewrite, ARR) referenciando el fichero exacto descargado, y un nuevo
Anexo C con la version, fuente oficial y checksum de cada instalador
usado en esta guia.

Co-Authored-By: Claude Sonnet 5 <noreply@anthropic.com>
</commit_message>
<xml_diff>
--- a/docs/Guia_Instalacion_mIA_Preproduccion.docx
+++ b/docs/Guia_Instalacion_mIA_Preproduccion.docx
@@ -926,7 +926,7 @@
           </w:pPr>
           <w:hyperlink w:history="1" w:anchor="_Toc23">
             <w:r>
-              <w:t xml:space="preserve">Paso 1 — Instalar dependencias y compilar</w:t>
+              <w:t xml:space="preserve">Paso 1 — Instalar Node.js</w:t>
             </w:r>
             <w:r>
               <w:tab/>
@@ -949,7 +949,7 @@
           </w:pPr>
           <w:hyperlink w:history="1" w:anchor="_Toc24">
             <w:r>
-              <w:t xml:space="preserve">Paso 2 — Publicar el contenido compilado</w:t>
+              <w:t xml:space="preserve">Paso 2 — Instalar dependencias y compilar</w:t>
             </w:r>
             <w:r>
               <w:tab/>
@@ -957,6 +957,29 @@
             <w:r>
               <w:fldChar w:fldCharType="begin" w:dirty="true"/>
               <w:instrText xml:space="preserve">PAGEREF _Toc24 \h</w:instrText>
+              <w:fldChar w:fldCharType="separate"/>
+              <w:fldChar w:fldCharType="end"/>
+            </w:r>
+          </w:hyperlink>
+        </w:p>
+        <w:p>
+          <w:pPr>
+            <w:pStyle w:val="TOC3"/>
+            <w:tabs>
+              <w:tab w:val="right" w:pos="9026" w:leader="dot"/>
+            </w:tabs>
+            <w:ind w:left="440"/>
+          </w:pPr>
+          <w:hyperlink w:history="1" w:anchor="_Toc25">
+            <w:r>
+              <w:t xml:space="preserve">Paso 3 — Publicar el contenido compilado</w:t>
+            </w:r>
+            <w:r>
+              <w:tab/>
+            </w:r>
+            <w:r>
+              <w:fldChar w:fldCharType="begin" w:dirty="true"/>
+              <w:instrText xml:space="preserve">PAGEREF _Toc25 \h</w:instrText>
               <w:fldChar w:fldCharType="separate"/>
               <w:fldChar w:fldCharType="end"/>
             </w:r>
@@ -969,32 +992,9 @@
               <w:tab w:val="right" w:pos="9026" w:leader="dot"/>
             </w:tabs>
           </w:pPr>
-          <w:hyperlink w:history="1" w:anchor="_Toc25">
+          <w:hyperlink w:history="1" w:anchor="_Toc26">
             <w:r>
               <w:t xml:space="preserve">7. Configuración de IIS: sitio, binding y proxy inverso</w:t>
-            </w:r>
-            <w:r>
-              <w:tab/>
-            </w:r>
-            <w:r>
-              <w:fldChar w:fldCharType="begin" w:dirty="true"/>
-              <w:instrText xml:space="preserve">PAGEREF _Toc25 \h</w:instrText>
-              <w:fldChar w:fldCharType="separate"/>
-              <w:fldChar w:fldCharType="end"/>
-            </w:r>
-          </w:hyperlink>
-        </w:p>
-        <w:p>
-          <w:pPr>
-            <w:pStyle w:val="TOC2"/>
-            <w:tabs>
-              <w:tab w:val="right" w:pos="9026" w:leader="dot"/>
-            </w:tabs>
-            <w:ind w:left="220"/>
-          </w:pPr>
-          <w:hyperlink w:history="1" w:anchor="_Toc26">
-            <w:r>
-              <w:t xml:space="preserve">7.1 Crear el sitio IIS para mIA</w:t>
             </w:r>
             <w:r>
               <w:tab/>
@@ -1017,7 +1017,7 @@
           </w:pPr>
           <w:hyperlink w:history="1" w:anchor="_Toc27">
             <w:r>
-              <w:t xml:space="preserve">7.2 Certificado SSL</w:t>
+              <w:t xml:space="preserve">7.1 Crear el sitio IIS para mIA</w:t>
             </w:r>
             <w:r>
               <w:tab/>
@@ -1040,7 +1040,7 @@
           </w:pPr>
           <w:hyperlink w:history="1" w:anchor="_Toc28">
             <w:r>
-              <w:t xml:space="preserve">7.3 Instalar los módulos ARR y URL Rewrite</w:t>
+              <w:t xml:space="preserve">7.2 Certificado SSL</w:t>
             </w:r>
             <w:r>
               <w:tab/>
@@ -1063,7 +1063,7 @@
           </w:pPr>
           <w:hyperlink w:history="1" w:anchor="_Toc29">
             <w:r>
-              <w:t xml:space="preserve">7.4 Regla de proxy inverso hacia el backend</w:t>
+              <w:t xml:space="preserve">7.3 Instalar los módulos ARR y URL Rewrite</w:t>
             </w:r>
             <w:r>
               <w:tab/>
@@ -1086,7 +1086,7 @@
           </w:pPr>
           <w:hyperlink w:history="1" w:anchor="_Toc30">
             <w:r>
-              <w:t xml:space="preserve">7.5 Redirección HTTP → HTTPS</w:t>
+              <w:t xml:space="preserve">7.4 Regla de proxy inverso hacia el backend</w:t>
             </w:r>
             <w:r>
               <w:tab/>
@@ -1109,7 +1109,7 @@
           </w:pPr>
           <w:hyperlink w:history="1" w:anchor="_Toc31">
             <w:r>
-              <w:t xml:space="preserve">7.6 Publicación del frontend y la ruta /mia/</w:t>
+              <w:t xml:space="preserve">7.5 Redirección HTTP → HTTPS</w:t>
             </w:r>
             <w:r>
               <w:tab/>
@@ -1132,7 +1132,7 @@
           </w:pPr>
           <w:hyperlink w:history="1" w:anchor="_Toc32">
             <w:r>
-              <w:t xml:space="preserve">7.7 Firewall de Windows en el propio servidor</w:t>
+              <w:t xml:space="preserve">7.6 Publicación del frontend y la ruta /mia/</w:t>
             </w:r>
             <w:r>
               <w:tab/>
@@ -1147,14 +1147,15 @@
         </w:p>
         <w:p>
           <w:pPr>
-            <w:pStyle w:val="TOC1"/>
+            <w:pStyle w:val="TOC2"/>
             <w:tabs>
               <w:tab w:val="right" w:pos="9026" w:leader="dot"/>
             </w:tabs>
+            <w:ind w:left="220"/>
           </w:pPr>
           <w:hyperlink w:history="1" w:anchor="_Toc33">
             <w:r>
-              <w:t xml:space="preserve">8. DNS</w:t>
+              <w:t xml:space="preserve">7.7 Firewall de Windows en el propio servidor</w:t>
             </w:r>
             <w:r>
               <w:tab/>
@@ -1176,7 +1177,7 @@
           </w:pPr>
           <w:hyperlink w:history="1" w:anchor="_Toc34">
             <w:r>
-              <w:t xml:space="preserve">9. Validación y pruebas de aceptación</w:t>
+              <w:t xml:space="preserve">8. DNS</w:t>
             </w:r>
             <w:r>
               <w:tab/>
@@ -1198,7 +1199,7 @@
           </w:pPr>
           <w:hyperlink w:history="1" w:anchor="_Toc35">
             <w:r>
-              <w:t xml:space="preserve">Anexo A — Variables de entorno (.env) de referencia</w:t>
+              <w:t xml:space="preserve">9. Validación y pruebas de aceptación</w:t>
             </w:r>
             <w:r>
               <w:tab/>
@@ -1220,7 +1221,7 @@
           </w:pPr>
           <w:hyperlink w:history="1" w:anchor="_Toc36">
             <w:r>
-              <w:t xml:space="preserve">Anexo B — Comandos de referencia rápida</w:t>
+              <w:t xml:space="preserve">Anexo A — Variables de entorno (.env) de referencia</w:t>
             </w:r>
             <w:r>
               <w:tab/>
@@ -1235,15 +1236,14 @@
         </w:p>
         <w:p>
           <w:pPr>
-            <w:pStyle w:val="TOC3"/>
+            <w:pStyle w:val="TOC1"/>
             <w:tabs>
               <w:tab w:val="right" w:pos="9026" w:leader="dot"/>
             </w:tabs>
-            <w:ind w:left="440"/>
           </w:pPr>
           <w:hyperlink w:history="1" w:anchor="_Toc37">
             <w:r>
-              <w:t xml:space="preserve">Backend</w:t>
+              <w:t xml:space="preserve">Anexo B — Comandos de referencia rápida</w:t>
             </w:r>
             <w:r>
               <w:tab/>
@@ -1266,7 +1266,7 @@
           </w:pPr>
           <w:hyperlink w:history="1" w:anchor="_Toc38">
             <w:r>
-              <w:t xml:space="preserve">Base de datos</w:t>
+              <w:t xml:space="preserve">Backend</w:t>
             </w:r>
             <w:r>
               <w:tab/>
@@ -1289,7 +1289,7 @@
           </w:pPr>
           <w:hyperlink w:history="1" w:anchor="_Toc39">
             <w:r>
-              <w:t xml:space="preserve">Sincronización SharePoint</w:t>
+              <w:t xml:space="preserve">Base de datos</w:t>
             </w:r>
             <w:r>
               <w:tab/>
@@ -1312,7 +1312,7 @@
           </w:pPr>
           <w:hyperlink w:history="1" w:anchor="_Toc40">
             <w:r>
-              <w:t xml:space="preserve">Frontend</w:t>
+              <w:t xml:space="preserve">Sincronización SharePoint</w:t>
             </w:r>
             <w:r>
               <w:tab/>
@@ -1320,6 +1320,29 @@
             <w:r>
               <w:fldChar w:fldCharType="begin" w:dirty="true"/>
               <w:instrText xml:space="preserve">PAGEREF _Toc40 \h</w:instrText>
+              <w:fldChar w:fldCharType="separate"/>
+              <w:fldChar w:fldCharType="end"/>
+            </w:r>
+          </w:hyperlink>
+        </w:p>
+        <w:p>
+          <w:pPr>
+            <w:pStyle w:val="TOC3"/>
+            <w:tabs>
+              <w:tab w:val="right" w:pos="9026" w:leader="dot"/>
+            </w:tabs>
+            <w:ind w:left="440"/>
+          </w:pPr>
+          <w:hyperlink w:history="1" w:anchor="_Toc41">
+            <w:r>
+              <w:t xml:space="preserve">Frontend</w:t>
+            </w:r>
+            <w:r>
+              <w:tab/>
+            </w:r>
+            <w:r>
+              <w:fldChar w:fldCharType="begin" w:dirty="true"/>
+              <w:instrText xml:space="preserve">PAGEREF _Toc41 \h</w:instrText>
               <w:fldChar w:fldCharType="separate"/>
               <w:fldChar w:fldCharType="end"/>
             </w:r>
@@ -1332,7 +1355,29 @@
               <w:tab w:val="right" w:pos="9026" w:leader="dot"/>
             </w:tabs>
           </w:pPr>
-          <w:hyperlink w:history="1" w:anchor="_Toc41">
+          <w:hyperlink w:history="1" w:anchor="_Toc42">
+            <w:r>
+              <w:t xml:space="preserve">Anexo C — Ficheros de instalación (versión y verificación)</w:t>
+            </w:r>
+            <w:r>
+              <w:tab/>
+            </w:r>
+            <w:r>
+              <w:fldChar w:fldCharType="begin" w:dirty="true"/>
+              <w:instrText xml:space="preserve">PAGEREF _Toc42 \h</w:instrText>
+              <w:fldChar w:fldCharType="separate"/>
+              <w:fldChar w:fldCharType="end"/>
+            </w:r>
+          </w:hyperlink>
+        </w:p>
+        <w:p>
+          <w:pPr>
+            <w:pStyle w:val="TOC1"/>
+            <w:tabs>
+              <w:tab w:val="right" w:pos="9026" w:leader="dot"/>
+            </w:tabs>
+          </w:pPr>
+          <w:hyperlink w:history="1" w:anchor="_Toc43">
             <w:r>
               <w:t xml:space="preserve">10. Riesgos y pendientes conocidos</w:t>
             </w:r>
@@ -1341,7 +1386,7 @@
             </w:r>
             <w:r>
               <w:fldChar w:fldCharType="begin" w:dirty="true"/>
-              <w:instrText xml:space="preserve">PAGEREF _Toc41 \h</w:instrText>
+              <w:instrText xml:space="preserve">PAGEREF _Toc43 \h</w:instrText>
               <w:fldChar w:fldCharType="separate"/>
               <w:fldChar w:fldCharType="end"/>
             </w:r>
@@ -4389,9 +4434,107 @@
           <w:sz w:val="22"/>
           <w:szCs w:val="22"/>
         </w:rPr>
-        <w:t xml:space="preserve">Ejecuta el instalador oficial de EDB para Windows: postgresql-17.11-5-windows-x64.exe. Anota el puerto (5432 por defecto) y la contraseña del usuario postgres.</w:t>
-      </w:r>
-    </w:p>
+        <w:t xml:space="preserve">Ejecuta postgresql-17.11-5-windows-x64.exe (instalador oficial de EDB). En el asistente: directorio de instalación por defecto, componentes "PostgreSQL Server" + "Command Line Tools" (puedes desmarcar pgAdmin y Stack Builder si no los vas a usar), puerto 5432, locale "Spanish, Spain" o "Default locale", y la contraseña del usuario postgres.</w:t>
+      </w:r>
+    </w:p>
+    <w:p>
+      <w:pPr>
+        <w:spacing w:after="160" w:line="276"/>
+      </w:pPr>
+      <w:r>
+        <w:rPr>
+          <w:rFonts w:ascii="Calibri" w:cs="Calibri" w:eastAsia="Calibri" w:hAnsi="Calibri"/>
+          <w:sz w:val="22"/>
+          <w:szCs w:val="22"/>
+        </w:rPr>
+        <w:t xml:space="preserve">Alternativa en modo desatendido (sin asistente gráfico), ejecutado como administrador:</w:t>
+      </w:r>
+    </w:p>
+    <w:tbl>
+      <w:tblPr>
+        <w:tblW w:type="pct" w:w="5000"/>
+        <w:tblBorders>
+          <w:top w:val="single" w:color="auto" w:sz="4"/>
+          <w:left w:val="single" w:color="auto" w:sz="4"/>
+          <w:bottom w:val="single" w:color="auto" w:sz="4"/>
+          <w:right w:val="single" w:color="auto" w:sz="4"/>
+          <w:insideH w:val="single" w:color="auto" w:sz="4"/>
+          <w:insideV w:val="single" w:color="auto" w:sz="4"/>
+        </w:tblBorders>
+      </w:tblPr>
+      <w:tblGrid>
+        <w:gridCol w:w="9026"/>
+      </w:tblGrid>
+      <w:tr>
+        <w:tc>
+          <w:tcPr>
+            <w:shd w:fill="2B2B2B" w:val="clear"/>
+            <w:tcMar>
+              <w:top w:type="dxa" w:w="140"/>
+              <w:left w:type="dxa" w:w="200"/>
+              <w:bottom w:type="dxa" w:w="140"/>
+              <w:right w:type="dxa" w:w="200"/>
+            </w:tcMar>
+          </w:tcPr>
+          <w:p>
+            <w:pPr>
+              <w:spacing w:after="0"/>
+            </w:pPr>
+            <w:r>
+              <w:rPr>
+                <w:rFonts w:ascii="Consolas" w:cs="Consolas" w:eastAsia="Consolas" w:hAnsi="Consolas"/>
+                <w:color w:val="E8E8E8"/>
+                <w:sz w:val="19"/>
+                <w:szCs w:val="19"/>
+              </w:rPr>
+              <w:t xml:space="preserve">postgresql-17.11-5-windows-x64.exe --mode unattended ^</w:t>
+            </w:r>
+          </w:p>
+          <w:p>
+            <w:pPr>
+              <w:spacing w:after="0"/>
+            </w:pPr>
+            <w:r>
+              <w:rPr>
+                <w:rFonts w:ascii="Consolas" w:cs="Consolas" w:eastAsia="Consolas" w:hAnsi="Consolas"/>
+                <w:color w:val="E8E8E8"/>
+                <w:sz w:val="19"/>
+                <w:szCs w:val="19"/>
+              </w:rPr>
+              <w:t xml:space="preserve">  --unattendedmodeui minimal ^</w:t>
+            </w:r>
+          </w:p>
+          <w:p>
+            <w:pPr>
+              <w:spacing w:after="0"/>
+            </w:pPr>
+            <w:r>
+              <w:rPr>
+                <w:rFonts w:ascii="Consolas" w:cs="Consolas" w:eastAsia="Consolas" w:hAnsi="Consolas"/>
+                <w:color w:val="E8E8E8"/>
+                <w:sz w:val="19"/>
+                <w:szCs w:val="19"/>
+              </w:rPr>
+              <w:t xml:space="preserve">  --superpassword "una-password-fuerte" ^</w:t>
+            </w:r>
+          </w:p>
+          <w:p>
+            <w:pPr>
+              <w:spacing w:after="0"/>
+            </w:pPr>
+            <w:r>
+              <w:rPr>
+                <w:rFonts w:ascii="Consolas" w:cs="Consolas" w:eastAsia="Consolas" w:hAnsi="Consolas"/>
+                <w:color w:val="E8E8E8"/>
+                <w:sz w:val="19"/>
+                <w:szCs w:val="19"/>
+              </w:rPr>
+              <w:t xml:space="preserve">  --serverport 5432</w:t>
+            </w:r>
+          </w:p>
+        </w:tc>
+      </w:tr>
+    </w:tbl>
     <w:p>
       <w:pPr>
         <w:pStyle w:val="ListParagraph"/>
@@ -6183,9 +6326,35 @@
       </w:pPr>
       <w:bookmarkStart w:name="_Toc23" w:id="23"/>
       <w:r>
-        <w:t xml:space="preserve">Paso 1 — Instalar dependencias y compilar</w:t>
+        <w:t xml:space="preserve">Paso 1 — Instalar Node.js</w:t>
       </w:r>
       <w:bookmarkEnd w:id="23"/>
+    </w:p>
+    <w:p>
+      <w:pPr>
+        <w:spacing w:after="160" w:line="276"/>
+      </w:pPr>
+      <w:r>
+        <w:rPr>
+          <w:rFonts w:ascii="Calibri" w:cs="Calibri" w:eastAsia="Calibri" w:hAnsi="Calibri"/>
+          <w:sz w:val="22"/>
+          <w:szCs w:val="22"/>
+        </w:rPr>
+        <w:t xml:space="preserve">Ejecuta node-v24.22.0-x64.msi (instalador oficial de nodejs.org). En el asistente, acepta las opciones por defecto (incluye npm y añade Node.js al PATH).</w:t>
+      </w:r>
+    </w:p>
+    <w:p>
+      <w:pPr>
+        <w:spacing w:after="160" w:line="276"/>
+      </w:pPr>
+      <w:r>
+        <w:rPr>
+          <w:rFonts w:ascii="Calibri" w:cs="Calibri" w:eastAsia="Calibri" w:hAnsi="Calibri"/>
+          <w:sz w:val="22"/>
+          <w:szCs w:val="22"/>
+        </w:rPr>
+        <w:t xml:space="preserve">Alternativa en modo desatendido, ejecutado como administrador:</w:t>
+      </w:r>
     </w:p>
     <w:tbl>
       <w:tblPr>
@@ -6224,35 +6393,7 @@
                 <w:sz w:val="19"/>
                 <w:szCs w:val="19"/>
               </w:rPr>
-              <w:t xml:space="preserve">cd C:\apps\mia\current\frontend</w:t>
-            </w:r>
-          </w:p>
-          <w:p>
-            <w:pPr>
-              <w:spacing w:after="0"/>
-            </w:pPr>
-            <w:r>
-              <w:rPr>
-                <w:rFonts w:ascii="Consolas" w:cs="Consolas" w:eastAsia="Consolas" w:hAnsi="Consolas"/>
-                <w:color w:val="E8E8E8"/>
-                <w:sz w:val="19"/>
-                <w:szCs w:val="19"/>
-              </w:rPr>
-              <w:t xml:space="preserve">npm install</w:t>
-            </w:r>
-          </w:p>
-          <w:p>
-            <w:pPr>
-              <w:spacing w:after="0"/>
-            </w:pPr>
-            <w:r>
-              <w:rPr>
-                <w:rFonts w:ascii="Consolas" w:cs="Consolas" w:eastAsia="Consolas" w:hAnsi="Consolas"/>
-                <w:color w:val="E8E8E8"/>
-                <w:sz w:val="19"/>
-                <w:szCs w:val="19"/>
-              </w:rPr>
-              <w:t xml:space="preserve">npm run build</w:t>
+              <w:t xml:space="preserve">msiexec /i node-v24.22.0-x64.msi /quiet /norestart ADDLOCAL=ALL</w:t>
             </w:r>
           </w:p>
         </w:tc>
@@ -6268,7 +6409,7 @@
           <w:sz w:val="22"/>
           <w:szCs w:val="22"/>
         </w:rPr>
-        <w:t xml:space="preserve">Esto genera la carpeta frontend\dist\ con los tres mundos (portada, 2D, 3D y holograma) ya compilados.</w:t>
+        <w:t xml:space="preserve">Verifica:</w:t>
       </w:r>
     </w:p>
     <w:tbl>
@@ -6289,48 +6430,54 @@
       <w:tr>
         <w:tc>
           <w:tcPr>
-            <w:tcBorders>
-              <w:top w:val="single" w:color="E59866" w:sz="12"/>
-              <w:left w:val="single" w:color="E59866" w:sz="12"/>
-              <w:bottom w:val="single" w:color="E59866" w:sz="12"/>
-              <w:right w:val="single" w:color="E59866" w:sz="12"/>
-            </w:tcBorders>
-            <w:shd w:fill="FDEBD0" w:val="clear"/>
+            <w:shd w:fill="2B2B2B" w:val="clear"/>
             <w:tcMar>
               <w:top w:type="dxa" w:w="140"/>
-              <w:left w:type="dxa" w:w="220"/>
+              <w:left w:type="dxa" w:w="200"/>
               <w:bottom w:type="dxa" w:w="140"/>
-              <w:right w:type="dxa" w:w="220"/>
-            </w:tcMar>
-          </w:tcPr>
-          <w:p>
-            <w:pPr>
-              <w:spacing w:after="60"/>
-            </w:pPr>
-            <w:r>
-              <w:rPr>
-                <w:rFonts w:ascii="Calibri" w:cs="Calibri" w:eastAsia="Calibri" w:hAnsi="Calibri"/>
-                <w:b/>
-                <w:bCs/>
-                <w:color w:val="7D4F0A"/>
-                <w:sz w:val="22"/>
-                <w:szCs w:val="22"/>
-              </w:rPr>
-              <w:t xml:space="preserve">Detalle importante: la ruta base /mia/</w:t>
-            </w:r>
-          </w:p>
+              <w:right w:type="dxa" w:w="200"/>
+            </w:tcMar>
+          </w:tcPr>
           <w:p>
             <w:pPr>
               <w:spacing w:after="0"/>
             </w:pPr>
             <w:r>
               <w:rPr>
-                <w:rFonts w:ascii="Calibri" w:cs="Calibri" w:eastAsia="Calibri" w:hAnsi="Calibri"/>
-                <w:color w:val="5A3A08"/>
-                <w:sz w:val="21"/>
-                <w:szCs w:val="21"/>
-              </w:rPr>
-              <w:t xml:space="preserve">La configuración de compilación del frontend (vite.config.js) fija base: "/mia/" para producción: los ficheros JS/CSS generados referencian internamente rutas del tipo /mia/assets/.... Por eso, en IIS (sección 7.6) el contenido de dist\ debe quedar accesible también bajo el prefijo /mia/ además de en la raíz, o el navegador recibirá error 404 al cargar esos ficheros. Verifica esto en caliente la primera vez, antes de considerar cerrado el despliegue del frontend.</w:t>
+                <w:rFonts w:ascii="Consolas" w:cs="Consolas" w:eastAsia="Consolas" w:hAnsi="Consolas"/>
+                <w:color w:val="E8E8E8"/>
+                <w:sz w:val="19"/>
+                <w:szCs w:val="19"/>
+              </w:rPr>
+              <w:t xml:space="preserve">node --version</w:t>
+            </w:r>
+          </w:p>
+          <w:p>
+            <w:pPr>
+              <w:spacing w:after="0"/>
+            </w:pPr>
+            <w:r>
+              <w:rPr>
+                <w:rFonts w:ascii="Consolas" w:cs="Consolas" w:eastAsia="Consolas" w:hAnsi="Consolas"/>
+                <w:color w:val="E8E8E8"/>
+                <w:sz w:val="19"/>
+                <w:szCs w:val="19"/>
+              </w:rPr>
+              <w:t xml:space="preserve"># v24.22.0</w:t>
+            </w:r>
+          </w:p>
+          <w:p>
+            <w:pPr>
+              <w:spacing w:after="0"/>
+            </w:pPr>
+            <w:r>
+              <w:rPr>
+                <w:rFonts w:ascii="Consolas" w:cs="Consolas" w:eastAsia="Consolas" w:hAnsi="Consolas"/>
+                <w:color w:val="E8E8E8"/>
+                <w:sz w:val="19"/>
+                <w:szCs w:val="19"/>
+              </w:rPr>
+              <w:t xml:space="preserve">npm --version</w:t>
             </w:r>
           </w:p>
         </w:tc>
@@ -6343,22 +6490,9 @@
       </w:pPr>
       <w:bookmarkStart w:name="_Toc24" w:id="24"/>
       <w:r>
-        <w:t xml:space="preserve">Paso 2 — Publicar el contenido compilado</w:t>
+        <w:t xml:space="preserve">Paso 2 — Instalar dependencias y compilar</w:t>
       </w:r>
       <w:bookmarkEnd w:id="24"/>
-    </w:p>
-    <w:p>
-      <w:pPr>
-        <w:spacing w:after="160" w:line="276"/>
-      </w:pPr>
-      <w:r>
-        <w:rPr>
-          <w:rFonts w:ascii="Calibri" w:cs="Calibri" w:eastAsia="Calibri" w:hAnsi="Calibri"/>
-          <w:sz w:val="22"/>
-          <w:szCs w:val="22"/>
-        </w:rPr>
-        <w:t xml:space="preserve">Copia el contenido de frontend\dist\ a la carpeta que servirá IIS, por ejemplo:</w:t>
-      </w:r>
     </w:p>
     <w:tbl>
       <w:tblPr>
@@ -6397,7 +6531,35 @@
                 <w:sz w:val="19"/>
                 <w:szCs w:val="19"/>
               </w:rPr>
-              <w:t xml:space="preserve">C:\inetpub\mia-pre\</w:t>
+              <w:t xml:space="preserve">cd C:\apps\mia\current\frontend</w:t>
+            </w:r>
+          </w:p>
+          <w:p>
+            <w:pPr>
+              <w:spacing w:after="0"/>
+            </w:pPr>
+            <w:r>
+              <w:rPr>
+                <w:rFonts w:ascii="Consolas" w:cs="Consolas" w:eastAsia="Consolas" w:hAnsi="Consolas"/>
+                <w:color w:val="E8E8E8"/>
+                <w:sz w:val="19"/>
+                <w:szCs w:val="19"/>
+              </w:rPr>
+              <w:t xml:space="preserve">npm install</w:t>
+            </w:r>
+          </w:p>
+          <w:p>
+            <w:pPr>
+              <w:spacing w:after="0"/>
+            </w:pPr>
+            <w:r>
+              <w:rPr>
+                <w:rFonts w:ascii="Consolas" w:cs="Consolas" w:eastAsia="Consolas" w:hAnsi="Consolas"/>
+                <w:color w:val="E8E8E8"/>
+                <w:sz w:val="19"/>
+                <w:szCs w:val="19"/>
+              </w:rPr>
+              <w:t xml:space="preserve">npm run build</w:t>
             </w:r>
           </w:p>
         </w:tc>
@@ -6413,24 +6575,8 @@
           <w:sz w:val="22"/>
           <w:szCs w:val="22"/>
         </w:rPr>
-        <w:t xml:space="preserve">No es necesario ningún proceso ni servicio para el frontend: IIS lo sirve directamente desde disco como contenido estático (sección 7).</w:t>
-      </w:r>
-    </w:p>
-    <w:p>
-      <w:r>
-        <w:br w:type="page"/>
-      </w:r>
-    </w:p>
-    <w:p>
-      <w:pPr>
-        <w:pStyle w:val="Heading1"/>
-        <w:spacing w:after="200" w:before="400"/>
-      </w:pPr>
-      <w:bookmarkStart w:name="_Toc25" w:id="25"/>
-      <w:r>
-        <w:t xml:space="preserve">7. Configuración de IIS: sitio, binding y proxy inverso</w:t>
-      </w:r>
-      <w:bookmarkEnd w:id="25"/>
+        <w:t xml:space="preserve">Esto genera la carpeta frontend\dist\ con los tres mundos (portada, 2D, 3D y holograma) ya compilados.</w:t>
+      </w:r>
     </w:p>
     <w:tbl>
       <w:tblPr>
@@ -6477,7 +6623,7 @@
                 <w:sz w:val="22"/>
                 <w:szCs w:val="22"/>
               </w:rPr>
-              <w:t xml:space="preserve">No se toca el sitio de SharePoint 2013</w:t>
+              <w:t xml:space="preserve">Detalle importante: la ruta base /mia/</w:t>
             </w:r>
           </w:p>
           <w:p>
@@ -6491,7 +6637,7 @@
                 <w:sz w:val="21"/>
                 <w:szCs w:val="21"/>
               </w:rPr>
-              <w:t xml:space="preserve">Todos los pasos de esta sección crean un sitio IIS NUEVO con su propio Application Pool. En ningún momento se edita el sitio, el pool ni los bindings existentes de portal.sunsetbeachclub.local.</w:t>
+              <w:t xml:space="preserve">La configuración de compilación del frontend (vite.config.js) fija base: "/mia/" para producción: los ficheros JS/CSS generados referencian internamente rutas del tipo /mia/assets/.... Por eso, en IIS (sección 7.6) el contenido de dist\ debe quedar accesible también bajo el prefijo /mia/ además de en la raíz, o el navegador recibirá error 404 al cargar esos ficheros. Verifica esto en caliente la primera vez, antes de considerar cerrado el despliegue del frontend.</w:t>
             </w:r>
           </w:p>
         </w:tc>
@@ -6499,23 +6645,18 @@
     </w:tbl>
     <w:p>
       <w:pPr>
-        <w:pStyle w:val="Heading2"/>
-        <w:spacing w:after="150" w:before="300"/>
-      </w:pPr>
-      <w:bookmarkStart w:name="_Toc26" w:id="26"/>
-      <w:r>
-        <w:t xml:space="preserve">7.1 Crear el sitio IIS para mIA</w:t>
-      </w:r>
-      <w:bookmarkEnd w:id="26"/>
-    </w:p>
-    <w:p>
-      <w:pPr>
-        <w:pStyle w:val="ListParagraph"/>
-        <w:numPr>
-          <w:ilvl w:val="0"/>
-          <w:numId w:val="5"/>
-        </w:numPr>
-        <w:spacing w:after="140"/>
+        <w:pStyle w:val="Heading3"/>
+        <w:spacing w:after="100" w:before="200"/>
+      </w:pPr>
+      <w:bookmarkStart w:name="_Toc25" w:id="25"/>
+      <w:r>
+        <w:t xml:space="preserve">Paso 3 — Publicar el contenido compilado</w:t>
+      </w:r>
+      <w:bookmarkEnd w:id="25"/>
+    </w:p>
+    <w:p>
+      <w:pPr>
+        <w:spacing w:after="160" w:line="276"/>
       </w:pPr>
       <w:r>
         <w:rPr>
@@ -6523,127 +6664,8 @@
           <w:sz w:val="22"/>
           <w:szCs w:val="22"/>
         </w:rPr>
-        <w:t xml:space="preserve">Abre el Administrador de IIS (inetmgr).</w:t>
-      </w:r>
-    </w:p>
-    <w:p>
-      <w:pPr>
-        <w:pStyle w:val="ListParagraph"/>
-        <w:numPr>
-          <w:ilvl w:val="0"/>
-          <w:numId w:val="5"/>
-        </w:numPr>
-        <w:spacing w:after="140"/>
-      </w:pPr>
-      <w:r>
-        <w:rPr>
-          <w:rFonts w:ascii="Calibri" w:cs="Calibri" w:eastAsia="Calibri" w:hAnsi="Calibri"/>
-          <w:sz w:val="22"/>
-          <w:szCs w:val="22"/>
-        </w:rPr>
-        <w:t xml:space="preserve">Clic derecho en "Sitios" → "Agregar sitio web...".</w:t>
-      </w:r>
-    </w:p>
-    <w:p>
-      <w:pPr>
-        <w:pStyle w:val="ListParagraph"/>
-        <w:numPr>
-          <w:ilvl w:val="0"/>
-          <w:numId w:val="5"/>
-        </w:numPr>
-        <w:spacing w:after="140"/>
-      </w:pPr>
-      <w:r>
-        <w:rPr>
-          <w:rFonts w:ascii="Calibri" w:cs="Calibri" w:eastAsia="Calibri" w:hAnsi="Calibri"/>
-          <w:sz w:val="22"/>
-          <w:szCs w:val="22"/>
-        </w:rPr>
-        <w:t xml:space="preserve">Nombre del sitio: mia-pre</w:t>
-      </w:r>
-    </w:p>
-    <w:p>
-      <w:pPr>
-        <w:pStyle w:val="ListParagraph"/>
-        <w:numPr>
-          <w:ilvl w:val="0"/>
-          <w:numId w:val="5"/>
-        </w:numPr>
-        <w:spacing w:after="140"/>
-      </w:pPr>
-      <w:r>
-        <w:rPr>
-          <w:rFonts w:ascii="Calibri" w:cs="Calibri" w:eastAsia="Calibri" w:hAnsi="Calibri"/>
-          <w:sz w:val="22"/>
-          <w:szCs w:val="22"/>
-        </w:rPr>
-        <w:t xml:space="preserve">Grupo de aplicaciones: crear uno nuevo, por ejemplo "mia-pre-pool" (no reutilizar el pool de SharePoint).</w:t>
-      </w:r>
-    </w:p>
-    <w:p>
-      <w:pPr>
-        <w:pStyle w:val="ListParagraph"/>
-        <w:numPr>
-          <w:ilvl w:val="0"/>
-          <w:numId w:val="5"/>
-        </w:numPr>
-        <w:spacing w:after="140"/>
-      </w:pPr>
-      <w:r>
-        <w:rPr>
-          <w:rFonts w:ascii="Calibri" w:cs="Calibri" w:eastAsia="Calibri" w:hAnsi="Calibri"/>
-          <w:sz w:val="22"/>
-          <w:szCs w:val="22"/>
-        </w:rPr>
-        <w:t xml:space="preserve">Ruta física: C:\inetpub\mia-pre\ (la carpeta publicada en el paso 6.2).</w:t>
-      </w:r>
-    </w:p>
-    <w:p>
-      <w:pPr>
-        <w:pStyle w:val="ListParagraph"/>
-        <w:numPr>
-          <w:ilvl w:val="0"/>
-          <w:numId w:val="5"/>
-        </w:numPr>
-        <w:spacing w:after="140"/>
-      </w:pPr>
-      <w:r>
-        <w:rPr>
-          <w:rFonts w:ascii="Calibri" w:cs="Calibri" w:eastAsia="Calibri" w:hAnsi="Calibri"/>
-          <w:sz w:val="22"/>
-          <w:szCs w:val="22"/>
-        </w:rPr>
-        <w:t xml:space="preserve">Binding: tipo https, puerto 443, nombre de host mia-pre.sunsetbeachclub.local, con el certificado SSL del paso 7.2 (marcar "Require Server Name Indication").</w:t>
-      </w:r>
-    </w:p>
-    <w:p>
-      <w:pPr>
-        <w:pStyle w:val="ListParagraph"/>
-        <w:numPr>
-          <w:ilvl w:val="0"/>
-          <w:numId w:val="5"/>
-        </w:numPr>
-        <w:spacing w:after="140"/>
-      </w:pPr>
-      <w:r>
-        <w:rPr>
-          <w:rFonts w:ascii="Calibri" w:cs="Calibri" w:eastAsia="Calibri" w:hAnsi="Calibri"/>
-          <w:sz w:val="22"/>
-          <w:szCs w:val="22"/>
-        </w:rPr>
-        <w:t xml:space="preserve">Añade también un binding http (puerto 80, mismo host-header) para la redirección a https del paso 7.5.</w:t>
-      </w:r>
-    </w:p>
-    <w:p>
-      <w:pPr>
-        <w:pStyle w:val="Heading2"/>
-        <w:spacing w:after="150" w:before="300"/>
-      </w:pPr>
-      <w:bookmarkStart w:name="_Toc27" w:id="27"/>
-      <w:r>
-        <w:t xml:space="preserve">7.2 Certificado SSL</w:t>
-      </w:r>
-      <w:bookmarkEnd w:id="27"/>
+        <w:t xml:space="preserve">Copia el contenido de frontend\dist\ a la carpeta que servirá IIS, por ejemplo:</w:t>
+      </w:r>
     </w:p>
     <w:tbl>
       <w:tblPr>
@@ -6663,6 +6685,291 @@
       <w:tr>
         <w:tc>
           <w:tcPr>
+            <w:shd w:fill="2B2B2B" w:val="clear"/>
+            <w:tcMar>
+              <w:top w:type="dxa" w:w="140"/>
+              <w:left w:type="dxa" w:w="200"/>
+              <w:bottom w:type="dxa" w:w="140"/>
+              <w:right w:type="dxa" w:w="200"/>
+            </w:tcMar>
+          </w:tcPr>
+          <w:p>
+            <w:pPr>
+              <w:spacing w:after="0"/>
+            </w:pPr>
+            <w:r>
+              <w:rPr>
+                <w:rFonts w:ascii="Consolas" w:cs="Consolas" w:eastAsia="Consolas" w:hAnsi="Consolas"/>
+                <w:color w:val="E8E8E8"/>
+                <w:sz w:val="19"/>
+                <w:szCs w:val="19"/>
+              </w:rPr>
+              <w:t xml:space="preserve">C:\inetpub\mia-pre\</w:t>
+            </w:r>
+          </w:p>
+        </w:tc>
+      </w:tr>
+    </w:tbl>
+    <w:p>
+      <w:pPr>
+        <w:spacing w:after="160" w:line="276"/>
+      </w:pPr>
+      <w:r>
+        <w:rPr>
+          <w:rFonts w:ascii="Calibri" w:cs="Calibri" w:eastAsia="Calibri" w:hAnsi="Calibri"/>
+          <w:sz w:val="22"/>
+          <w:szCs w:val="22"/>
+        </w:rPr>
+        <w:t xml:space="preserve">No es necesario ningún proceso ni servicio para el frontend: IIS lo sirve directamente desde disco como contenido estático (sección 7).</w:t>
+      </w:r>
+    </w:p>
+    <w:p>
+      <w:r>
+        <w:br w:type="page"/>
+      </w:r>
+    </w:p>
+    <w:p>
+      <w:pPr>
+        <w:pStyle w:val="Heading1"/>
+        <w:spacing w:after="200" w:before="400"/>
+      </w:pPr>
+      <w:bookmarkStart w:name="_Toc26" w:id="26"/>
+      <w:r>
+        <w:t xml:space="preserve">7. Configuración de IIS: sitio, binding y proxy inverso</w:t>
+      </w:r>
+      <w:bookmarkEnd w:id="26"/>
+    </w:p>
+    <w:tbl>
+      <w:tblPr>
+        <w:tblW w:type="pct" w:w="5000"/>
+        <w:tblBorders>
+          <w:top w:val="single" w:color="auto" w:sz="4"/>
+          <w:left w:val="single" w:color="auto" w:sz="4"/>
+          <w:bottom w:val="single" w:color="auto" w:sz="4"/>
+          <w:right w:val="single" w:color="auto" w:sz="4"/>
+          <w:insideH w:val="single" w:color="auto" w:sz="4"/>
+          <w:insideV w:val="single" w:color="auto" w:sz="4"/>
+        </w:tblBorders>
+      </w:tblPr>
+      <w:tblGrid>
+        <w:gridCol w:w="9026"/>
+      </w:tblGrid>
+      <w:tr>
+        <w:tc>
+          <w:tcPr>
+            <w:tcBorders>
+              <w:top w:val="single" w:color="E59866" w:sz="12"/>
+              <w:left w:val="single" w:color="E59866" w:sz="12"/>
+              <w:bottom w:val="single" w:color="E59866" w:sz="12"/>
+              <w:right w:val="single" w:color="E59866" w:sz="12"/>
+            </w:tcBorders>
+            <w:shd w:fill="FDEBD0" w:val="clear"/>
+            <w:tcMar>
+              <w:top w:type="dxa" w:w="140"/>
+              <w:left w:type="dxa" w:w="220"/>
+              <w:bottom w:type="dxa" w:w="140"/>
+              <w:right w:type="dxa" w:w="220"/>
+            </w:tcMar>
+          </w:tcPr>
+          <w:p>
+            <w:pPr>
+              <w:spacing w:after="60"/>
+            </w:pPr>
+            <w:r>
+              <w:rPr>
+                <w:rFonts w:ascii="Calibri" w:cs="Calibri" w:eastAsia="Calibri" w:hAnsi="Calibri"/>
+                <w:b/>
+                <w:bCs/>
+                <w:color w:val="7D4F0A"/>
+                <w:sz w:val="22"/>
+                <w:szCs w:val="22"/>
+              </w:rPr>
+              <w:t xml:space="preserve">No se toca el sitio de SharePoint 2013</w:t>
+            </w:r>
+          </w:p>
+          <w:p>
+            <w:pPr>
+              <w:spacing w:after="0"/>
+            </w:pPr>
+            <w:r>
+              <w:rPr>
+                <w:rFonts w:ascii="Calibri" w:cs="Calibri" w:eastAsia="Calibri" w:hAnsi="Calibri"/>
+                <w:color w:val="5A3A08"/>
+                <w:sz w:val="21"/>
+                <w:szCs w:val="21"/>
+              </w:rPr>
+              <w:t xml:space="preserve">Todos los pasos de esta sección crean un sitio IIS NUEVO con su propio Application Pool. En ningún momento se edita el sitio, el pool ni los bindings existentes de portal.sunsetbeachclub.local.</w:t>
+            </w:r>
+          </w:p>
+        </w:tc>
+      </w:tr>
+    </w:tbl>
+    <w:p>
+      <w:pPr>
+        <w:pStyle w:val="Heading2"/>
+        <w:spacing w:after="150" w:before="300"/>
+      </w:pPr>
+      <w:bookmarkStart w:name="_Toc27" w:id="27"/>
+      <w:r>
+        <w:t xml:space="preserve">7.1 Crear el sitio IIS para mIA</w:t>
+      </w:r>
+      <w:bookmarkEnd w:id="27"/>
+    </w:p>
+    <w:p>
+      <w:pPr>
+        <w:pStyle w:val="ListParagraph"/>
+        <w:numPr>
+          <w:ilvl w:val="0"/>
+          <w:numId w:val="5"/>
+        </w:numPr>
+        <w:spacing w:after="140"/>
+      </w:pPr>
+      <w:r>
+        <w:rPr>
+          <w:rFonts w:ascii="Calibri" w:cs="Calibri" w:eastAsia="Calibri" w:hAnsi="Calibri"/>
+          <w:sz w:val="22"/>
+          <w:szCs w:val="22"/>
+        </w:rPr>
+        <w:t xml:space="preserve">Abre el Administrador de IIS (inetmgr).</w:t>
+      </w:r>
+    </w:p>
+    <w:p>
+      <w:pPr>
+        <w:pStyle w:val="ListParagraph"/>
+        <w:numPr>
+          <w:ilvl w:val="0"/>
+          <w:numId w:val="5"/>
+        </w:numPr>
+        <w:spacing w:after="140"/>
+      </w:pPr>
+      <w:r>
+        <w:rPr>
+          <w:rFonts w:ascii="Calibri" w:cs="Calibri" w:eastAsia="Calibri" w:hAnsi="Calibri"/>
+          <w:sz w:val="22"/>
+          <w:szCs w:val="22"/>
+        </w:rPr>
+        <w:t xml:space="preserve">Clic derecho en "Sitios" → "Agregar sitio web...".</w:t>
+      </w:r>
+    </w:p>
+    <w:p>
+      <w:pPr>
+        <w:pStyle w:val="ListParagraph"/>
+        <w:numPr>
+          <w:ilvl w:val="0"/>
+          <w:numId w:val="5"/>
+        </w:numPr>
+        <w:spacing w:after="140"/>
+      </w:pPr>
+      <w:r>
+        <w:rPr>
+          <w:rFonts w:ascii="Calibri" w:cs="Calibri" w:eastAsia="Calibri" w:hAnsi="Calibri"/>
+          <w:sz w:val="22"/>
+          <w:szCs w:val="22"/>
+        </w:rPr>
+        <w:t xml:space="preserve">Nombre del sitio: mia-pre</w:t>
+      </w:r>
+    </w:p>
+    <w:p>
+      <w:pPr>
+        <w:pStyle w:val="ListParagraph"/>
+        <w:numPr>
+          <w:ilvl w:val="0"/>
+          <w:numId w:val="5"/>
+        </w:numPr>
+        <w:spacing w:after="140"/>
+      </w:pPr>
+      <w:r>
+        <w:rPr>
+          <w:rFonts w:ascii="Calibri" w:cs="Calibri" w:eastAsia="Calibri" w:hAnsi="Calibri"/>
+          <w:sz w:val="22"/>
+          <w:szCs w:val="22"/>
+        </w:rPr>
+        <w:t xml:space="preserve">Grupo de aplicaciones: crear uno nuevo, por ejemplo "mia-pre-pool" (no reutilizar el pool de SharePoint).</w:t>
+      </w:r>
+    </w:p>
+    <w:p>
+      <w:pPr>
+        <w:pStyle w:val="ListParagraph"/>
+        <w:numPr>
+          <w:ilvl w:val="0"/>
+          <w:numId w:val="5"/>
+        </w:numPr>
+        <w:spacing w:after="140"/>
+      </w:pPr>
+      <w:r>
+        <w:rPr>
+          <w:rFonts w:ascii="Calibri" w:cs="Calibri" w:eastAsia="Calibri" w:hAnsi="Calibri"/>
+          <w:sz w:val="22"/>
+          <w:szCs w:val="22"/>
+        </w:rPr>
+        <w:t xml:space="preserve">Ruta física: C:\inetpub\mia-pre\ (la carpeta publicada en el paso 6.2).</w:t>
+      </w:r>
+    </w:p>
+    <w:p>
+      <w:pPr>
+        <w:pStyle w:val="ListParagraph"/>
+        <w:numPr>
+          <w:ilvl w:val="0"/>
+          <w:numId w:val="5"/>
+        </w:numPr>
+        <w:spacing w:after="140"/>
+      </w:pPr>
+      <w:r>
+        <w:rPr>
+          <w:rFonts w:ascii="Calibri" w:cs="Calibri" w:eastAsia="Calibri" w:hAnsi="Calibri"/>
+          <w:sz w:val="22"/>
+          <w:szCs w:val="22"/>
+        </w:rPr>
+        <w:t xml:space="preserve">Binding: tipo https, puerto 443, nombre de host mia-pre.sunsetbeachclub.local, con el certificado SSL del paso 7.2 (marcar "Require Server Name Indication").</w:t>
+      </w:r>
+    </w:p>
+    <w:p>
+      <w:pPr>
+        <w:pStyle w:val="ListParagraph"/>
+        <w:numPr>
+          <w:ilvl w:val="0"/>
+          <w:numId w:val="5"/>
+        </w:numPr>
+        <w:spacing w:after="140"/>
+      </w:pPr>
+      <w:r>
+        <w:rPr>
+          <w:rFonts w:ascii="Calibri" w:cs="Calibri" w:eastAsia="Calibri" w:hAnsi="Calibri"/>
+          <w:sz w:val="22"/>
+          <w:szCs w:val="22"/>
+        </w:rPr>
+        <w:t xml:space="preserve">Añade también un binding http (puerto 80, mismo host-header) para la redirección a https del paso 7.5.</w:t>
+      </w:r>
+    </w:p>
+    <w:p>
+      <w:pPr>
+        <w:pStyle w:val="Heading2"/>
+        <w:spacing w:after="150" w:before="300"/>
+      </w:pPr>
+      <w:bookmarkStart w:name="_Toc28" w:id="28"/>
+      <w:r>
+        <w:t xml:space="preserve">7.2 Certificado SSL</w:t>
+      </w:r>
+      <w:bookmarkEnd w:id="28"/>
+    </w:p>
+    <w:tbl>
+      <w:tblPr>
+        <w:tblW w:type="pct" w:w="5000"/>
+        <w:tblBorders>
+          <w:top w:val="single" w:color="auto" w:sz="4"/>
+          <w:left w:val="single" w:color="auto" w:sz="4"/>
+          <w:bottom w:val="single" w:color="auto" w:sz="4"/>
+          <w:right w:val="single" w:color="auto" w:sz="4"/>
+          <w:insideH w:val="single" w:color="auto" w:sz="4"/>
+          <w:insideV w:val="single" w:color="auto" w:sz="4"/>
+        </w:tblBorders>
+      </w:tblPr>
+      <w:tblGrid>
+        <w:gridCol w:w="9026"/>
+      </w:tblGrid>
+      <w:tr>
+        <w:tc>
+          <w:tcPr>
             <w:tcBorders>
               <w:top w:val="single" w:color="E59866" w:sz="12"/>
               <w:left w:val="single" w:color="E59866" w:sz="12"/>
@@ -6728,11 +7035,11 @@
         <w:pStyle w:val="Heading2"/>
         <w:spacing w:after="150" w:before="300"/>
       </w:pPr>
-      <w:bookmarkStart w:name="_Toc28" w:id="28"/>
+      <w:bookmarkStart w:name="_Toc29" w:id="29"/>
       <w:r>
         <w:t xml:space="preserve">7.3 Instalar los módulos ARR y URL Rewrite</w:t>
       </w:r>
-      <w:bookmarkEnd w:id="28"/>
+      <w:bookmarkEnd w:id="29"/>
     </w:p>
     <w:p>
       <w:pPr>
@@ -6971,7 +7278,7 @@
           <w:sz w:val="22"/>
           <w:szCs w:val="22"/>
         </w:rPr>
-        <w:t xml:space="preserve">Verifica la integridad del instalador antes de ejecutarlo en el servidor, comparando su hash SHA1 contra el valor publicado:</w:t>
+        <w:t xml:space="preserve">Verifica la integridad de cada instalador antes de ejecutarlo en el servidor, comparando su hash SHA1 contra el valor publicado por Microsoft:</w:t>
       </w:r>
     </w:p>
     <w:tbl>
@@ -7061,6 +7368,189 @@
     </w:tbl>
     <w:p>
       <w:pPr>
+        <w:pStyle w:val="ListParagraph"/>
+        <w:numPr>
+          <w:ilvl w:val="0"/>
+          <w:numId w:val="5"/>
+        </w:numPr>
+        <w:spacing w:after="140"/>
+      </w:pPr>
+      <w:r>
+        <w:rPr>
+          <w:rFonts w:ascii="Calibri" w:cs="Calibri" w:eastAsia="Calibri" w:hAnsi="Calibri"/>
+          <w:sz w:val="22"/>
+          <w:szCs w:val="22"/>
+        </w:rPr>
+        <w:t xml:space="preserve">Instala URL Rewrite (asistente, o en modo silencioso como administrador):</w:t>
+      </w:r>
+    </w:p>
+    <w:tbl>
+      <w:tblPr>
+        <w:tblW w:type="pct" w:w="5000"/>
+        <w:tblBorders>
+          <w:top w:val="single" w:color="auto" w:sz="4"/>
+          <w:left w:val="single" w:color="auto" w:sz="4"/>
+          <w:bottom w:val="single" w:color="auto" w:sz="4"/>
+          <w:right w:val="single" w:color="auto" w:sz="4"/>
+          <w:insideH w:val="single" w:color="auto" w:sz="4"/>
+          <w:insideV w:val="single" w:color="auto" w:sz="4"/>
+        </w:tblBorders>
+      </w:tblPr>
+      <w:tblGrid>
+        <w:gridCol w:w="9026"/>
+      </w:tblGrid>
+      <w:tr>
+        <w:tc>
+          <w:tcPr>
+            <w:shd w:fill="2B2B2B" w:val="clear"/>
+            <w:tcMar>
+              <w:top w:type="dxa" w:w="140"/>
+              <w:left w:type="dxa" w:w="200"/>
+              <w:bottom w:type="dxa" w:w="140"/>
+              <w:right w:type="dxa" w:w="200"/>
+            </w:tcMar>
+          </w:tcPr>
+          <w:p>
+            <w:pPr>
+              <w:spacing w:after="0"/>
+            </w:pPr>
+            <w:r>
+              <w:rPr>
+                <w:rFonts w:ascii="Consolas" w:cs="Consolas" w:eastAsia="Consolas" w:hAnsi="Consolas"/>
+                <w:color w:val="E8E8E8"/>
+                <w:sz w:val="19"/>
+                <w:szCs w:val="19"/>
+              </w:rPr>
+              <w:t xml:space="preserve">msiexec /i rewrite_amd64_en-US.msi /quiet /norestart</w:t>
+            </w:r>
+          </w:p>
+        </w:tc>
+      </w:tr>
+    </w:tbl>
+    <w:p>
+      <w:pPr>
+        <w:pStyle w:val="ListParagraph"/>
+        <w:numPr>
+          <w:ilvl w:val="0"/>
+          <w:numId w:val="5"/>
+        </w:numPr>
+        <w:spacing w:after="140"/>
+      </w:pPr>
+      <w:r>
+        <w:rPr>
+          <w:rFonts w:ascii="Calibri" w:cs="Calibri" w:eastAsia="Calibri" w:hAnsi="Calibri"/>
+          <w:sz w:val="22"/>
+          <w:szCs w:val="22"/>
+        </w:rPr>
+        <w:t xml:space="preserve">Instala ARR (asistente, o en modo silencioso como administrador):</w:t>
+      </w:r>
+    </w:p>
+    <w:tbl>
+      <w:tblPr>
+        <w:tblW w:type="pct" w:w="5000"/>
+        <w:tblBorders>
+          <w:top w:val="single" w:color="auto" w:sz="4"/>
+          <w:left w:val="single" w:color="auto" w:sz="4"/>
+          <w:bottom w:val="single" w:color="auto" w:sz="4"/>
+          <w:right w:val="single" w:color="auto" w:sz="4"/>
+          <w:insideH w:val="single" w:color="auto" w:sz="4"/>
+          <w:insideV w:val="single" w:color="auto" w:sz="4"/>
+        </w:tblBorders>
+      </w:tblPr>
+      <w:tblGrid>
+        <w:gridCol w:w="9026"/>
+      </w:tblGrid>
+      <w:tr>
+        <w:tc>
+          <w:tcPr>
+            <w:shd w:fill="2B2B2B" w:val="clear"/>
+            <w:tcMar>
+              <w:top w:type="dxa" w:w="140"/>
+              <w:left w:type="dxa" w:w="200"/>
+              <w:bottom w:type="dxa" w:w="140"/>
+              <w:right w:type="dxa" w:w="200"/>
+            </w:tcMar>
+          </w:tcPr>
+          <w:p>
+            <w:pPr>
+              <w:spacing w:after="0"/>
+            </w:pPr>
+            <w:r>
+              <w:rPr>
+                <w:rFonts w:ascii="Consolas" w:cs="Consolas" w:eastAsia="Consolas" w:hAnsi="Consolas"/>
+                <w:color w:val="E8E8E8"/>
+                <w:sz w:val="19"/>
+                <w:szCs w:val="19"/>
+              </w:rPr>
+              <w:t xml:space="preserve">msiexec /i requestRouter_amd64.msi /quiet /norestart</w:t>
+            </w:r>
+          </w:p>
+        </w:tc>
+      </w:tr>
+    </w:tbl>
+    <w:p>
+      <w:pPr>
+        <w:pStyle w:val="ListParagraph"/>
+        <w:numPr>
+          <w:ilvl w:val="0"/>
+          <w:numId w:val="5"/>
+        </w:numPr>
+        <w:spacing w:after="140"/>
+      </w:pPr>
+      <w:r>
+        <w:rPr>
+          <w:rFonts w:ascii="Calibri" w:cs="Calibri" w:eastAsia="Calibri" w:hAnsi="Calibri"/>
+          <w:sz w:val="22"/>
+          <w:szCs w:val="22"/>
+        </w:rPr>
+        <w:t xml:space="preserve">Reinicia IIS para que ambos módulos queden cargados:</w:t>
+      </w:r>
+    </w:p>
+    <w:tbl>
+      <w:tblPr>
+        <w:tblW w:type="pct" w:w="5000"/>
+        <w:tblBorders>
+          <w:top w:val="single" w:color="auto" w:sz="4"/>
+          <w:left w:val="single" w:color="auto" w:sz="4"/>
+          <w:bottom w:val="single" w:color="auto" w:sz="4"/>
+          <w:right w:val="single" w:color="auto" w:sz="4"/>
+          <w:insideH w:val="single" w:color="auto" w:sz="4"/>
+          <w:insideV w:val="single" w:color="auto" w:sz="4"/>
+        </w:tblBorders>
+      </w:tblPr>
+      <w:tblGrid>
+        <w:gridCol w:w="9026"/>
+      </w:tblGrid>
+      <w:tr>
+        <w:tc>
+          <w:tcPr>
+            <w:shd w:fill="2B2B2B" w:val="clear"/>
+            <w:tcMar>
+              <w:top w:type="dxa" w:w="140"/>
+              <w:left w:type="dxa" w:w="200"/>
+              <w:bottom w:type="dxa" w:w="140"/>
+              <w:right w:type="dxa" w:w="200"/>
+            </w:tcMar>
+          </w:tcPr>
+          <w:p>
+            <w:pPr>
+              <w:spacing w:after="0"/>
+            </w:pPr>
+            <w:r>
+              <w:rPr>
+                <w:rFonts w:ascii="Consolas" w:cs="Consolas" w:eastAsia="Consolas" w:hAnsi="Consolas"/>
+                <w:color w:val="E8E8E8"/>
+                <w:sz w:val="19"/>
+                <w:szCs w:val="19"/>
+              </w:rPr>
+              <w:t xml:space="preserve">iisreset</w:t>
+            </w:r>
+          </w:p>
+        </w:tc>
+      </w:tr>
+    </w:tbl>
+    <w:p>
+      <w:pPr>
         <w:spacing w:after="160" w:line="276"/>
       </w:pPr>
       <w:r>
@@ -7077,11 +7567,11 @@
         <w:pStyle w:val="Heading2"/>
         <w:spacing w:after="150" w:before="300"/>
       </w:pPr>
-      <w:bookmarkStart w:name="_Toc29" w:id="29"/>
+      <w:bookmarkStart w:name="_Toc30" w:id="30"/>
       <w:r>
         <w:t xml:space="preserve">7.4 Regla de proxy inverso hacia el backend</w:t>
       </w:r>
-      <w:bookmarkEnd w:id="29"/>
+      <w:bookmarkEnd w:id="30"/>
     </w:p>
     <w:p>
       <w:pPr>
@@ -7476,11 +7966,11 @@
         <w:pStyle w:val="Heading2"/>
         <w:spacing w:after="150" w:before="300"/>
       </w:pPr>
-      <w:bookmarkStart w:name="_Toc30" w:id="30"/>
+      <w:bookmarkStart w:name="_Toc31" w:id="31"/>
       <w:r>
         <w:t xml:space="preserve">7.5 Redirección HTTP → HTTPS</w:t>
       </w:r>
-      <w:bookmarkEnd w:id="30"/>
+      <w:bookmarkEnd w:id="31"/>
     </w:p>
     <w:p>
       <w:pPr>
@@ -7500,11 +7990,11 @@
         <w:pStyle w:val="Heading2"/>
         <w:spacing w:after="150" w:before="300"/>
       </w:pPr>
-      <w:bookmarkStart w:name="_Toc31" w:id="31"/>
+      <w:bookmarkStart w:name="_Toc32" w:id="32"/>
       <w:r>
         <w:t xml:space="preserve">7.6 Publicación del frontend y la ruta /mia/</w:t>
       </w:r>
-      <w:bookmarkEnd w:id="31"/>
+      <w:bookmarkEnd w:id="32"/>
     </w:p>
     <w:p>
       <w:pPr>
@@ -7915,11 +8405,11 @@
         <w:pStyle w:val="Heading2"/>
         <w:spacing w:after="150" w:before="300"/>
       </w:pPr>
-      <w:bookmarkStart w:name="_Toc32" w:id="32"/>
+      <w:bookmarkStart w:name="_Toc33" w:id="33"/>
       <w:r>
         <w:t xml:space="preserve">7.7 Firewall de Windows en el propio servidor</w:t>
       </w:r>
-      <w:bookmarkEnd w:id="32"/>
+      <w:bookmarkEnd w:id="33"/>
     </w:p>
     <w:p>
       <w:pPr>
@@ -7980,11 +8470,11 @@
         <w:pStyle w:val="Heading1"/>
         <w:spacing w:after="200" w:before="400"/>
       </w:pPr>
-      <w:bookmarkStart w:name="_Toc33" w:id="33"/>
+      <w:bookmarkStart w:name="_Toc34" w:id="34"/>
       <w:r>
         <w:t xml:space="preserve">8. DNS</w:t>
       </w:r>
-      <w:bookmarkEnd w:id="33"/>
+      <w:bookmarkEnd w:id="34"/>
     </w:p>
     <w:p>
       <w:pPr>
@@ -8274,11 +8764,11 @@
         <w:pStyle w:val="Heading1"/>
         <w:spacing w:after="200" w:before="400"/>
       </w:pPr>
-      <w:bookmarkStart w:name="_Toc34" w:id="34"/>
+      <w:bookmarkStart w:name="_Toc35" w:id="35"/>
       <w:r>
         <w:t xml:space="preserve">9. Validación y pruebas de aceptación</w:t>
       </w:r>
-      <w:bookmarkEnd w:id="34"/>
+      <w:bookmarkEnd w:id="35"/>
     </w:p>
     <w:p>
       <w:pPr>
@@ -8465,11 +8955,11 @@
         <w:pStyle w:val="Heading1"/>
         <w:spacing w:after="200" w:before="400"/>
       </w:pPr>
-      <w:bookmarkStart w:name="_Toc35" w:id="35"/>
+      <w:bookmarkStart w:name="_Toc36" w:id="36"/>
       <w:r>
         <w:t xml:space="preserve">Anexo A — Variables de entorno (.env) de referencia</w:t>
       </w:r>
-      <w:bookmarkEnd w:id="35"/>
+      <w:bookmarkEnd w:id="36"/>
     </w:p>
     <w:p>
       <w:pPr>
@@ -9748,22 +10238,22 @@
         <w:pStyle w:val="Heading1"/>
         <w:spacing w:after="200" w:before="400"/>
       </w:pPr>
-      <w:bookmarkStart w:name="_Toc36" w:id="36"/>
+      <w:bookmarkStart w:name="_Toc37" w:id="37"/>
       <w:r>
         <w:t xml:space="preserve">Anexo B — Comandos de referencia rápida</w:t>
       </w:r>
-      <w:bookmarkEnd w:id="36"/>
+      <w:bookmarkEnd w:id="37"/>
     </w:p>
     <w:p>
       <w:pPr>
         <w:pStyle w:val="Heading3"/>
         <w:spacing w:after="100" w:before="200"/>
       </w:pPr>
-      <w:bookmarkStart w:name="_Toc37" w:id="37"/>
+      <w:bookmarkStart w:name="_Toc38" w:id="38"/>
       <w:r>
         <w:t xml:space="preserve">Backend</w:t>
       </w:r>
-      <w:bookmarkEnd w:id="37"/>
+      <w:bookmarkEnd w:id="38"/>
     </w:p>
     <w:tbl>
       <w:tblPr>
@@ -9855,11 +10345,11 @@
         <w:pStyle w:val="Heading3"/>
         <w:spacing w:after="100" w:before="200"/>
       </w:pPr>
-      <w:bookmarkStart w:name="_Toc38" w:id="38"/>
+      <w:bookmarkStart w:name="_Toc39" w:id="39"/>
       <w:r>
         <w:t xml:space="preserve">Base de datos</w:t>
       </w:r>
-      <w:bookmarkEnd w:id="38"/>
+      <w:bookmarkEnd w:id="39"/>
     </w:p>
     <w:tbl>
       <w:tblPr>
@@ -9951,11 +10441,11 @@
         <w:pStyle w:val="Heading3"/>
         <w:spacing w:after="100" w:before="200"/>
       </w:pPr>
-      <w:bookmarkStart w:name="_Toc39" w:id="39"/>
+      <w:bookmarkStart w:name="_Toc40" w:id="40"/>
       <w:r>
         <w:t xml:space="preserve">Sincronización SharePoint</w:t>
       </w:r>
-      <w:bookmarkEnd w:id="39"/>
+      <w:bookmarkEnd w:id="40"/>
     </w:p>
     <w:tbl>
       <w:tblPr>
@@ -10033,11 +10523,11 @@
         <w:pStyle w:val="Heading3"/>
         <w:spacing w:after="100" w:before="200"/>
       </w:pPr>
-      <w:bookmarkStart w:name="_Toc40" w:id="40"/>
+      <w:bookmarkStart w:name="_Toc41" w:id="41"/>
       <w:r>
         <w:t xml:space="preserve">Frontend</w:t>
       </w:r>
-      <w:bookmarkEnd w:id="40"/>
+      <w:bookmarkEnd w:id="41"/>
     </w:p>
     <w:tbl>
       <w:tblPr>
@@ -10111,15 +10601,1217 @@
       </w:tr>
     </w:tbl>
     <w:p>
+      <w:r>
+        <w:br w:type="page"/>
+      </w:r>
+    </w:p>
+    <w:p>
       <w:pPr>
         <w:pStyle w:val="Heading1"/>
         <w:spacing w:after="200" w:before="400"/>
       </w:pPr>
-      <w:bookmarkStart w:name="_Toc41" w:id="41"/>
+      <w:bookmarkStart w:name="_Toc42" w:id="42"/>
+      <w:r>
+        <w:t xml:space="preserve">Anexo C — Ficheros de instalación (versión y verificación)</w:t>
+      </w:r>
+      <w:bookmarkEnd w:id="42"/>
+    </w:p>
+    <w:p>
+      <w:pPr>
+        <w:spacing w:after="160" w:line="276"/>
+      </w:pPr>
+      <w:r>
+        <w:rPr>
+          <w:rFonts w:ascii="Calibri" w:cs="Calibri" w:eastAsia="Calibri" w:hAnsi="Calibri"/>
+          <w:sz w:val="22"/>
+          <w:szCs w:val="22"/>
+        </w:rPr>
+        <w:t xml:space="preserve">Versión exacta de cada instalador usado al redactar esta guía, con su fuente oficial y, cuando Microsoft lo publica, el hash para verificar la descarga antes de ejecutarla en el servidor. Si en el momento de instalar ya hay una versión más reciente, se puede usar esa en su lugar — lo importante es no instalar nada de una fuente distinta de la indicada.</w:t>
+      </w:r>
+    </w:p>
+    <w:tbl>
+      <w:tblPr>
+        <w:tblW w:type="dxa" w:w="9026"/>
+        <w:tblBorders>
+          <w:top w:val="single" w:color="auto" w:sz="4"/>
+          <w:left w:val="single" w:color="auto" w:sz="4"/>
+          <w:bottom w:val="single" w:color="auto" w:sz="4"/>
+          <w:right w:val="single" w:color="auto" w:sz="4"/>
+          <w:insideH w:val="single" w:color="auto" w:sz="4"/>
+          <w:insideV w:val="single" w:color="auto" w:sz="4"/>
+        </w:tblBorders>
+      </w:tblPr>
+      <w:tblGrid>
+        <w:gridCol w:w="2000"/>
+        <w:gridCol w:w="1900"/>
+        <w:gridCol w:w="2500"/>
+        <w:gridCol w:w="2626"/>
+      </w:tblGrid>
+      <w:tr>
+        <w:trPr>
+          <w:tblHeader/>
+        </w:trPr>
+        <w:tc>
+          <w:tcPr>
+            <w:tcW w:type="dxa" w:w="2000"/>
+            <w:tcBorders>
+              <w:top w:val="single" w:color="B7C6E6" w:sz="4"/>
+              <w:left w:val="single" w:color="B7C6E6" w:sz="4"/>
+              <w:bottom w:val="single" w:color="B7C6E6" w:sz="4"/>
+              <w:right w:val="single" w:color="B7C6E6" w:sz="4"/>
+            </w:tcBorders>
+            <w:shd w:fill="1F3864" w:val="clear"/>
+            <w:tcMar>
+              <w:top w:type="dxa" w:w="100"/>
+              <w:left w:type="dxa" w:w="140"/>
+              <w:bottom w:type="dxa" w:w="100"/>
+              <w:right w:type="dxa" w:w="140"/>
+            </w:tcMar>
+            <w:vAlign w:val="center"/>
+          </w:tcPr>
+          <w:p>
+            <w:r>
+              <w:rPr>
+                <w:rFonts w:ascii="Calibri" w:cs="Calibri" w:eastAsia="Calibri" w:hAnsi="Calibri"/>
+                <w:b/>
+                <w:bCs/>
+                <w:color w:val="FFFFFF"/>
+                <w:sz w:val="20"/>
+                <w:szCs w:val="20"/>
+              </w:rPr>
+              <w:t xml:space="preserve">Fichero</w:t>
+            </w:r>
+          </w:p>
+        </w:tc>
+        <w:tc>
+          <w:tcPr>
+            <w:tcW w:type="dxa" w:w="1900"/>
+            <w:tcBorders>
+              <w:top w:val="single" w:color="B7C6E6" w:sz="4"/>
+              <w:left w:val="single" w:color="B7C6E6" w:sz="4"/>
+              <w:bottom w:val="single" w:color="B7C6E6" w:sz="4"/>
+              <w:right w:val="single" w:color="B7C6E6" w:sz="4"/>
+            </w:tcBorders>
+            <w:shd w:fill="1F3864" w:val="clear"/>
+            <w:tcMar>
+              <w:top w:type="dxa" w:w="100"/>
+              <w:left w:type="dxa" w:w="140"/>
+              <w:bottom w:type="dxa" w:w="100"/>
+              <w:right w:type="dxa" w:w="140"/>
+            </w:tcMar>
+            <w:vAlign w:val="center"/>
+          </w:tcPr>
+          <w:p>
+            <w:r>
+              <w:rPr>
+                <w:rFonts w:ascii="Calibri" w:cs="Calibri" w:eastAsia="Calibri" w:hAnsi="Calibri"/>
+                <w:b/>
+                <w:bCs/>
+                <w:color w:val="FFFFFF"/>
+                <w:sz w:val="20"/>
+                <w:szCs w:val="20"/>
+              </w:rPr>
+              <w:t xml:space="preserve">Versión</w:t>
+            </w:r>
+          </w:p>
+        </w:tc>
+        <w:tc>
+          <w:tcPr>
+            <w:tcW w:type="dxa" w:w="2500"/>
+            <w:tcBorders>
+              <w:top w:val="single" w:color="B7C6E6" w:sz="4"/>
+              <w:left w:val="single" w:color="B7C6E6" w:sz="4"/>
+              <w:bottom w:val="single" w:color="B7C6E6" w:sz="4"/>
+              <w:right w:val="single" w:color="B7C6E6" w:sz="4"/>
+            </w:tcBorders>
+            <w:shd w:fill="1F3864" w:val="clear"/>
+            <w:tcMar>
+              <w:top w:type="dxa" w:w="100"/>
+              <w:left w:type="dxa" w:w="140"/>
+              <w:bottom w:type="dxa" w:w="100"/>
+              <w:right w:type="dxa" w:w="140"/>
+            </w:tcMar>
+            <w:vAlign w:val="center"/>
+          </w:tcPr>
+          <w:p>
+            <w:r>
+              <w:rPr>
+                <w:rFonts w:ascii="Calibri" w:cs="Calibri" w:eastAsia="Calibri" w:hAnsi="Calibri"/>
+                <w:b/>
+                <w:bCs/>
+                <w:color w:val="FFFFFF"/>
+                <w:sz w:val="20"/>
+                <w:szCs w:val="20"/>
+              </w:rPr>
+              <w:t xml:space="preserve">Fuente oficial</w:t>
+            </w:r>
+          </w:p>
+        </w:tc>
+        <w:tc>
+          <w:tcPr>
+            <w:tcW w:type="dxa" w:w="2626"/>
+            <w:tcBorders>
+              <w:top w:val="single" w:color="B7C6E6" w:sz="4"/>
+              <w:left w:val="single" w:color="B7C6E6" w:sz="4"/>
+              <w:bottom w:val="single" w:color="B7C6E6" w:sz="4"/>
+              <w:right w:val="single" w:color="B7C6E6" w:sz="4"/>
+            </w:tcBorders>
+            <w:shd w:fill="1F3864" w:val="clear"/>
+            <w:tcMar>
+              <w:top w:type="dxa" w:w="100"/>
+              <w:left w:type="dxa" w:w="140"/>
+              <w:bottom w:type="dxa" w:w="100"/>
+              <w:right w:type="dxa" w:w="140"/>
+            </w:tcMar>
+            <w:vAlign w:val="center"/>
+          </w:tcPr>
+          <w:p>
+            <w:r>
+              <w:rPr>
+                <w:rFonts w:ascii="Calibri" w:cs="Calibri" w:eastAsia="Calibri" w:hAnsi="Calibri"/>
+                <w:b/>
+                <w:bCs/>
+                <w:color w:val="FFFFFF"/>
+                <w:sz w:val="20"/>
+                <w:szCs w:val="20"/>
+              </w:rPr>
+              <w:t xml:space="preserve">SHA1 / SHA256</w:t>
+            </w:r>
+          </w:p>
+        </w:tc>
+      </w:tr>
+      <w:tr>
+        <w:tc>
+          <w:tcPr>
+            <w:tcW w:type="dxa" w:w="2000"/>
+            <w:tcBorders>
+              <w:top w:val="single" w:color="B7C6E6" w:sz="4"/>
+              <w:left w:val="single" w:color="B7C6E6" w:sz="4"/>
+              <w:bottom w:val="single" w:color="B7C6E6" w:sz="4"/>
+              <w:right w:val="single" w:color="B7C6E6" w:sz="4"/>
+            </w:tcBorders>
+            <w:shd w:fill="FFFFFF" w:val="clear"/>
+            <w:tcMar>
+              <w:top w:type="dxa" w:w="90"/>
+              <w:left w:type="dxa" w:w="140"/>
+              <w:bottom w:type="dxa" w:w="90"/>
+              <w:right w:type="dxa" w:w="140"/>
+            </w:tcMar>
+            <w:vAlign w:val="center"/>
+          </w:tcPr>
+          <w:p>
+            <w:r>
+              <w:rPr>
+                <w:rFonts w:ascii="Calibri" w:cs="Calibri" w:eastAsia="Calibri" w:hAnsi="Calibri"/>
+                <w:b w:val="false"/>
+                <w:bCs w:val="false"/>
+                <w:sz w:val="20"/>
+                <w:szCs w:val="20"/>
+              </w:rPr>
+              <w:t xml:space="preserve">python-3.1x-amd64.exe</w:t>
+            </w:r>
+          </w:p>
+        </w:tc>
+        <w:tc>
+          <w:tcPr>
+            <w:tcW w:type="dxa" w:w="1900"/>
+            <w:tcBorders>
+              <w:top w:val="single" w:color="B7C6E6" w:sz="4"/>
+              <w:left w:val="single" w:color="B7C6E6" w:sz="4"/>
+              <w:bottom w:val="single" w:color="B7C6E6" w:sz="4"/>
+              <w:right w:val="single" w:color="B7C6E6" w:sz="4"/>
+            </w:tcBorders>
+            <w:shd w:fill="FFFFFF" w:val="clear"/>
+            <w:tcMar>
+              <w:top w:type="dxa" w:w="90"/>
+              <w:left w:type="dxa" w:w="140"/>
+              <w:bottom w:type="dxa" w:w="90"/>
+              <w:right w:type="dxa" w:w="140"/>
+            </w:tcMar>
+            <w:vAlign w:val="center"/>
+          </w:tcPr>
+          <w:p>
+            <w:r>
+              <w:rPr>
+                <w:rFonts w:ascii="Calibri" w:cs="Calibri" w:eastAsia="Calibri" w:hAnsi="Calibri"/>
+                <w:b w:val="false"/>
+                <w:bCs w:val="false"/>
+                <w:sz w:val="20"/>
+                <w:szCs w:val="20"/>
+              </w:rPr>
+              <w:t xml:space="preserve">3.12.x</w:t>
+            </w:r>
+          </w:p>
+        </w:tc>
+        <w:tc>
+          <w:tcPr>
+            <w:tcW w:type="dxa" w:w="2500"/>
+            <w:tcBorders>
+              <w:top w:val="single" w:color="B7C6E6" w:sz="4"/>
+              <w:left w:val="single" w:color="B7C6E6" w:sz="4"/>
+              <w:bottom w:val="single" w:color="B7C6E6" w:sz="4"/>
+              <w:right w:val="single" w:color="B7C6E6" w:sz="4"/>
+            </w:tcBorders>
+            <w:shd w:fill="FFFFFF" w:val="clear"/>
+            <w:tcMar>
+              <w:top w:type="dxa" w:w="90"/>
+              <w:left w:type="dxa" w:w="140"/>
+              <w:bottom w:type="dxa" w:w="90"/>
+              <w:right w:type="dxa" w:w="140"/>
+            </w:tcMar>
+            <w:vAlign w:val="center"/>
+          </w:tcPr>
+          <w:p>
+            <w:r>
+              <w:rPr>
+                <w:rFonts w:ascii="Calibri" w:cs="Calibri" w:eastAsia="Calibri" w:hAnsi="Calibri"/>
+                <w:b w:val="false"/>
+                <w:bCs w:val="false"/>
+                <w:sz w:val="20"/>
+                <w:szCs w:val="20"/>
+              </w:rPr>
+              <w:t xml:space="preserve">python.org/downloads</w:t>
+            </w:r>
+          </w:p>
+        </w:tc>
+        <w:tc>
+          <w:tcPr>
+            <w:tcW w:type="dxa" w:w="2626"/>
+            <w:tcBorders>
+              <w:top w:val="single" w:color="B7C6E6" w:sz="4"/>
+              <w:left w:val="single" w:color="B7C6E6" w:sz="4"/>
+              <w:bottom w:val="single" w:color="B7C6E6" w:sz="4"/>
+              <w:right w:val="single" w:color="B7C6E6" w:sz="4"/>
+            </w:tcBorders>
+            <w:shd w:fill="FFFFFF" w:val="clear"/>
+            <w:tcMar>
+              <w:top w:type="dxa" w:w="90"/>
+              <w:left w:type="dxa" w:w="140"/>
+              <w:bottom w:type="dxa" w:w="90"/>
+              <w:right w:type="dxa" w:w="140"/>
+            </w:tcMar>
+            <w:vAlign w:val="center"/>
+          </w:tcPr>
+          <w:p>
+            <w:r>
+              <w:rPr>
+                <w:rFonts w:ascii="Calibri" w:cs="Calibri" w:eastAsia="Calibri" w:hAnsi="Calibri"/>
+                <w:b w:val="false"/>
+                <w:bCs w:val="false"/>
+                <w:sz w:val="20"/>
+                <w:szCs w:val="20"/>
+              </w:rPr>
+              <w:t xml:space="preserve">—</w:t>
+            </w:r>
+          </w:p>
+        </w:tc>
+      </w:tr>
+      <w:tr>
+        <w:tc>
+          <w:tcPr>
+            <w:tcW w:type="dxa" w:w="2000"/>
+            <w:tcBorders>
+              <w:top w:val="single" w:color="B7C6E6" w:sz="4"/>
+              <w:left w:val="single" w:color="B7C6E6" w:sz="4"/>
+              <w:bottom w:val="single" w:color="B7C6E6" w:sz="4"/>
+              <w:right w:val="single" w:color="B7C6E6" w:sz="4"/>
+            </w:tcBorders>
+            <w:shd w:fill="F2F2F2" w:val="clear"/>
+            <w:tcMar>
+              <w:top w:type="dxa" w:w="90"/>
+              <w:left w:type="dxa" w:w="140"/>
+              <w:bottom w:type="dxa" w:w="90"/>
+              <w:right w:type="dxa" w:w="140"/>
+            </w:tcMar>
+            <w:vAlign w:val="center"/>
+          </w:tcPr>
+          <w:p>
+            <w:r>
+              <w:rPr>
+                <w:rFonts w:ascii="Calibri" w:cs="Calibri" w:eastAsia="Calibri" w:hAnsi="Calibri"/>
+                <w:b w:val="false"/>
+                <w:bCs w:val="false"/>
+                <w:sz w:val="20"/>
+                <w:szCs w:val="20"/>
+              </w:rPr>
+              <w:t xml:space="preserve">vs_buildtools.exe</w:t>
+            </w:r>
+          </w:p>
+        </w:tc>
+        <w:tc>
+          <w:tcPr>
+            <w:tcW w:type="dxa" w:w="1900"/>
+            <w:tcBorders>
+              <w:top w:val="single" w:color="B7C6E6" w:sz="4"/>
+              <w:left w:val="single" w:color="B7C6E6" w:sz="4"/>
+              <w:bottom w:val="single" w:color="B7C6E6" w:sz="4"/>
+              <w:right w:val="single" w:color="B7C6E6" w:sz="4"/>
+            </w:tcBorders>
+            <w:shd w:fill="F2F2F2" w:val="clear"/>
+            <w:tcMar>
+              <w:top w:type="dxa" w:w="90"/>
+              <w:left w:type="dxa" w:w="140"/>
+              <w:bottom w:type="dxa" w:w="90"/>
+              <w:right w:type="dxa" w:w="140"/>
+            </w:tcMar>
+            <w:vAlign w:val="center"/>
+          </w:tcPr>
+          <w:p>
+            <w:r>
+              <w:rPr>
+                <w:rFonts w:ascii="Calibri" w:cs="Calibri" w:eastAsia="Calibri" w:hAnsi="Calibri"/>
+                <w:b w:val="false"/>
+                <w:bCs w:val="false"/>
+                <w:sz w:val="20"/>
+                <w:szCs w:val="20"/>
+              </w:rPr>
+              <w:t xml:space="preserve">Bootstrapper actual</w:t>
+            </w:r>
+          </w:p>
+        </w:tc>
+        <w:tc>
+          <w:tcPr>
+            <w:tcW w:type="dxa" w:w="2500"/>
+            <w:tcBorders>
+              <w:top w:val="single" w:color="B7C6E6" w:sz="4"/>
+              <w:left w:val="single" w:color="B7C6E6" w:sz="4"/>
+              <w:bottom w:val="single" w:color="B7C6E6" w:sz="4"/>
+              <w:right w:val="single" w:color="B7C6E6" w:sz="4"/>
+            </w:tcBorders>
+            <w:shd w:fill="F2F2F2" w:val="clear"/>
+            <w:tcMar>
+              <w:top w:type="dxa" w:w="90"/>
+              <w:left w:type="dxa" w:w="140"/>
+              <w:bottom w:type="dxa" w:w="90"/>
+              <w:right w:type="dxa" w:w="140"/>
+            </w:tcMar>
+            <w:vAlign w:val="center"/>
+          </w:tcPr>
+          <w:p>
+            <w:r>
+              <w:rPr>
+                <w:rFonts w:ascii="Calibri" w:cs="Calibri" w:eastAsia="Calibri" w:hAnsi="Calibri"/>
+                <w:b w:val="false"/>
+                <w:bCs w:val="false"/>
+                <w:sz w:val="20"/>
+                <w:szCs w:val="20"/>
+              </w:rPr>
+              <w:t xml:space="preserve">aka.ms/vs/17/release/vs_buildtools.exe</w:t>
+            </w:r>
+          </w:p>
+        </w:tc>
+        <w:tc>
+          <w:tcPr>
+            <w:tcW w:type="dxa" w:w="2626"/>
+            <w:tcBorders>
+              <w:top w:val="single" w:color="B7C6E6" w:sz="4"/>
+              <w:left w:val="single" w:color="B7C6E6" w:sz="4"/>
+              <w:bottom w:val="single" w:color="B7C6E6" w:sz="4"/>
+              <w:right w:val="single" w:color="B7C6E6" w:sz="4"/>
+            </w:tcBorders>
+            <w:shd w:fill="F2F2F2" w:val="clear"/>
+            <w:tcMar>
+              <w:top w:type="dxa" w:w="90"/>
+              <w:left w:type="dxa" w:w="140"/>
+              <w:bottom w:type="dxa" w:w="90"/>
+              <w:right w:type="dxa" w:w="140"/>
+            </w:tcMar>
+            <w:vAlign w:val="center"/>
+          </w:tcPr>
+          <w:p>
+            <w:r>
+              <w:rPr>
+                <w:rFonts w:ascii="Calibri" w:cs="Calibri" w:eastAsia="Calibri" w:hAnsi="Calibri"/>
+                <w:b w:val="false"/>
+                <w:bCs w:val="false"/>
+                <w:sz w:val="20"/>
+                <w:szCs w:val="20"/>
+              </w:rPr>
+              <w:t xml:space="preserve">—</w:t>
+            </w:r>
+          </w:p>
+        </w:tc>
+      </w:tr>
+      <w:tr>
+        <w:tc>
+          <w:tcPr>
+            <w:tcW w:type="dxa" w:w="2000"/>
+            <w:tcBorders>
+              <w:top w:val="single" w:color="B7C6E6" w:sz="4"/>
+              <w:left w:val="single" w:color="B7C6E6" w:sz="4"/>
+              <w:bottom w:val="single" w:color="B7C6E6" w:sz="4"/>
+              <w:right w:val="single" w:color="B7C6E6" w:sz="4"/>
+            </w:tcBorders>
+            <w:shd w:fill="FFFFFF" w:val="clear"/>
+            <w:tcMar>
+              <w:top w:type="dxa" w:w="90"/>
+              <w:left w:type="dxa" w:w="140"/>
+              <w:bottom w:type="dxa" w:w="90"/>
+              <w:right w:type="dxa" w:w="140"/>
+            </w:tcMar>
+            <w:vAlign w:val="center"/>
+          </w:tcPr>
+          <w:p>
+            <w:r>
+              <w:rPr>
+                <w:rFonts w:ascii="Calibri" w:cs="Calibri" w:eastAsia="Calibri" w:hAnsi="Calibri"/>
+                <w:b w:val="false"/>
+                <w:bCs w:val="false"/>
+                <w:sz w:val="20"/>
+                <w:szCs w:val="20"/>
+              </w:rPr>
+              <w:t xml:space="preserve">postgresql-17.11-5-windows-x64.exe</w:t>
+            </w:r>
+          </w:p>
+        </w:tc>
+        <w:tc>
+          <w:tcPr>
+            <w:tcW w:type="dxa" w:w="1900"/>
+            <w:tcBorders>
+              <w:top w:val="single" w:color="B7C6E6" w:sz="4"/>
+              <w:left w:val="single" w:color="B7C6E6" w:sz="4"/>
+              <w:bottom w:val="single" w:color="B7C6E6" w:sz="4"/>
+              <w:right w:val="single" w:color="B7C6E6" w:sz="4"/>
+            </w:tcBorders>
+            <w:shd w:fill="FFFFFF" w:val="clear"/>
+            <w:tcMar>
+              <w:top w:type="dxa" w:w="90"/>
+              <w:left w:type="dxa" w:w="140"/>
+              <w:bottom w:type="dxa" w:w="90"/>
+              <w:right w:type="dxa" w:w="140"/>
+            </w:tcMar>
+            <w:vAlign w:val="center"/>
+          </w:tcPr>
+          <w:p>
+            <w:r>
+              <w:rPr>
+                <w:rFonts w:ascii="Calibri" w:cs="Calibri" w:eastAsia="Calibri" w:hAnsi="Calibri"/>
+                <w:b w:val="false"/>
+                <w:bCs w:val="false"/>
+                <w:sz w:val="20"/>
+                <w:szCs w:val="20"/>
+              </w:rPr>
+              <w:t xml:space="preserve">17.11-5</w:t>
+            </w:r>
+          </w:p>
+        </w:tc>
+        <w:tc>
+          <w:tcPr>
+            <w:tcW w:type="dxa" w:w="2500"/>
+            <w:tcBorders>
+              <w:top w:val="single" w:color="B7C6E6" w:sz="4"/>
+              <w:left w:val="single" w:color="B7C6E6" w:sz="4"/>
+              <w:bottom w:val="single" w:color="B7C6E6" w:sz="4"/>
+              <w:right w:val="single" w:color="B7C6E6" w:sz="4"/>
+            </w:tcBorders>
+            <w:shd w:fill="FFFFFF" w:val="clear"/>
+            <w:tcMar>
+              <w:top w:type="dxa" w:w="90"/>
+              <w:left w:type="dxa" w:w="140"/>
+              <w:bottom w:type="dxa" w:w="90"/>
+              <w:right w:type="dxa" w:w="140"/>
+            </w:tcMar>
+            <w:vAlign w:val="center"/>
+          </w:tcPr>
+          <w:p>
+            <w:r>
+              <w:rPr>
+                <w:rFonts w:ascii="Calibri" w:cs="Calibri" w:eastAsia="Calibri" w:hAnsi="Calibri"/>
+                <w:b w:val="false"/>
+                <w:bCs w:val="false"/>
+                <w:sz w:val="20"/>
+                <w:szCs w:val="20"/>
+              </w:rPr>
+              <w:t xml:space="preserve">get.enterprisedb.com</w:t>
+            </w:r>
+          </w:p>
+        </w:tc>
+        <w:tc>
+          <w:tcPr>
+            <w:tcW w:type="dxa" w:w="2626"/>
+            <w:tcBorders>
+              <w:top w:val="single" w:color="B7C6E6" w:sz="4"/>
+              <w:left w:val="single" w:color="B7C6E6" w:sz="4"/>
+              <w:bottom w:val="single" w:color="B7C6E6" w:sz="4"/>
+              <w:right w:val="single" w:color="B7C6E6" w:sz="4"/>
+            </w:tcBorders>
+            <w:shd w:fill="FFFFFF" w:val="clear"/>
+            <w:tcMar>
+              <w:top w:type="dxa" w:w="90"/>
+              <w:left w:type="dxa" w:w="140"/>
+              <w:bottom w:type="dxa" w:w="90"/>
+              <w:right w:type="dxa" w:w="140"/>
+            </w:tcMar>
+            <w:vAlign w:val="center"/>
+          </w:tcPr>
+          <w:p>
+            <w:r>
+              <w:rPr>
+                <w:rFonts w:ascii="Calibri" w:cs="Calibri" w:eastAsia="Calibri" w:hAnsi="Calibri"/>
+                <w:b w:val="false"/>
+                <w:bCs w:val="false"/>
+                <w:sz w:val="20"/>
+                <w:szCs w:val="20"/>
+              </w:rPr>
+              <w:t xml:space="preserve">—</w:t>
+            </w:r>
+          </w:p>
+        </w:tc>
+      </w:tr>
+      <w:tr>
+        <w:tc>
+          <w:tcPr>
+            <w:tcW w:type="dxa" w:w="2000"/>
+            <w:tcBorders>
+              <w:top w:val="single" w:color="B7C6E6" w:sz="4"/>
+              <w:left w:val="single" w:color="B7C6E6" w:sz="4"/>
+              <w:bottom w:val="single" w:color="B7C6E6" w:sz="4"/>
+              <w:right w:val="single" w:color="B7C6E6" w:sz="4"/>
+            </w:tcBorders>
+            <w:shd w:fill="F2F2F2" w:val="clear"/>
+            <w:tcMar>
+              <w:top w:type="dxa" w:w="90"/>
+              <w:left w:type="dxa" w:w="140"/>
+              <w:bottom w:type="dxa" w:w="90"/>
+              <w:right w:type="dxa" w:w="140"/>
+            </w:tcMar>
+            <w:vAlign w:val="center"/>
+          </w:tcPr>
+          <w:p>
+            <w:r>
+              <w:rPr>
+                <w:rFonts w:ascii="Calibri" w:cs="Calibri" w:eastAsia="Calibri" w:hAnsi="Calibri"/>
+                <w:b w:val="false"/>
+                <w:bCs w:val="false"/>
+                <w:sz w:val="20"/>
+                <w:szCs w:val="20"/>
+              </w:rPr>
+              <w:t xml:space="preserve">pgvector (código fuente)</w:t>
+            </w:r>
+          </w:p>
+        </w:tc>
+        <w:tc>
+          <w:tcPr>
+            <w:tcW w:type="dxa" w:w="1900"/>
+            <w:tcBorders>
+              <w:top w:val="single" w:color="B7C6E6" w:sz="4"/>
+              <w:left w:val="single" w:color="B7C6E6" w:sz="4"/>
+              <w:bottom w:val="single" w:color="B7C6E6" w:sz="4"/>
+              <w:right w:val="single" w:color="B7C6E6" w:sz="4"/>
+            </w:tcBorders>
+            <w:shd w:fill="F2F2F2" w:val="clear"/>
+            <w:tcMar>
+              <w:top w:type="dxa" w:w="90"/>
+              <w:left w:type="dxa" w:w="140"/>
+              <w:bottom w:type="dxa" w:w="90"/>
+              <w:right w:type="dxa" w:w="140"/>
+            </w:tcMar>
+            <w:vAlign w:val="center"/>
+          </w:tcPr>
+          <w:p>
+            <w:r>
+              <w:rPr>
+                <w:rFonts w:ascii="Calibri" w:cs="Calibri" w:eastAsia="Calibri" w:hAnsi="Calibri"/>
+                <w:b w:val="false"/>
+                <w:bCs w:val="false"/>
+                <w:sz w:val="20"/>
+                <w:szCs w:val="20"/>
+              </w:rPr>
+              <w:t xml:space="preserve">v0.8.7</w:t>
+            </w:r>
+          </w:p>
+        </w:tc>
+        <w:tc>
+          <w:tcPr>
+            <w:tcW w:type="dxa" w:w="2500"/>
+            <w:tcBorders>
+              <w:top w:val="single" w:color="B7C6E6" w:sz="4"/>
+              <w:left w:val="single" w:color="B7C6E6" w:sz="4"/>
+              <w:bottom w:val="single" w:color="B7C6E6" w:sz="4"/>
+              <w:right w:val="single" w:color="B7C6E6" w:sz="4"/>
+            </w:tcBorders>
+            <w:shd w:fill="F2F2F2" w:val="clear"/>
+            <w:tcMar>
+              <w:top w:type="dxa" w:w="90"/>
+              <w:left w:type="dxa" w:w="140"/>
+              <w:bottom w:type="dxa" w:w="90"/>
+              <w:right w:type="dxa" w:w="140"/>
+            </w:tcMar>
+            <w:vAlign w:val="center"/>
+          </w:tcPr>
+          <w:p>
+            <w:r>
+              <w:rPr>
+                <w:rFonts w:ascii="Calibri" w:cs="Calibri" w:eastAsia="Calibri" w:hAnsi="Calibri"/>
+                <w:b w:val="false"/>
+                <w:bCs w:val="false"/>
+                <w:sz w:val="20"/>
+                <w:szCs w:val="20"/>
+              </w:rPr>
+              <w:t xml:space="preserve">github.com/pgvector/pgvector</w:t>
+            </w:r>
+          </w:p>
+        </w:tc>
+        <w:tc>
+          <w:tcPr>
+            <w:tcW w:type="dxa" w:w="2626"/>
+            <w:tcBorders>
+              <w:top w:val="single" w:color="B7C6E6" w:sz="4"/>
+              <w:left w:val="single" w:color="B7C6E6" w:sz="4"/>
+              <w:bottom w:val="single" w:color="B7C6E6" w:sz="4"/>
+              <w:right w:val="single" w:color="B7C6E6" w:sz="4"/>
+            </w:tcBorders>
+            <w:shd w:fill="F2F2F2" w:val="clear"/>
+            <w:tcMar>
+              <w:top w:type="dxa" w:w="90"/>
+              <w:left w:type="dxa" w:w="140"/>
+              <w:bottom w:type="dxa" w:w="90"/>
+              <w:right w:type="dxa" w:w="140"/>
+            </w:tcMar>
+            <w:vAlign w:val="center"/>
+          </w:tcPr>
+          <w:p>
+            <w:r>
+              <w:rPr>
+                <w:rFonts w:ascii="Calibri" w:cs="Calibri" w:eastAsia="Calibri" w:hAnsi="Calibri"/>
+                <w:b w:val="false"/>
+                <w:bCs w:val="false"/>
+                <w:sz w:val="20"/>
+                <w:szCs w:val="20"/>
+              </w:rPr>
+              <w:t xml:space="preserve">—</w:t>
+            </w:r>
+          </w:p>
+        </w:tc>
+      </w:tr>
+      <w:tr>
+        <w:tc>
+          <w:tcPr>
+            <w:tcW w:type="dxa" w:w="2000"/>
+            <w:tcBorders>
+              <w:top w:val="single" w:color="B7C6E6" w:sz="4"/>
+              <w:left w:val="single" w:color="B7C6E6" w:sz="4"/>
+              <w:bottom w:val="single" w:color="B7C6E6" w:sz="4"/>
+              <w:right w:val="single" w:color="B7C6E6" w:sz="4"/>
+            </w:tcBorders>
+            <w:shd w:fill="FFFFFF" w:val="clear"/>
+            <w:tcMar>
+              <w:top w:type="dxa" w:w="90"/>
+              <w:left w:type="dxa" w:w="140"/>
+              <w:bottom w:type="dxa" w:w="90"/>
+              <w:right w:type="dxa" w:w="140"/>
+            </w:tcMar>
+            <w:vAlign w:val="center"/>
+          </w:tcPr>
+          <w:p>
+            <w:r>
+              <w:rPr>
+                <w:rFonts w:ascii="Calibri" w:cs="Calibri" w:eastAsia="Calibri" w:hAnsi="Calibri"/>
+                <w:b w:val="false"/>
+                <w:bCs w:val="false"/>
+                <w:sz w:val="20"/>
+                <w:szCs w:val="20"/>
+              </w:rPr>
+              <w:t xml:space="preserve">node-v24.22.0-x64.msi</w:t>
+            </w:r>
+          </w:p>
+        </w:tc>
+        <w:tc>
+          <w:tcPr>
+            <w:tcW w:type="dxa" w:w="1900"/>
+            <w:tcBorders>
+              <w:top w:val="single" w:color="B7C6E6" w:sz="4"/>
+              <w:left w:val="single" w:color="B7C6E6" w:sz="4"/>
+              <w:bottom w:val="single" w:color="B7C6E6" w:sz="4"/>
+              <w:right w:val="single" w:color="B7C6E6" w:sz="4"/>
+            </w:tcBorders>
+            <w:shd w:fill="FFFFFF" w:val="clear"/>
+            <w:tcMar>
+              <w:top w:type="dxa" w:w="90"/>
+              <w:left w:type="dxa" w:w="140"/>
+              <w:bottom w:type="dxa" w:w="90"/>
+              <w:right w:type="dxa" w:w="140"/>
+            </w:tcMar>
+            <w:vAlign w:val="center"/>
+          </w:tcPr>
+          <w:p>
+            <w:r>
+              <w:rPr>
+                <w:rFonts w:ascii="Calibri" w:cs="Calibri" w:eastAsia="Calibri" w:hAnsi="Calibri"/>
+                <w:b w:val="false"/>
+                <w:bCs w:val="false"/>
+                <w:sz w:val="20"/>
+                <w:szCs w:val="20"/>
+              </w:rPr>
+              <w:t xml:space="preserve">v24.22.0 LTS Krypton</w:t>
+            </w:r>
+          </w:p>
+        </w:tc>
+        <w:tc>
+          <w:tcPr>
+            <w:tcW w:type="dxa" w:w="2500"/>
+            <w:tcBorders>
+              <w:top w:val="single" w:color="B7C6E6" w:sz="4"/>
+              <w:left w:val="single" w:color="B7C6E6" w:sz="4"/>
+              <w:bottom w:val="single" w:color="B7C6E6" w:sz="4"/>
+              <w:right w:val="single" w:color="B7C6E6" w:sz="4"/>
+            </w:tcBorders>
+            <w:shd w:fill="FFFFFF" w:val="clear"/>
+            <w:tcMar>
+              <w:top w:type="dxa" w:w="90"/>
+              <w:left w:type="dxa" w:w="140"/>
+              <w:bottom w:type="dxa" w:w="90"/>
+              <w:right w:type="dxa" w:w="140"/>
+            </w:tcMar>
+            <w:vAlign w:val="center"/>
+          </w:tcPr>
+          <w:p>
+            <w:r>
+              <w:rPr>
+                <w:rFonts w:ascii="Calibri" w:cs="Calibri" w:eastAsia="Calibri" w:hAnsi="Calibri"/>
+                <w:b w:val="false"/>
+                <w:bCs w:val="false"/>
+                <w:sz w:val="20"/>
+                <w:szCs w:val="20"/>
+              </w:rPr>
+              <w:t xml:space="preserve">nodejs.org/dist</w:t>
+            </w:r>
+          </w:p>
+        </w:tc>
+        <w:tc>
+          <w:tcPr>
+            <w:tcW w:type="dxa" w:w="2626"/>
+            <w:tcBorders>
+              <w:top w:val="single" w:color="B7C6E6" w:sz="4"/>
+              <w:left w:val="single" w:color="B7C6E6" w:sz="4"/>
+              <w:bottom w:val="single" w:color="B7C6E6" w:sz="4"/>
+              <w:right w:val="single" w:color="B7C6E6" w:sz="4"/>
+            </w:tcBorders>
+            <w:shd w:fill="FFFFFF" w:val="clear"/>
+            <w:tcMar>
+              <w:top w:type="dxa" w:w="90"/>
+              <w:left w:type="dxa" w:w="140"/>
+              <w:bottom w:type="dxa" w:w="90"/>
+              <w:right w:type="dxa" w:w="140"/>
+            </w:tcMar>
+            <w:vAlign w:val="center"/>
+          </w:tcPr>
+          <w:p>
+            <w:r>
+              <w:rPr>
+                <w:rFonts w:ascii="Calibri" w:cs="Calibri" w:eastAsia="Calibri" w:hAnsi="Calibri"/>
+                <w:b w:val="false"/>
+                <w:bCs w:val="false"/>
+                <w:sz w:val="20"/>
+                <w:szCs w:val="20"/>
+              </w:rPr>
+              <w:t xml:space="preserve">—</w:t>
+            </w:r>
+          </w:p>
+        </w:tc>
+      </w:tr>
+      <w:tr>
+        <w:tc>
+          <w:tcPr>
+            <w:tcW w:type="dxa" w:w="2000"/>
+            <w:tcBorders>
+              <w:top w:val="single" w:color="B7C6E6" w:sz="4"/>
+              <w:left w:val="single" w:color="B7C6E6" w:sz="4"/>
+              <w:bottom w:val="single" w:color="B7C6E6" w:sz="4"/>
+              <w:right w:val="single" w:color="B7C6E6" w:sz="4"/>
+            </w:tcBorders>
+            <w:shd w:fill="F2F2F2" w:val="clear"/>
+            <w:tcMar>
+              <w:top w:type="dxa" w:w="90"/>
+              <w:left w:type="dxa" w:w="140"/>
+              <w:bottom w:type="dxa" w:w="90"/>
+              <w:right w:type="dxa" w:w="140"/>
+            </w:tcMar>
+            <w:vAlign w:val="center"/>
+          </w:tcPr>
+          <w:p>
+            <w:r>
+              <w:rPr>
+                <w:rFonts w:ascii="Calibri" w:cs="Calibri" w:eastAsia="Calibri" w:hAnsi="Calibri"/>
+                <w:b w:val="false"/>
+                <w:bCs w:val="false"/>
+                <w:sz w:val="20"/>
+                <w:szCs w:val="20"/>
+              </w:rPr>
+              <w:t xml:space="preserve">nssm-2.24.zip</w:t>
+            </w:r>
+          </w:p>
+        </w:tc>
+        <w:tc>
+          <w:tcPr>
+            <w:tcW w:type="dxa" w:w="1900"/>
+            <w:tcBorders>
+              <w:top w:val="single" w:color="B7C6E6" w:sz="4"/>
+              <w:left w:val="single" w:color="B7C6E6" w:sz="4"/>
+              <w:bottom w:val="single" w:color="B7C6E6" w:sz="4"/>
+              <w:right w:val="single" w:color="B7C6E6" w:sz="4"/>
+            </w:tcBorders>
+            <w:shd w:fill="F2F2F2" w:val="clear"/>
+            <w:tcMar>
+              <w:top w:type="dxa" w:w="90"/>
+              <w:left w:type="dxa" w:w="140"/>
+              <w:bottom w:type="dxa" w:w="90"/>
+              <w:right w:type="dxa" w:w="140"/>
+            </w:tcMar>
+            <w:vAlign w:val="center"/>
+          </w:tcPr>
+          <w:p>
+            <w:r>
+              <w:rPr>
+                <w:rFonts w:ascii="Calibri" w:cs="Calibri" w:eastAsia="Calibri" w:hAnsi="Calibri"/>
+                <w:b w:val="false"/>
+                <w:bCs w:val="false"/>
+                <w:sz w:val="20"/>
+                <w:szCs w:val="20"/>
+              </w:rPr>
+              <w:t xml:space="preserve">2.24</w:t>
+            </w:r>
+          </w:p>
+        </w:tc>
+        <w:tc>
+          <w:tcPr>
+            <w:tcW w:type="dxa" w:w="2500"/>
+            <w:tcBorders>
+              <w:top w:val="single" w:color="B7C6E6" w:sz="4"/>
+              <w:left w:val="single" w:color="B7C6E6" w:sz="4"/>
+              <w:bottom w:val="single" w:color="B7C6E6" w:sz="4"/>
+              <w:right w:val="single" w:color="B7C6E6" w:sz="4"/>
+            </w:tcBorders>
+            <w:shd w:fill="F2F2F2" w:val="clear"/>
+            <w:tcMar>
+              <w:top w:type="dxa" w:w="90"/>
+              <w:left w:type="dxa" w:w="140"/>
+              <w:bottom w:type="dxa" w:w="90"/>
+              <w:right w:type="dxa" w:w="140"/>
+            </w:tcMar>
+            <w:vAlign w:val="center"/>
+          </w:tcPr>
+          <w:p>
+            <w:r>
+              <w:rPr>
+                <w:rFonts w:ascii="Calibri" w:cs="Calibri" w:eastAsia="Calibri" w:hAnsi="Calibri"/>
+                <w:b w:val="false"/>
+                <w:bCs w:val="false"/>
+                <w:sz w:val="20"/>
+                <w:szCs w:val="20"/>
+              </w:rPr>
+              <w:t xml:space="preserve">nssm.cc/release</w:t>
+            </w:r>
+          </w:p>
+        </w:tc>
+        <w:tc>
+          <w:tcPr>
+            <w:tcW w:type="dxa" w:w="2626"/>
+            <w:tcBorders>
+              <w:top w:val="single" w:color="B7C6E6" w:sz="4"/>
+              <w:left w:val="single" w:color="B7C6E6" w:sz="4"/>
+              <w:bottom w:val="single" w:color="B7C6E6" w:sz="4"/>
+              <w:right w:val="single" w:color="B7C6E6" w:sz="4"/>
+            </w:tcBorders>
+            <w:shd w:fill="F2F2F2" w:val="clear"/>
+            <w:tcMar>
+              <w:top w:type="dxa" w:w="90"/>
+              <w:left w:type="dxa" w:w="140"/>
+              <w:bottom w:type="dxa" w:w="90"/>
+              <w:right w:type="dxa" w:w="140"/>
+            </w:tcMar>
+            <w:vAlign w:val="center"/>
+          </w:tcPr>
+          <w:p>
+            <w:r>
+              <w:rPr>
+                <w:rFonts w:ascii="Calibri" w:cs="Calibri" w:eastAsia="Calibri" w:hAnsi="Calibri"/>
+                <w:b w:val="false"/>
+                <w:bCs w:val="false"/>
+                <w:sz w:val="20"/>
+                <w:szCs w:val="20"/>
+              </w:rPr>
+              <w:t xml:space="preserve">—</w:t>
+            </w:r>
+          </w:p>
+        </w:tc>
+      </w:tr>
+      <w:tr>
+        <w:tc>
+          <w:tcPr>
+            <w:tcW w:type="dxa" w:w="2000"/>
+            <w:tcBorders>
+              <w:top w:val="single" w:color="B7C6E6" w:sz="4"/>
+              <w:left w:val="single" w:color="B7C6E6" w:sz="4"/>
+              <w:bottom w:val="single" w:color="B7C6E6" w:sz="4"/>
+              <w:right w:val="single" w:color="B7C6E6" w:sz="4"/>
+            </w:tcBorders>
+            <w:shd w:fill="FFFFFF" w:val="clear"/>
+            <w:tcMar>
+              <w:top w:type="dxa" w:w="90"/>
+              <w:left w:type="dxa" w:w="140"/>
+              <w:bottom w:type="dxa" w:w="90"/>
+              <w:right w:type="dxa" w:w="140"/>
+            </w:tcMar>
+            <w:vAlign w:val="center"/>
+          </w:tcPr>
+          <w:p>
+            <w:r>
+              <w:rPr>
+                <w:rFonts w:ascii="Calibri" w:cs="Calibri" w:eastAsia="Calibri" w:hAnsi="Calibri"/>
+                <w:b w:val="false"/>
+                <w:bCs w:val="false"/>
+                <w:sz w:val="20"/>
+                <w:szCs w:val="20"/>
+              </w:rPr>
+              <w:t xml:space="preserve">rewrite_amd64_en-US.msi</w:t>
+            </w:r>
+          </w:p>
+        </w:tc>
+        <w:tc>
+          <w:tcPr>
+            <w:tcW w:type="dxa" w:w="1900"/>
+            <w:tcBorders>
+              <w:top w:val="single" w:color="B7C6E6" w:sz="4"/>
+              <w:left w:val="single" w:color="B7C6E6" w:sz="4"/>
+              <w:bottom w:val="single" w:color="B7C6E6" w:sz="4"/>
+              <w:right w:val="single" w:color="B7C6E6" w:sz="4"/>
+            </w:tcBorders>
+            <w:shd w:fill="FFFFFF" w:val="clear"/>
+            <w:tcMar>
+              <w:top w:type="dxa" w:w="90"/>
+              <w:left w:type="dxa" w:w="140"/>
+              <w:bottom w:type="dxa" w:w="90"/>
+              <w:right w:type="dxa" w:w="140"/>
+            </w:tcMar>
+            <w:vAlign w:val="center"/>
+          </w:tcPr>
+          <w:p>
+            <w:r>
+              <w:rPr>
+                <w:rFonts w:ascii="Calibri" w:cs="Calibri" w:eastAsia="Calibri" w:hAnsi="Calibri"/>
+                <w:b w:val="false"/>
+                <w:bCs w:val="false"/>
+                <w:sz w:val="20"/>
+                <w:szCs w:val="20"/>
+              </w:rPr>
+              <w:t xml:space="preserve">URL Rewrite 2.1</w:t>
+            </w:r>
+          </w:p>
+        </w:tc>
+        <w:tc>
+          <w:tcPr>
+            <w:tcW w:type="dxa" w:w="2500"/>
+            <w:tcBorders>
+              <w:top w:val="single" w:color="B7C6E6" w:sz="4"/>
+              <w:left w:val="single" w:color="B7C6E6" w:sz="4"/>
+              <w:bottom w:val="single" w:color="B7C6E6" w:sz="4"/>
+              <w:right w:val="single" w:color="B7C6E6" w:sz="4"/>
+            </w:tcBorders>
+            <w:shd w:fill="FFFFFF" w:val="clear"/>
+            <w:tcMar>
+              <w:top w:type="dxa" w:w="90"/>
+              <w:left w:type="dxa" w:w="140"/>
+              <w:bottom w:type="dxa" w:w="90"/>
+              <w:right w:type="dxa" w:w="140"/>
+            </w:tcMar>
+            <w:vAlign w:val="center"/>
+          </w:tcPr>
+          <w:p>
+            <w:r>
+              <w:rPr>
+                <w:rFonts w:ascii="Calibri" w:cs="Calibri" w:eastAsia="Calibri" w:hAnsi="Calibri"/>
+                <w:b w:val="false"/>
+                <w:bCs w:val="false"/>
+                <w:sz w:val="20"/>
+                <w:szCs w:val="20"/>
+              </w:rPr>
+              <w:t xml:space="preserve">download.microsoft.com</w:t>
+            </w:r>
+          </w:p>
+        </w:tc>
+        <w:tc>
+          <w:tcPr>
+            <w:tcW w:type="dxa" w:w="2626"/>
+            <w:tcBorders>
+              <w:top w:val="single" w:color="B7C6E6" w:sz="4"/>
+              <w:left w:val="single" w:color="B7C6E6" w:sz="4"/>
+              <w:bottom w:val="single" w:color="B7C6E6" w:sz="4"/>
+              <w:right w:val="single" w:color="B7C6E6" w:sz="4"/>
+            </w:tcBorders>
+            <w:shd w:fill="FFFFFF" w:val="clear"/>
+            <w:tcMar>
+              <w:top w:type="dxa" w:w="90"/>
+              <w:left w:type="dxa" w:w="140"/>
+              <w:bottom w:type="dxa" w:w="90"/>
+              <w:right w:type="dxa" w:w="140"/>
+            </w:tcMar>
+            <w:vAlign w:val="center"/>
+          </w:tcPr>
+          <w:p>
+            <w:r>
+              <w:rPr>
+                <w:rFonts w:ascii="Calibri" w:cs="Calibri" w:eastAsia="Calibri" w:hAnsi="Calibri"/>
+                <w:b w:val="false"/>
+                <w:bCs w:val="false"/>
+                <w:sz w:val="20"/>
+                <w:szCs w:val="20"/>
+              </w:rPr>
+              <w:t xml:space="preserve">SHA1: 8F41A67FA49110155969DCCFF265B8623A66448F</w:t>
+            </w:r>
+          </w:p>
+        </w:tc>
+      </w:tr>
+      <w:tr>
+        <w:tc>
+          <w:tcPr>
+            <w:tcW w:type="dxa" w:w="2000"/>
+            <w:tcBorders>
+              <w:top w:val="single" w:color="B7C6E6" w:sz="4"/>
+              <w:left w:val="single" w:color="B7C6E6" w:sz="4"/>
+              <w:bottom w:val="single" w:color="B7C6E6" w:sz="4"/>
+              <w:right w:val="single" w:color="B7C6E6" w:sz="4"/>
+            </w:tcBorders>
+            <w:shd w:fill="F2F2F2" w:val="clear"/>
+            <w:tcMar>
+              <w:top w:type="dxa" w:w="90"/>
+              <w:left w:type="dxa" w:w="140"/>
+              <w:bottom w:type="dxa" w:w="90"/>
+              <w:right w:type="dxa" w:w="140"/>
+            </w:tcMar>
+            <w:vAlign w:val="center"/>
+          </w:tcPr>
+          <w:p>
+            <w:r>
+              <w:rPr>
+                <w:rFonts w:ascii="Calibri" w:cs="Calibri" w:eastAsia="Calibri" w:hAnsi="Calibri"/>
+                <w:b w:val="false"/>
+                <w:bCs w:val="false"/>
+                <w:sz w:val="20"/>
+                <w:szCs w:val="20"/>
+              </w:rPr>
+              <w:t xml:space="preserve">requestRouter_amd64.msi</w:t>
+            </w:r>
+          </w:p>
+        </w:tc>
+        <w:tc>
+          <w:tcPr>
+            <w:tcW w:type="dxa" w:w="1900"/>
+            <w:tcBorders>
+              <w:top w:val="single" w:color="B7C6E6" w:sz="4"/>
+              <w:left w:val="single" w:color="B7C6E6" w:sz="4"/>
+              <w:bottom w:val="single" w:color="B7C6E6" w:sz="4"/>
+              <w:right w:val="single" w:color="B7C6E6" w:sz="4"/>
+            </w:tcBorders>
+            <w:shd w:fill="F2F2F2" w:val="clear"/>
+            <w:tcMar>
+              <w:top w:type="dxa" w:w="90"/>
+              <w:left w:type="dxa" w:w="140"/>
+              <w:bottom w:type="dxa" w:w="90"/>
+              <w:right w:type="dxa" w:w="140"/>
+            </w:tcMar>
+            <w:vAlign w:val="center"/>
+          </w:tcPr>
+          <w:p>
+            <w:r>
+              <w:rPr>
+                <w:rFonts w:ascii="Calibri" w:cs="Calibri" w:eastAsia="Calibri" w:hAnsi="Calibri"/>
+                <w:b w:val="false"/>
+                <w:bCs w:val="false"/>
+                <w:sz w:val="20"/>
+                <w:szCs w:val="20"/>
+              </w:rPr>
+              <w:t xml:space="preserve">ARR 3.0</w:t>
+            </w:r>
+          </w:p>
+        </w:tc>
+        <w:tc>
+          <w:tcPr>
+            <w:tcW w:type="dxa" w:w="2500"/>
+            <w:tcBorders>
+              <w:top w:val="single" w:color="B7C6E6" w:sz="4"/>
+              <w:left w:val="single" w:color="B7C6E6" w:sz="4"/>
+              <w:bottom w:val="single" w:color="B7C6E6" w:sz="4"/>
+              <w:right w:val="single" w:color="B7C6E6" w:sz="4"/>
+            </w:tcBorders>
+            <w:shd w:fill="F2F2F2" w:val="clear"/>
+            <w:tcMar>
+              <w:top w:type="dxa" w:w="90"/>
+              <w:left w:type="dxa" w:w="140"/>
+              <w:bottom w:type="dxa" w:w="90"/>
+              <w:right w:type="dxa" w:w="140"/>
+            </w:tcMar>
+            <w:vAlign w:val="center"/>
+          </w:tcPr>
+          <w:p>
+            <w:r>
+              <w:rPr>
+                <w:rFonts w:ascii="Calibri" w:cs="Calibri" w:eastAsia="Calibri" w:hAnsi="Calibri"/>
+                <w:b w:val="false"/>
+                <w:bCs w:val="false"/>
+                <w:sz w:val="20"/>
+                <w:szCs w:val="20"/>
+              </w:rPr>
+              <w:t xml:space="preserve">download.microsoft.com</w:t>
+            </w:r>
+          </w:p>
+        </w:tc>
+        <w:tc>
+          <w:tcPr>
+            <w:tcW w:type="dxa" w:w="2626"/>
+            <w:tcBorders>
+              <w:top w:val="single" w:color="B7C6E6" w:sz="4"/>
+              <w:left w:val="single" w:color="B7C6E6" w:sz="4"/>
+              <w:bottom w:val="single" w:color="B7C6E6" w:sz="4"/>
+              <w:right w:val="single" w:color="B7C6E6" w:sz="4"/>
+            </w:tcBorders>
+            <w:shd w:fill="F2F2F2" w:val="clear"/>
+            <w:tcMar>
+              <w:top w:type="dxa" w:w="90"/>
+              <w:left w:type="dxa" w:w="140"/>
+              <w:bottom w:type="dxa" w:w="90"/>
+              <w:right w:type="dxa" w:w="140"/>
+            </w:tcMar>
+            <w:vAlign w:val="center"/>
+          </w:tcPr>
+          <w:p>
+            <w:r>
+              <w:rPr>
+                <w:rFonts w:ascii="Calibri" w:cs="Calibri" w:eastAsia="Calibri" w:hAnsi="Calibri"/>
+                <w:b w:val="false"/>
+                <w:bCs w:val="false"/>
+                <w:sz w:val="20"/>
+                <w:szCs w:val="20"/>
+              </w:rPr>
+              <w:t xml:space="preserve">SHA1: 8B258C3D62AC41192F1D01BA9FCFEDD8421320BA</w:t>
+            </w:r>
+          </w:p>
+        </w:tc>
+      </w:tr>
+    </w:tbl>
+    <w:p>
+      <w:pPr>
+        <w:spacing w:after="160" w:line="276"/>
+      </w:pPr>
+      <w:r>
+        <w:rPr>
+          <w:rFonts w:ascii="Calibri" w:cs="Calibri" w:eastAsia="Calibri" w:hAnsi="Calibri"/>
+          <w:sz w:val="22"/>
+          <w:szCs w:val="22"/>
+        </w:rPr>
+        <w:t xml:space="preserve">Python y Visual Studio Build Tools no publican un hash fijo por versión (el bootstrapper de VS Build Tools descarga los componentes reales en el momento de ejecutarse, y cambian con cada actualización), por eso no llevan valor en la última columna — la verificación en esos dos casos es confiar en el dominio oficial (python.org / aka.ms, de Microsoft) desde el que se descargan.</w:t>
+      </w:r>
+    </w:p>
+    <w:p>
+      <w:pPr>
+        <w:pStyle w:val="Heading1"/>
+        <w:spacing w:after="200" w:before="400"/>
+      </w:pPr>
+      <w:bookmarkStart w:name="_Toc43" w:id="43"/>
       <w:r>
         <w:t xml:space="preserve">10. Riesgos y pendientes conocidos</w:t>
       </w:r>
-      <w:bookmarkEnd w:id="41"/>
+      <w:bookmarkEnd w:id="43"/>
     </w:p>
     <w:tbl>
       <w:tblPr>

</xml_diff>

<commit_message>
Fijar certificado autofirmado como via de HTTPS en la guia de preprod
El login real contra Entra ID exige HTTPS (Entra no admite redirect URI en
http:// salvo para localhost), asi que HTTPS no es opcional en este
despliegue. Se detalla el autofirmado como la via elegida: generacion con
New-SelfSignedCertificate, exportacion y distribucion de confianza a los
equipos cliente. Ajustados los riesgos y pendientes en consecuencia.

Co-Authored-By: Claude Sonnet 5 <noreply@anthropic.com>
</commit_message>
<xml_diff>
--- a/docs/Guia_Instalacion_mIA_Preproduccion.docx
+++ b/docs/Guia_Instalacion_mIA_Preproduccion.docx
@@ -1040,7 +1040,7 @@
           </w:pPr>
           <w:hyperlink w:history="1" w:anchor="_Toc28">
             <w:r>
-              <w:t xml:space="preserve">7.2 Certificado SSL</w:t>
+              <w:t xml:space="preserve">7.2 Certificado SSL (autofirmado)</w:t>
             </w:r>
             <w:r>
               <w:tab/>
@@ -2735,7 +2735,77 @@
                 <w:sz w:val="21"/>
                 <w:szCs w:val="21"/>
               </w:rPr>
-              <w:t xml:space="preserve">Al ser .local (y no .com), ambas URL son de uso exclusivamente interno: solo resuelven dentro de la red corporativa (normalmente porque sunsetbeachclub.local es el propio dominio de Active Directory), nunca desde internet. Además, ninguna CA pública puede emitir certificados SSL para nombres .local desde 2015 (lo prohíben las reglas del CA/Browser Forum): el certificado de mia-pre.sunsetbeachclub.local tiene que emitirlo obligatoriamente la CA interna/corporativa (p. ej. Active Directory Certificate Services, si existe) o, en su defecto, ser autofirmado. Esto afecta directamente al paso 7.2 de esta guía. Nota adicional: portal.sunsetbeachclub.local (SharePoint 2013) corre hoy en HTTP, sin certificado — no hay por tanto un certificado ni un binding 443 ya existentes en este servidor que reutilizar para mIA; hay que solicitar u obtener uno desde cero (sección 7.2) y abrir el puerto 443 en el firewall (sección 7.7), que probablemente no esté abierto todavía.</w:t>
+              <w:t xml:space="preserve">Al ser .local (y no .com), ambas URL son de uso exclusivamente interno: solo resuelven dentro de la red corporativa (normalmente porque sunsetbeachclub.local es el propio dominio de Active Directory), nunca desde internet. Además, ninguna CA pública puede emitir certificados SSL para nombres .local desde 2015 (lo prohíben las reglas del CA/Browser Forum): el certificado de mia-pre.sunsetbeachclub.local no puede venir de una CA pública bajo ningún concepto. Nota adicional: portal.sunsetbeachclub.local (SharePoint 2013) corre hoy en HTTP, sin certificado — no hay por tanto un certificado ni un binding 443 ya existentes en este servidor que reutilizar para mIA.</w:t>
+            </w:r>
+          </w:p>
+        </w:tc>
+      </w:tr>
+    </w:tbl>
+    <w:p>
+      <w:pPr>
+        <w:spacing w:after="100"/>
+      </w:pPr>
+    </w:p>
+    <w:tbl>
+      <w:tblPr>
+        <w:tblW w:type="pct" w:w="5000"/>
+        <w:tblBorders>
+          <w:top w:val="single" w:color="auto" w:sz="4"/>
+          <w:left w:val="single" w:color="auto" w:sz="4"/>
+          <w:bottom w:val="single" w:color="auto" w:sz="4"/>
+          <w:right w:val="single" w:color="auto" w:sz="4"/>
+          <w:insideH w:val="single" w:color="auto" w:sz="4"/>
+          <w:insideV w:val="single" w:color="auto" w:sz="4"/>
+        </w:tblBorders>
+      </w:tblPr>
+      <w:tblGrid>
+        <w:gridCol w:w="9026"/>
+      </w:tblGrid>
+      <w:tr>
+        <w:tc>
+          <w:tcPr>
+            <w:tcBorders>
+              <w:top w:val="single" w:color="E59866" w:sz="12"/>
+              <w:left w:val="single" w:color="E59866" w:sz="12"/>
+              <w:bottom w:val="single" w:color="E59866" w:sz="12"/>
+              <w:right w:val="single" w:color="E59866" w:sz="12"/>
+            </w:tcBorders>
+            <w:shd w:fill="FDEBD0" w:val="clear"/>
+            <w:tcMar>
+              <w:top w:type="dxa" w:w="140"/>
+              <w:left w:type="dxa" w:w="220"/>
+              <w:bottom w:type="dxa" w:w="140"/>
+              <w:right w:type="dxa" w:w="220"/>
+            </w:tcMar>
+          </w:tcPr>
+          <w:p>
+            <w:pPr>
+              <w:spacing w:after="60"/>
+            </w:pPr>
+            <w:r>
+              <w:rPr>
+                <w:rFonts w:ascii="Calibri" w:cs="Calibri" w:eastAsia="Calibri" w:hAnsi="Calibri"/>
+                <w:b/>
+                <w:bCs/>
+                <w:color w:val="7D4F0A"/>
+                <w:sz w:val="22"/>
+                <w:szCs w:val="22"/>
+              </w:rPr>
+              <w:t xml:space="preserve">HTTPS obligatorio: login real contra Entra ID</w:t>
+            </w:r>
+          </w:p>
+          <w:p>
+            <w:pPr>
+              <w:spacing w:after="0"/>
+            </w:pPr>
+            <w:r>
+              <w:rPr>
+                <w:rFonts w:ascii="Calibri" w:cs="Calibri" w:eastAsia="Calibri" w:hAnsi="Calibri"/>
+                <w:color w:val="5A3A08"/>
+                <w:sz w:val="21"/>
+                <w:szCs w:val="21"/>
+              </w:rPr>
+              <w:t xml:space="preserve">mIA necesita login real de usuarios contra Microsoft Entra ID (MSAL), y Entra ID exige que el redirect URI de la aplicación sea https:// para cualquier host que no sea exactamente "localhost" — es una restricción de la propia plataforma, no una recomendación de esta guía. Por tanto HTTPS no es opcional en mia-pre.sunsetbeachclub.local. Decisión ya tomada: al no haber (todavía) una CA interna confirmada en la organización, el certificado será AUTOFIRMADO (sección 7.2 detalla cómo generarlo y distribuir su confianza a los equipos cliente, para que el navegador no muestre aviso de seguridad durante el login).</w:t>
             </w:r>
           </w:p>
         </w:tc>
@@ -3101,7 +3171,7 @@
                 <w:sz w:val="20"/>
                 <w:szCs w:val="20"/>
               </w:rPr>
-              <w:t xml:space="preserve">Para mia-pre.sunsetbeachclub.local (interno o de la CA corporativa)</w:t>
+              <w:t xml:space="preserve">Autofirmado para mia-pre.sunsetbeachclub.local — obligatorio: Entra ID exige HTTPS para el login (sección 7.2)</w:t>
             </w:r>
           </w:p>
         </w:tc>
@@ -6948,7 +7018,7 @@
       </w:pPr>
       <w:bookmarkStart w:name="_Toc28" w:id="28"/>
       <w:r>
-        <w:t xml:space="preserve">7.2 Certificado SSL</w:t>
+        <w:t xml:space="preserve">7.2 Certificado SSL (autofirmado)</w:t>
       </w:r>
       <w:bookmarkEnd w:id="28"/>
     </w:p>
@@ -7011,7 +7081,7 @@
                 <w:sz w:val="21"/>
                 <w:szCs w:val="21"/>
               </w:rPr>
-              <w:t xml:space="preserve">portal.sunsetbeachclub.local (SharePoint 2013) corre en HTTP, sin certificado SSL propio. Este paso parte de cero: hay que obtener o emitir un certificado nuevo para mia-pre.sunsetbeachclub.local, no copiar ni reutilizar nada del sitio de SharePoint.</w:t>
+              <w:t xml:space="preserve">portal.sunsetbeachclub.local (SharePoint 2013) corre en HTTP, sin certificado SSL propio. Este paso parte de cero. Decisión ya tomada: certificado AUTOFIRMADO, porque el login real contra Entra ID exige HTTPS (restricción de la propia plataforma, no opcional) y hoy no hay una CA interna confirmada en la organización.</w:t>
             </w:r>
           </w:p>
         </w:tc>
@@ -7019,7 +7089,12 @@
     </w:tbl>
     <w:p>
       <w:pPr>
-        <w:spacing w:after="160" w:line="276"/>
+        <w:pStyle w:val="ListParagraph"/>
+        <w:numPr>
+          <w:ilvl w:val="0"/>
+          <w:numId w:val="5"/>
+        </w:numPr>
+        <w:spacing w:after="140"/>
       </w:pPr>
       <w:r>
         <w:rPr>
@@ -7027,7 +7102,211 @@
           <w:sz w:val="22"/>
           <w:szCs w:val="22"/>
         </w:rPr>
-        <w:t xml:space="preserve">Instala en el almacén de certificados del servidor (Equipo local → Personal → Certificados) un certificado válido para mia-pre.sunsetbeachclub.local, emitido por la CA interna/corporativa (p. ej. Active Directory Certificate Services, si la organización ya tiene una desplegada — confírmalo con el equipo de IT/infraestructura). Al ser un nombre .local, ninguna CA pública puede emitir aquí un certificado válido; si no hay CA interna disponible, la alternativa es un certificado autofirmado (y entonces distribuir su confianza a los equipos cliente, por GPO o manualmente, para evitar avisos del navegador). Selecciónalo en el binding https del paso anterior.</w:t>
+        <w:t xml:space="preserve">Genera el certificado autofirmado en el propio servidor, con PowerShell como administrador. Incluye el nombre DNS exacto del sitio y una validez amplia (aquí 5 años):</w:t>
+      </w:r>
+    </w:p>
+    <w:tbl>
+      <w:tblPr>
+        <w:tblW w:type="pct" w:w="5000"/>
+        <w:tblBorders>
+          <w:top w:val="single" w:color="auto" w:sz="4"/>
+          <w:left w:val="single" w:color="auto" w:sz="4"/>
+          <w:bottom w:val="single" w:color="auto" w:sz="4"/>
+          <w:right w:val="single" w:color="auto" w:sz="4"/>
+          <w:insideH w:val="single" w:color="auto" w:sz="4"/>
+          <w:insideV w:val="single" w:color="auto" w:sz="4"/>
+        </w:tblBorders>
+      </w:tblPr>
+      <w:tblGrid>
+        <w:gridCol w:w="9026"/>
+      </w:tblGrid>
+      <w:tr>
+        <w:tc>
+          <w:tcPr>
+            <w:shd w:fill="2B2B2B" w:val="clear"/>
+            <w:tcMar>
+              <w:top w:type="dxa" w:w="140"/>
+              <w:left w:type="dxa" w:w="200"/>
+              <w:bottom w:type="dxa" w:w="140"/>
+              <w:right w:type="dxa" w:w="200"/>
+            </w:tcMar>
+          </w:tcPr>
+          <w:p>
+            <w:pPr>
+              <w:spacing w:after="0"/>
+            </w:pPr>
+            <w:r>
+              <w:rPr>
+                <w:rFonts w:ascii="Consolas" w:cs="Consolas" w:eastAsia="Consolas" w:hAnsi="Consolas"/>
+                <w:color w:val="E8E8E8"/>
+                <w:sz w:val="19"/>
+                <w:szCs w:val="19"/>
+              </w:rPr>
+              <w:t xml:space="preserve">New-SelfSignedCertificate -DnsName "mia-pre.sunsetbeachclub.local" ^</w:t>
+            </w:r>
+          </w:p>
+          <w:p>
+            <w:pPr>
+              <w:spacing w:after="0"/>
+            </w:pPr>
+            <w:r>
+              <w:rPr>
+                <w:rFonts w:ascii="Consolas" w:cs="Consolas" w:eastAsia="Consolas" w:hAnsi="Consolas"/>
+                <w:color w:val="E8E8E8"/>
+                <w:sz w:val="19"/>
+                <w:szCs w:val="19"/>
+              </w:rPr>
+              <w:t xml:space="preserve">  -CertStoreLocation "cert:\LocalMachine\My" ^</w:t>
+            </w:r>
+          </w:p>
+          <w:p>
+            <w:pPr>
+              <w:spacing w:after="0"/>
+            </w:pPr>
+            <w:r>
+              <w:rPr>
+                <w:rFonts w:ascii="Consolas" w:cs="Consolas" w:eastAsia="Consolas" w:hAnsi="Consolas"/>
+                <w:color w:val="E8E8E8"/>
+                <w:sz w:val="19"/>
+                <w:szCs w:val="19"/>
+              </w:rPr>
+              <w:t xml:space="preserve">  -NotAfter (Get-Date).AddYears(5) ^</w:t>
+            </w:r>
+          </w:p>
+          <w:p>
+            <w:pPr>
+              <w:spacing w:after="0"/>
+            </w:pPr>
+            <w:r>
+              <w:rPr>
+                <w:rFonts w:ascii="Consolas" w:cs="Consolas" w:eastAsia="Consolas" w:hAnsi="Consolas"/>
+                <w:color w:val="E8E8E8"/>
+                <w:sz w:val="19"/>
+                <w:szCs w:val="19"/>
+              </w:rPr>
+              <w:t xml:space="preserve">  -KeyExportPolicy Exportable -KeyUsage DigitalSignature,KeyEncipherment</w:t>
+            </w:r>
+          </w:p>
+        </w:tc>
+      </w:tr>
+    </w:tbl>
+    <w:p>
+      <w:pPr>
+        <w:pStyle w:val="ListParagraph"/>
+        <w:numPr>
+          <w:ilvl w:val="0"/>
+          <w:numId w:val="5"/>
+        </w:numPr>
+        <w:spacing w:after="140"/>
+      </w:pPr>
+      <w:r>
+        <w:rPr>
+          <w:rFonts w:ascii="Calibri" w:cs="Calibri" w:eastAsia="Calibri" w:hAnsi="Calibri"/>
+          <w:sz w:val="22"/>
+          <w:szCs w:val="22"/>
+        </w:rPr>
+        <w:t xml:space="preserve">Exporta la clave pública (sin la privada) para distribuir la confianza a los equipos cliente — sustituye &lt;thumbprint&gt; por el que devuelve el comando anterior:</w:t>
+      </w:r>
+    </w:p>
+    <w:tbl>
+      <w:tblPr>
+        <w:tblW w:type="pct" w:w="5000"/>
+        <w:tblBorders>
+          <w:top w:val="single" w:color="auto" w:sz="4"/>
+          <w:left w:val="single" w:color="auto" w:sz="4"/>
+          <w:bottom w:val="single" w:color="auto" w:sz="4"/>
+          <w:right w:val="single" w:color="auto" w:sz="4"/>
+          <w:insideH w:val="single" w:color="auto" w:sz="4"/>
+          <w:insideV w:val="single" w:color="auto" w:sz="4"/>
+        </w:tblBorders>
+      </w:tblPr>
+      <w:tblGrid>
+        <w:gridCol w:w="9026"/>
+      </w:tblGrid>
+      <w:tr>
+        <w:tc>
+          <w:tcPr>
+            <w:shd w:fill="2B2B2B" w:val="clear"/>
+            <w:tcMar>
+              <w:top w:type="dxa" w:w="140"/>
+              <w:left w:type="dxa" w:w="200"/>
+              <w:bottom w:type="dxa" w:w="140"/>
+              <w:right w:type="dxa" w:w="200"/>
+            </w:tcMar>
+          </w:tcPr>
+          <w:p>
+            <w:pPr>
+              <w:spacing w:after="0"/>
+            </w:pPr>
+            <w:r>
+              <w:rPr>
+                <w:rFonts w:ascii="Consolas" w:cs="Consolas" w:eastAsia="Consolas" w:hAnsi="Consolas"/>
+                <w:color w:val="E8E8E8"/>
+                <w:sz w:val="19"/>
+                <w:szCs w:val="19"/>
+              </w:rPr>
+              <w:t xml:space="preserve">Export-Certificate -Cert Cert:\LocalMachine\My\&lt;thumbprint&gt; ^</w:t>
+            </w:r>
+          </w:p>
+          <w:p>
+            <w:pPr>
+              <w:spacing w:after="0"/>
+            </w:pPr>
+            <w:r>
+              <w:rPr>
+                <w:rFonts w:ascii="Consolas" w:cs="Consolas" w:eastAsia="Consolas" w:hAnsi="Consolas"/>
+                <w:color w:val="E8E8E8"/>
+                <w:sz w:val="19"/>
+                <w:szCs w:val="19"/>
+              </w:rPr>
+              <w:t xml:space="preserve">  -FilePath C:\temp\mia-pre.cer</w:t>
+            </w:r>
+          </w:p>
+        </w:tc>
+      </w:tr>
+    </w:tbl>
+    <w:p>
+      <w:pPr>
+        <w:pStyle w:val="ListParagraph"/>
+        <w:numPr>
+          <w:ilvl w:val="0"/>
+          <w:numId w:val="5"/>
+        </w:numPr>
+        <w:spacing w:after="140"/>
+      </w:pPr>
+      <w:r>
+        <w:rPr>
+          <w:rFonts w:ascii="Calibri" w:cs="Calibri" w:eastAsia="Calibri" w:hAnsi="Calibri"/>
+          <w:sz w:val="22"/>
+          <w:szCs w:val="22"/>
+        </w:rPr>
+        <w:t xml:space="preserve">Distribuye mia-pre.cer al almacén "Entidades de certificación raíz de confianza" de cada equipo cliente que vaya a usar mIA — por GPO (Configuración del equipo → Directivas → Configuración de Windows → Seguridad → Políticas de clave pública) si el dominio lo permite, o manualmente (certmgr.msc) si son pocos equipos de prueba.</w:t>
+      </w:r>
+    </w:p>
+    <w:p>
+      <w:pPr>
+        <w:spacing w:after="160" w:line="276"/>
+      </w:pPr>
+      <w:r>
+        <w:rPr>
+          <w:rFonts w:ascii="Calibri" w:cs="Calibri" w:eastAsia="Calibri" w:hAnsi="Calibri"/>
+          <w:sz w:val="22"/>
+          <w:szCs w:val="22"/>
+        </w:rPr>
+        <w:t xml:space="preserve">Sin este paso de distribución, el navegador seguirá mostrando el aviso de "conexión no privada" en cada equipo — el login con Entra ID seguirá funcionando tras aceptar el aviso, pero no es la experiencia deseable para los usuarios de la prueba.</w:t>
+      </w:r>
+    </w:p>
+    <w:p>
+      <w:pPr>
+        <w:spacing w:after="160" w:line="276"/>
+      </w:pPr>
+      <w:r>
+        <w:rPr>
+          <w:rFonts w:ascii="Calibri" w:cs="Calibri" w:eastAsia="Calibri" w:hAnsi="Calibri"/>
+          <w:sz w:val="22"/>
+          <w:szCs w:val="22"/>
+        </w:rPr>
+        <w:t xml:space="preserve">El certificado generado en el paso 1 ya queda en el almacén "Personal" del servidor (cert:\LocalMachine\My): selecciónalo directamente en el binding https del paso 7.1, no hace falta instalarlo de nuevo.</w:t>
       </w:r>
     </w:p>
     <w:p>
@@ -12054,7 +12333,7 @@
                 <w:sz w:val="20"/>
                 <w:szCs w:val="20"/>
               </w:rPr>
-              <w:t xml:space="preserve">Certificado SSL no renovado / autofirmado</w:t>
+              <w:t xml:space="preserve">Certificado autofirmado sin distribuir a los equipos cliente</w:t>
             </w:r>
           </w:p>
         </w:tc>
@@ -12085,7 +12364,7 @@
                 <w:sz w:val="20"/>
                 <w:szCs w:val="20"/>
               </w:rPr>
-              <w:t xml:space="preserve">Avisos de seguridad en el navegador; a evitar en preproducción si la van a usar usuarios no técnicos</w:t>
+              <w:t xml:space="preserve">El navegador muestra aviso de "conexión no privada" en cada equipo hasta que se importe el .cer en "Entidades de confianza" (sección 7.2) — el login funciona igualmente tras aceptar el aviso, pero no es la experiencia deseable</w:t>
             </w:r>
           </w:p>
         </w:tc>
@@ -12118,7 +12397,7 @@
                 <w:sz w:val="20"/>
                 <w:szCs w:val="20"/>
               </w:rPr>
-              <w:t xml:space="preserve">Base del frontend (/mia/) mal publicada en IIS</w:t>
+              <w:t xml:space="preserve">Certificado autofirmado con validez larga sin plan de renovación</w:t>
             </w:r>
           </w:p>
         </w:tc>
@@ -12149,7 +12428,7 @@
                 <w:sz w:val="20"/>
                 <w:szCs w:val="20"/>
               </w:rPr>
-              <w:t xml:space="preserve">Pantalla en blanco o errores 404 de JS/CSS al cargar cualquier mundo</w:t>
+              <w:t xml:space="preserve">Revisar la fecha de expiración (5 años en el comando de la sección 7.2) y documentar quién debe renovarlo</w:t>
             </w:r>
           </w:p>
         </w:tc>
@@ -12182,7 +12461,7 @@
                 <w:sz w:val="20"/>
                 <w:szCs w:val="20"/>
               </w:rPr>
-              <w:t xml:space="preserve">Cuenta de servicio con permisos excesivos</w:t>
+              <w:t xml:space="preserve">Base del frontend (/mia/) mal publicada en IIS</w:t>
             </w:r>
           </w:p>
         </w:tc>
@@ -12213,7 +12492,7 @@
                 <w:sz w:val="20"/>
                 <w:szCs w:val="20"/>
               </w:rPr>
-              <w:t xml:space="preserve">Superficie de riesgo innecesaria; usar el principio de mínimo privilegio sobre .env, el .pfx y la base de datos</w:t>
+              <w:t xml:space="preserve">Pantalla en blanco o errores 404 de JS/CSS al cargar cualquier mundo</w:t>
             </w:r>
           </w:p>
         </w:tc>
@@ -12246,7 +12525,7 @@
                 <w:sz w:val="20"/>
                 <w:szCs w:val="20"/>
               </w:rPr>
-              <w:t xml:space="preserve">Puerto 443 no abierto todavía en el firewall</w:t>
+              <w:t xml:space="preserve">Cuenta de servicio con permisos excesivos</w:t>
             </w:r>
           </w:p>
         </w:tc>
@@ -12277,7 +12556,7 @@
                 <w:sz w:val="20"/>
                 <w:szCs w:val="20"/>
               </w:rPr>
-              <w:t xml:space="preserve">SharePoint 2013 solo usa HTTP (80): el 443 puede no haberse abierto nunca en este servidor; confirmarlo explícitamente (sección 7.7), no asumir que ya está permitido</w:t>
+              <w:t xml:space="preserve">Superficie de riesgo innecesaria; usar el principio de mínimo privilegio sobre .env, el .pfx y la base de datos</w:t>
             </w:r>
           </w:p>
         </w:tc>
@@ -12310,7 +12589,7 @@
                 <w:sz w:val="20"/>
                 <w:szCs w:val="20"/>
               </w:rPr>
-              <w:t xml:space="preserve">Sin CA interna desplegada en la organización</w:t>
+              <w:t xml:space="preserve">Puerto 443 no abierto todavía en el firewall</w:t>
             </w:r>
           </w:p>
         </w:tc>
@@ -12341,7 +12620,71 @@
                 <w:sz w:val="20"/>
                 <w:szCs w:val="20"/>
               </w:rPr>
-              <w:t xml:space="preserve">Si no existe Active Directory Certificate Services (o similar), el certificado de mia-pre.sunsetbeachclub.local tendrá que ser autofirmado, con los avisos de navegador que eso implica</w:t>
+              <w:t xml:space="preserve">SharePoint 2013 solo usa HTTP (80): el 443 puede no haberse abierto nunca en este servidor; confirmarlo explícitamente (sección 7.7), no asumir que ya está permitido</w:t>
+            </w:r>
+          </w:p>
+        </w:tc>
+      </w:tr>
+      <w:tr>
+        <w:tc>
+          <w:tcPr>
+            <w:tcW w:type="dxa" w:w="4100"/>
+            <w:tcBorders>
+              <w:top w:val="single" w:color="B7C6E6" w:sz="4"/>
+              <w:left w:val="single" w:color="B7C6E6" w:sz="4"/>
+              <w:bottom w:val="single" w:color="B7C6E6" w:sz="4"/>
+              <w:right w:val="single" w:color="B7C6E6" w:sz="4"/>
+            </w:tcBorders>
+            <w:shd w:fill="F2F2F2" w:val="clear"/>
+            <w:tcMar>
+              <w:top w:type="dxa" w:w="90"/>
+              <w:left w:type="dxa" w:w="140"/>
+              <w:bottom w:type="dxa" w:w="90"/>
+              <w:right w:type="dxa" w:w="140"/>
+            </w:tcMar>
+            <w:vAlign w:val="center"/>
+          </w:tcPr>
+          <w:p>
+            <w:r>
+              <w:rPr>
+                <w:rFonts w:ascii="Calibri" w:cs="Calibri" w:eastAsia="Calibri" w:hAnsi="Calibri"/>
+                <w:b w:val="false"/>
+                <w:bCs w:val="false"/>
+                <w:sz w:val="20"/>
+                <w:szCs w:val="20"/>
+              </w:rPr>
+              <w:t xml:space="preserve">MIA_AUTH__MODE debe ser "entra" (no "dev") para que el login sea real</w:t>
+            </w:r>
+          </w:p>
+        </w:tc>
+        <w:tc>
+          <w:tcPr>
+            <w:tcW w:type="dxa" w:w="4926"/>
+            <w:tcBorders>
+              <w:top w:val="single" w:color="B7C6E6" w:sz="4"/>
+              <w:left w:val="single" w:color="B7C6E6" w:sz="4"/>
+              <w:bottom w:val="single" w:color="B7C6E6" w:sz="4"/>
+              <w:right w:val="single" w:color="B7C6E6" w:sz="4"/>
+            </w:tcBorders>
+            <w:shd w:fill="F2F2F2" w:val="clear"/>
+            <w:tcMar>
+              <w:top w:type="dxa" w:w="90"/>
+              <w:left w:type="dxa" w:w="140"/>
+              <w:bottom w:type="dxa" w:w="90"/>
+              <w:right w:type="dxa" w:w="140"/>
+            </w:tcMar>
+            <w:vAlign w:val="center"/>
+          </w:tcPr>
+          <w:p>
+            <w:r>
+              <w:rPr>
+                <w:rFonts w:ascii="Calibri" w:cs="Calibri" w:eastAsia="Calibri" w:hAnsi="Calibri"/>
+                <w:b w:val="false"/>
+                <w:bCs w:val="false"/>
+                <w:sz w:val="20"/>
+                <w:szCs w:val="20"/>
+              </w:rPr>
+              <w:t xml:space="preserve">Confirmar que el .env de preproducción queda en modo entra con el tenant/client id reales — "dev" seguiría usando una identidad fija de pruebas</w:t>
             </w:r>
           </w:p>
         </w:tc>

</xml_diff>

<commit_message>
Integra calendario corporativo y mejoras de informes y presentacion
</commit_message>
<xml_diff>
--- a/docs/Guia_Instalacion_mIA_Preproduccion.docx
+++ b/docs/Guia_Instalacion_mIA_Preproduccion.docx
@@ -3593,23 +3593,7 @@
                 <w:sz w:val="20"/>
                 <w:szCs w:val="20"/>
               </w:rPr>
-              <w:t>mia-</w:t>
-            </w:r>
-            <w:proofErr w:type="gramStart"/>
-            <w:r>
-              <w:rPr>
-                <w:sz w:val="20"/>
-                <w:szCs w:val="20"/>
-              </w:rPr>
-              <w:t>pre.sunsetbeachclub</w:t>
-            </w:r>
-            <w:proofErr w:type="gramEnd"/>
-            <w:r>
-              <w:rPr>
-                <w:sz w:val="20"/>
-                <w:szCs w:val="20"/>
-              </w:rPr>
-              <w:t>.local</w:t>
+              <w:t>mia-pre.sunsetbeachclub.local</w:t>
             </w:r>
             <w:proofErr w:type="spellEnd"/>
             <w:r>
@@ -3699,21 +3683,12 @@
           </w:tcPr>
           <w:p>
             <w:proofErr w:type="spellStart"/>
-            <w:proofErr w:type="gramStart"/>
-            <w:r>
-              <w:rPr>
-                <w:sz w:val="20"/>
-                <w:szCs w:val="20"/>
-              </w:rPr>
-              <w:t>portal.sunsetbeachclub</w:t>
-            </w:r>
-            <w:proofErr w:type="gramEnd"/>
-            <w:r>
-              <w:rPr>
-                <w:sz w:val="20"/>
-                <w:szCs w:val="20"/>
-              </w:rPr>
-              <w:t>.local</w:t>
+            <w:r>
+              <w:rPr>
+                <w:sz w:val="20"/>
+                <w:szCs w:val="20"/>
+              </w:rPr>
+              <w:t>portal.sunsetbeachclub.local</w:t>
             </w:r>
             <w:proofErr w:type="spellEnd"/>
             <w:r>
@@ -4203,15 +4178,7 @@
       </w:r>
       <w:proofErr w:type="spellStart"/>
       <w:r>
-        <w:t>mia-</w:t>
-      </w:r>
-      <w:proofErr w:type="gramStart"/>
-      <w:r>
-        <w:t>pre.sunsetbeachclub</w:t>
-      </w:r>
-      <w:proofErr w:type="gramEnd"/>
-      <w:r>
-        <w:t>.local</w:t>
+        <w:t>mia-pre.sunsetbeachclub.local</w:t>
       </w:r>
       <w:proofErr w:type="spellEnd"/>
       <w:r>
@@ -4564,15 +4531,7 @@
       </w:r>
       <w:proofErr w:type="spellStart"/>
       <w:r>
-        <w:t>mia-</w:t>
-      </w:r>
-      <w:proofErr w:type="gramStart"/>
-      <w:r>
-        <w:t>pre.sunsetbeachclub</w:t>
-      </w:r>
-      <w:proofErr w:type="gramEnd"/>
-      <w:r>
-        <w:t>.local</w:t>
+        <w:t>mia-pre.sunsetbeachclub.local</w:t>
       </w:r>
       <w:proofErr w:type="spellEnd"/>
       <w:r>
@@ -4636,18 +4595,8 @@
                 <w:bCs/>
                 <w:color w:val="7D4F0A"/>
               </w:rPr>
-              <w:t xml:space="preserve">Implicaciones de usar el </w:t>
-            </w:r>
-            <w:proofErr w:type="gramStart"/>
-            <w:r>
-              <w:rPr>
-                <w:b/>
-                <w:bCs/>
-                <w:color w:val="7D4F0A"/>
-              </w:rPr>
-              <w:t>sufijo .local</w:t>
-            </w:r>
-            <w:proofErr w:type="gramEnd"/>
+              <w:t>Implicaciones de usar el sufijo .local</w:t>
+            </w:r>
           </w:p>
           <w:p>
             <w:r>
@@ -4656,25 +4605,25 @@
                 <w:sz w:val="21"/>
                 <w:szCs w:val="21"/>
               </w:rPr>
-              <w:t xml:space="preserve">Al </w:t>
-            </w:r>
-            <w:proofErr w:type="gramStart"/>
+              <w:t>Al ser .local (y no .</w:t>
+            </w:r>
+            <w:proofErr w:type="spellStart"/>
             <w:r>
               <w:rPr>
                 <w:color w:val="5A3A08"/>
                 <w:sz w:val="21"/>
                 <w:szCs w:val="21"/>
               </w:rPr>
-              <w:t>ser .local</w:t>
-            </w:r>
-            <w:proofErr w:type="gramEnd"/>
+              <w:t>com</w:t>
+            </w:r>
+            <w:proofErr w:type="spellEnd"/>
             <w:r>
               <w:rPr>
                 <w:color w:val="5A3A08"/>
                 <w:sz w:val="21"/>
                 <w:szCs w:val="21"/>
               </w:rPr>
-              <w:t xml:space="preserve"> (y no .</w:t>
+              <w:t xml:space="preserve">), ambas URL son de uso exclusivamente interno: solo resuelven dentro de la red corporativa (normalmente porque </w:t>
             </w:r>
             <w:proofErr w:type="spellStart"/>
             <w:r>
@@ -4683,7 +4632,7 @@
                 <w:sz w:val="21"/>
                 <w:szCs w:val="21"/>
               </w:rPr>
-              <w:t>com</w:t>
+              <w:t>sunsetbeachclub.local</w:t>
             </w:r>
             <w:proofErr w:type="spellEnd"/>
             <w:r>
@@ -4692,100 +4641,34 @@
                 <w:sz w:val="21"/>
                 <w:szCs w:val="21"/>
               </w:rPr>
-              <w:t xml:space="preserve">), ambas URL son de uso exclusivamente interno: solo resuelven dentro de la red corporativa (normalmente porque </w:t>
-            </w:r>
-            <w:proofErr w:type="spellStart"/>
-            <w:proofErr w:type="gramStart"/>
+              <w:t xml:space="preserve"> es el propio dominio de Active Directory), nunca desde internet. Además, ninguna CA pública puede emitir certificados SSL para nombres .local desde 2015 (lo prohíben las reglas del CA/Browser Forum): el certificado de </w:t>
+            </w:r>
+            <w:proofErr w:type="spellStart"/>
             <w:r>
               <w:rPr>
                 <w:color w:val="5A3A08"/>
                 <w:sz w:val="21"/>
                 <w:szCs w:val="21"/>
               </w:rPr>
-              <w:t>sunsetbeachclub.local</w:t>
-            </w:r>
-            <w:proofErr w:type="spellEnd"/>
-            <w:proofErr w:type="gramEnd"/>
+              <w:t>mia-pre.sunsetbeachclub.local</w:t>
+            </w:r>
+            <w:proofErr w:type="spellEnd"/>
             <w:r>
               <w:rPr>
                 <w:color w:val="5A3A08"/>
                 <w:sz w:val="21"/>
                 <w:szCs w:val="21"/>
               </w:rPr>
-              <w:t xml:space="preserve"> es el propio dominio de Active Directory), nunca desde internet. Además, ninguna CA pública puede emitir certificados SSL para </w:t>
-            </w:r>
-            <w:proofErr w:type="gramStart"/>
+              <w:t xml:space="preserve"> no puede venir de una CA pública bajo ningún concepto. Nota adicional: </w:t>
+            </w:r>
+            <w:proofErr w:type="spellStart"/>
             <w:r>
               <w:rPr>
                 <w:color w:val="5A3A08"/>
                 <w:sz w:val="21"/>
                 <w:szCs w:val="21"/>
               </w:rPr>
-              <w:t>nombres .local</w:t>
-            </w:r>
-            <w:proofErr w:type="gramEnd"/>
-            <w:r>
-              <w:rPr>
-                <w:color w:val="5A3A08"/>
-                <w:sz w:val="21"/>
-                <w:szCs w:val="21"/>
-              </w:rPr>
-              <w:t xml:space="preserve"> desde 2015 (lo prohíben las reglas del CA/Browser Forum): el certificado de </w:t>
-            </w:r>
-            <w:proofErr w:type="spellStart"/>
-            <w:r>
-              <w:rPr>
-                <w:color w:val="5A3A08"/>
-                <w:sz w:val="21"/>
-                <w:szCs w:val="21"/>
-              </w:rPr>
-              <w:t>mia-</w:t>
-            </w:r>
-            <w:proofErr w:type="gramStart"/>
-            <w:r>
-              <w:rPr>
-                <w:color w:val="5A3A08"/>
-                <w:sz w:val="21"/>
-                <w:szCs w:val="21"/>
-              </w:rPr>
-              <w:t>pre.sunsetbeachclub</w:t>
-            </w:r>
-            <w:proofErr w:type="gramEnd"/>
-            <w:r>
-              <w:rPr>
-                <w:color w:val="5A3A08"/>
-                <w:sz w:val="21"/>
-                <w:szCs w:val="21"/>
-              </w:rPr>
-              <w:t>.local</w:t>
-            </w:r>
-            <w:proofErr w:type="spellEnd"/>
-            <w:r>
-              <w:rPr>
-                <w:color w:val="5A3A08"/>
-                <w:sz w:val="21"/>
-                <w:szCs w:val="21"/>
-              </w:rPr>
-              <w:t xml:space="preserve"> no puede venir de una CA pública bajo ningún concepto. Nota adicional: </w:t>
-            </w:r>
-            <w:proofErr w:type="spellStart"/>
-            <w:proofErr w:type="gramStart"/>
-            <w:r>
-              <w:rPr>
-                <w:color w:val="5A3A08"/>
-                <w:sz w:val="21"/>
-                <w:szCs w:val="21"/>
-              </w:rPr>
-              <w:t>portal.sunsetbeachclub</w:t>
-            </w:r>
-            <w:proofErr w:type="gramEnd"/>
-            <w:r>
-              <w:rPr>
-                <w:color w:val="5A3A08"/>
-                <w:sz w:val="21"/>
-                <w:szCs w:val="21"/>
-              </w:rPr>
-              <w:t>.local</w:t>
+              <w:t>portal.sunsetbeachclub.local</w:t>
             </w:r>
             <w:proofErr w:type="spellEnd"/>
             <w:r>
@@ -4959,52 +4842,16 @@
                 <w:sz w:val="21"/>
                 <w:szCs w:val="21"/>
               </w:rPr>
-              <w:t xml:space="preserve"> URI de la aplicación sea https:// para cualquier host que no sea exactamente "localhost" — es una restricción de la propia plataforma, no una recomendación de esta guía. Por </w:t>
-            </w:r>
-            <w:proofErr w:type="gramStart"/>
+              <w:t xml:space="preserve"> URI de la aplicación sea https:// para cualquier host que no sea exactamente "localhost" — es una restricción de la propia plataforma, no una recomendación de esta guía. Por tanto HTTPS no es opcional en </w:t>
+            </w:r>
+            <w:proofErr w:type="spellStart"/>
             <w:r>
               <w:rPr>
                 <w:color w:val="5A3A08"/>
                 <w:sz w:val="21"/>
                 <w:szCs w:val="21"/>
               </w:rPr>
-              <w:t>tanto</w:t>
-            </w:r>
-            <w:proofErr w:type="gramEnd"/>
-            <w:r>
-              <w:rPr>
-                <w:color w:val="5A3A08"/>
-                <w:sz w:val="21"/>
-                <w:szCs w:val="21"/>
-              </w:rPr>
-              <w:t xml:space="preserve"> HTTPS no es opcional en </w:t>
-            </w:r>
-            <w:proofErr w:type="spellStart"/>
-            <w:r>
-              <w:rPr>
-                <w:color w:val="5A3A08"/>
-                <w:sz w:val="21"/>
-                <w:szCs w:val="21"/>
-              </w:rPr>
-              <w:t>mia-</w:t>
-            </w:r>
-            <w:proofErr w:type="gramStart"/>
-            <w:r>
-              <w:rPr>
-                <w:color w:val="5A3A08"/>
-                <w:sz w:val="21"/>
-                <w:szCs w:val="21"/>
-              </w:rPr>
-              <w:t>pre.sunsetbeachclub</w:t>
-            </w:r>
-            <w:proofErr w:type="gramEnd"/>
-            <w:r>
-              <w:rPr>
-                <w:color w:val="5A3A08"/>
-                <w:sz w:val="21"/>
-                <w:szCs w:val="21"/>
-              </w:rPr>
-              <w:t>.local</w:t>
+              <w:t>mia-pre.sunsetbeachclub.local</w:t>
             </w:r>
             <w:proofErr w:type="spellEnd"/>
             <w:r>
@@ -5316,23 +5163,7 @@
                 <w:sz w:val="20"/>
                 <w:szCs w:val="20"/>
               </w:rPr>
-              <w:t>mia-</w:t>
-            </w:r>
-            <w:proofErr w:type="gramStart"/>
-            <w:r>
-              <w:rPr>
-                <w:sz w:val="20"/>
-                <w:szCs w:val="20"/>
-              </w:rPr>
-              <w:t>pre.sunsetbeachclub</w:t>
-            </w:r>
-            <w:proofErr w:type="gramEnd"/>
-            <w:r>
-              <w:rPr>
-                <w:sz w:val="20"/>
-                <w:szCs w:val="20"/>
-              </w:rPr>
-              <w:t>.local</w:t>
+              <w:t>mia-pre.sunsetbeachclub.local</w:t>
             </w:r>
             <w:proofErr w:type="spellEnd"/>
           </w:p>
@@ -5408,23 +5239,7 @@
                 <w:sz w:val="20"/>
                 <w:szCs w:val="20"/>
               </w:rPr>
-              <w:t>mia-</w:t>
-            </w:r>
-            <w:proofErr w:type="gramStart"/>
-            <w:r>
-              <w:rPr>
-                <w:sz w:val="20"/>
-                <w:szCs w:val="20"/>
-              </w:rPr>
-              <w:t>pre.sunsetbeachclub</w:t>
-            </w:r>
-            <w:proofErr w:type="gramEnd"/>
-            <w:r>
-              <w:rPr>
-                <w:sz w:val="20"/>
-                <w:szCs w:val="20"/>
-              </w:rPr>
-              <w:t>.local</w:t>
+              <w:t>mia-pre.sunsetbeachclub.local</w:t>
             </w:r>
             <w:proofErr w:type="spellEnd"/>
             <w:r>
@@ -5918,23 +5733,13 @@
               <w:t>El SharePoint 2013 instalado en este servidor (</w:t>
             </w:r>
             <w:proofErr w:type="spellStart"/>
-            <w:proofErr w:type="gramStart"/>
             <w:r>
               <w:rPr>
                 <w:color w:val="5A3A08"/>
                 <w:sz w:val="21"/>
                 <w:szCs w:val="21"/>
               </w:rPr>
-              <w:t>portal.sunsetbeachclub</w:t>
-            </w:r>
-            <w:proofErr w:type="gramEnd"/>
-            <w:r>
-              <w:rPr>
-                <w:color w:val="5A3A08"/>
-                <w:sz w:val="21"/>
-                <w:szCs w:val="21"/>
-              </w:rPr>
-              <w:t>.local</w:t>
+              <w:t>portal.sunsetbeachclub.local</w:t>
             </w:r>
             <w:proofErr w:type="spellEnd"/>
             <w:r>
@@ -7273,7 +7078,6 @@
               <w:t xml:space="preserve">  --add </w:t>
             </w:r>
             <w:proofErr w:type="spellStart"/>
-            <w:proofErr w:type="gramStart"/>
             <w:r>
               <w:rPr>
                 <w:rFonts w:ascii="Consolas" w:eastAsia="Consolas" w:hAnsi="Consolas" w:cs="Consolas"/>
@@ -7284,7 +7088,6 @@
               <w:t>Microsoft.VisualStudio.Workload.VCTools</w:t>
             </w:r>
             <w:proofErr w:type="spellEnd"/>
-            <w:proofErr w:type="gramEnd"/>
             <w:r>
               <w:rPr>
                 <w:rFonts w:ascii="Consolas" w:eastAsia="Consolas" w:hAnsi="Consolas" w:cs="Consolas"/>
@@ -8465,7 +8268,6 @@
               <w:t xml:space="preserve"> -m </w:t>
             </w:r>
             <w:proofErr w:type="spellStart"/>
-            <w:proofErr w:type="gramStart"/>
             <w:r>
               <w:rPr>
                 <w:rFonts w:ascii="Consolas" w:eastAsia="Consolas" w:hAnsi="Consolas" w:cs="Consolas"/>
@@ -8496,7 +8298,6 @@
               <w:t>venv</w:t>
             </w:r>
             <w:proofErr w:type="spellEnd"/>
-            <w:proofErr w:type="gramEnd"/>
           </w:p>
           <w:p>
             <w:r>
@@ -8568,19 +8369,8 @@
                 <w:sz w:val="19"/>
                 <w:szCs w:val="19"/>
               </w:rPr>
-              <w:t xml:space="preserve"> -</w:t>
-            </w:r>
-            <w:proofErr w:type="gramStart"/>
-            <w:r>
-              <w:rPr>
-                <w:rFonts w:ascii="Consolas" w:eastAsia="Consolas" w:hAnsi="Consolas" w:cs="Consolas"/>
-                <w:color w:val="E8E8E8"/>
-                <w:sz w:val="19"/>
-                <w:szCs w:val="19"/>
-              </w:rPr>
-              <w:t>e .</w:t>
-            </w:r>
-            <w:proofErr w:type="gramEnd"/>
+              <w:t xml:space="preserve"> -e .</w:t>
+            </w:r>
           </w:p>
         </w:tc>
       </w:tr>
@@ -8631,32 +8421,22 @@
       <w:pPr>
         <w:spacing w:after="160" w:line="276" w:lineRule="auto"/>
       </w:pPr>
-      <w:proofErr w:type="gramStart"/>
       <w:r>
         <w:t>Copia .</w:t>
       </w:r>
       <w:proofErr w:type="spellStart"/>
       <w:r>
+        <w:t>env.example</w:t>
+      </w:r>
+      <w:proofErr w:type="spellEnd"/>
+      <w:r>
+        <w:t xml:space="preserve"> a .</w:t>
+      </w:r>
+      <w:proofErr w:type="spellStart"/>
+      <w:r>
         <w:t>env</w:t>
       </w:r>
-      <w:proofErr w:type="gramEnd"/>
-      <w:r>
-        <w:t>.example</w:t>
-      </w:r>
       <w:proofErr w:type="spellEnd"/>
-      <w:r>
-        <w:t xml:space="preserve"> </w:t>
-      </w:r>
-      <w:proofErr w:type="gramStart"/>
-      <w:r>
-        <w:t>a .</w:t>
-      </w:r>
-      <w:proofErr w:type="spellStart"/>
-      <w:r>
-        <w:t>env</w:t>
-      </w:r>
-      <w:proofErr w:type="spellEnd"/>
-      <w:proofErr w:type="gramEnd"/>
       <w:r>
         <w:t xml:space="preserve"> en la raíz del proyecto y completa los valores reales. Las variables más relevantes para preproducción se detallan en el Anexo A. Resumen de las decisiones clave:</w:t>
       </w:r>
@@ -8734,15 +8514,7 @@
       </w:r>
       <w:proofErr w:type="spellEnd"/>
       <w:r>
-        <w:t xml:space="preserve"> id y </w:t>
-      </w:r>
-      <w:proofErr w:type="gramStart"/>
-      <w:r>
-        <w:t>certificado reales</w:t>
-      </w:r>
-      <w:proofErr w:type="gramEnd"/>
-      <w:r>
-        <w:t xml:space="preserve"> de la aplicación de Entra ID para SharePoint Online.</w:t>
+        <w:t xml:space="preserve"> id y certificado reales de la aplicación de Entra ID para SharePoint Online.</w:t>
       </w:r>
     </w:p>
     <w:p>
@@ -8868,55 +8640,24 @@
               <w:t>(</w:t>
             </w:r>
             <w:proofErr w:type="spellStart"/>
-            <w:proofErr w:type="gramStart"/>
-            <w:r>
-              <w:rPr>
-                <w:rFonts w:ascii="Consolas" w:eastAsia="Consolas" w:hAnsi="Consolas" w:cs="Consolas"/>
-                <w:color w:val="E8E8E8"/>
-                <w:sz w:val="19"/>
-                <w:szCs w:val="19"/>
-              </w:rPr>
-              <w:t>secrets.token</w:t>
-            </w:r>
-            <w:proofErr w:type="gramEnd"/>
-            <w:r>
-              <w:rPr>
-                <w:rFonts w:ascii="Consolas" w:eastAsia="Consolas" w:hAnsi="Consolas" w:cs="Consolas"/>
-                <w:color w:val="E8E8E8"/>
-                <w:sz w:val="19"/>
-                <w:szCs w:val="19"/>
-              </w:rPr>
-              <w:t>_</w:t>
-            </w:r>
-            <w:proofErr w:type="gramStart"/>
-            <w:r>
-              <w:rPr>
-                <w:rFonts w:ascii="Consolas" w:eastAsia="Consolas" w:hAnsi="Consolas" w:cs="Consolas"/>
-                <w:color w:val="E8E8E8"/>
-                <w:sz w:val="19"/>
-                <w:szCs w:val="19"/>
-              </w:rPr>
-              <w:t>urlsafe</w:t>
-            </w:r>
-            <w:proofErr w:type="spellEnd"/>
-            <w:r>
-              <w:rPr>
-                <w:rFonts w:ascii="Consolas" w:eastAsia="Consolas" w:hAnsi="Consolas" w:cs="Consolas"/>
-                <w:color w:val="E8E8E8"/>
-                <w:sz w:val="19"/>
-                <w:szCs w:val="19"/>
-              </w:rPr>
-              <w:t>(</w:t>
-            </w:r>
-            <w:proofErr w:type="gramEnd"/>
-            <w:r>
-              <w:rPr>
-                <w:rFonts w:ascii="Consolas" w:eastAsia="Consolas" w:hAnsi="Consolas" w:cs="Consolas"/>
-                <w:color w:val="E8E8E8"/>
-                <w:sz w:val="19"/>
-                <w:szCs w:val="19"/>
-              </w:rPr>
-              <w:t>32))"</w:t>
+            <w:r>
+              <w:rPr>
+                <w:rFonts w:ascii="Consolas" w:eastAsia="Consolas" w:hAnsi="Consolas" w:cs="Consolas"/>
+                <w:color w:val="E8E8E8"/>
+                <w:sz w:val="19"/>
+                <w:szCs w:val="19"/>
+              </w:rPr>
+              <w:t>secrets.token_urlsafe</w:t>
+            </w:r>
+            <w:proofErr w:type="spellEnd"/>
+            <w:r>
+              <w:rPr>
+                <w:rFonts w:ascii="Consolas" w:eastAsia="Consolas" w:hAnsi="Consolas" w:cs="Consolas"/>
+                <w:color w:val="E8E8E8"/>
+                <w:sz w:val="19"/>
+                <w:szCs w:val="19"/>
+              </w:rPr>
+              <w:t>(32))"</w:t>
             </w:r>
           </w:p>
         </w:tc>
@@ -8987,34 +8728,24 @@
                 <w:bCs/>
                 <w:color w:val="7D4F0A"/>
               </w:rPr>
-              <w:t xml:space="preserve">Seguridad del </w:t>
-            </w:r>
-            <w:proofErr w:type="gramStart"/>
+              <w:t>Seguridad del fichero .</w:t>
+            </w:r>
+            <w:proofErr w:type="spellStart"/>
             <w:r>
               <w:rPr>
                 <w:b/>
                 <w:bCs/>
                 <w:color w:val="7D4F0A"/>
               </w:rPr>
-              <w:t>fichero .</w:t>
-            </w:r>
-            <w:proofErr w:type="spellStart"/>
+              <w:t>env</w:t>
+            </w:r>
+            <w:proofErr w:type="spellEnd"/>
             <w:r>
               <w:rPr>
                 <w:b/>
                 <w:bCs/>
                 <w:color w:val="7D4F0A"/>
               </w:rPr>
-              <w:t>env</w:t>
-            </w:r>
-            <w:proofErr w:type="spellEnd"/>
-            <w:proofErr w:type="gramEnd"/>
-            <w:r>
-              <w:rPr>
-                <w:b/>
-                <w:bCs/>
-                <w:color w:val="7D4F0A"/>
-              </w:rPr>
               <w:t xml:space="preserve"> y del certificado</w:t>
             </w:r>
           </w:p>
@@ -9025,28 +8756,18 @@
                 <w:sz w:val="21"/>
                 <w:szCs w:val="21"/>
               </w:rPr>
-              <w:t xml:space="preserve">Restringe los permisos NTFS </w:t>
-            </w:r>
-            <w:proofErr w:type="gramStart"/>
+              <w:t>Restringe los permisos NTFS de .</w:t>
+            </w:r>
+            <w:proofErr w:type="spellStart"/>
             <w:r>
               <w:rPr>
                 <w:color w:val="5A3A08"/>
                 <w:sz w:val="21"/>
                 <w:szCs w:val="21"/>
               </w:rPr>
-              <w:t>de .</w:t>
-            </w:r>
-            <w:proofErr w:type="spellStart"/>
-            <w:r>
-              <w:rPr>
-                <w:color w:val="5A3A08"/>
-                <w:sz w:val="21"/>
-                <w:szCs w:val="21"/>
-              </w:rPr>
               <w:t>env</w:t>
             </w:r>
             <w:proofErr w:type="spellEnd"/>
-            <w:proofErr w:type="gramEnd"/>
             <w:r>
               <w:rPr>
                 <w:color w:val="5A3A08"/>
@@ -9680,7 +9401,6 @@
         <w:t xml:space="preserve">" si </w:t>
       </w:r>
       <w:proofErr w:type="spellStart"/>
-      <w:proofErr w:type="gramStart"/>
       <w:r>
         <w:t>el</w:t>
       </w:r>
@@ -9693,7 +9413,6 @@
         <w:t>env</w:t>
       </w:r>
       <w:proofErr w:type="spellEnd"/>
-      <w:proofErr w:type="gramEnd"/>
       <w:r>
         <w:t xml:space="preserve"> tiene permisos restringidos a otra cuenta.</w:t>
       </w:r>
@@ -9845,25 +9564,14 @@
               <w:t xml:space="preserve"> -m </w:t>
             </w:r>
             <w:proofErr w:type="spellStart"/>
-            <w:proofErr w:type="gramStart"/>
-            <w:r>
-              <w:rPr>
-                <w:rFonts w:ascii="Consolas" w:eastAsia="Consolas" w:hAnsi="Consolas" w:cs="Consolas"/>
-                <w:color w:val="E8E8E8"/>
-                <w:sz w:val="19"/>
-                <w:szCs w:val="19"/>
-              </w:rPr>
-              <w:t>mia.ingestion</w:t>
-            </w:r>
-            <w:proofErr w:type="gramEnd"/>
-            <w:r>
-              <w:rPr>
-                <w:rFonts w:ascii="Consolas" w:eastAsia="Consolas" w:hAnsi="Consolas" w:cs="Consolas"/>
-                <w:color w:val="E8E8E8"/>
-                <w:sz w:val="19"/>
-                <w:szCs w:val="19"/>
-              </w:rPr>
-              <w:t>.sync</w:t>
+            <w:r>
+              <w:rPr>
+                <w:rFonts w:ascii="Consolas" w:eastAsia="Consolas" w:hAnsi="Consolas" w:cs="Consolas"/>
+                <w:color w:val="E8E8E8"/>
+                <w:sz w:val="19"/>
+                <w:szCs w:val="19"/>
+              </w:rPr>
+              <w:t>mia.ingestion.sync</w:t>
             </w:r>
             <w:proofErr w:type="spellEnd"/>
             <w:r>
@@ -9909,25 +9617,14 @@
               <w:t xml:space="preserve"> -m </w:t>
             </w:r>
             <w:proofErr w:type="spellStart"/>
-            <w:proofErr w:type="gramStart"/>
-            <w:r>
-              <w:rPr>
-                <w:rFonts w:ascii="Consolas" w:eastAsia="Consolas" w:hAnsi="Consolas" w:cs="Consolas"/>
-                <w:color w:val="E8E8E8"/>
-                <w:sz w:val="19"/>
-                <w:szCs w:val="19"/>
-              </w:rPr>
-              <w:t>mia.ingestion</w:t>
-            </w:r>
-            <w:proofErr w:type="gramEnd"/>
-            <w:r>
-              <w:rPr>
-                <w:rFonts w:ascii="Consolas" w:eastAsia="Consolas" w:hAnsi="Consolas" w:cs="Consolas"/>
-                <w:color w:val="E8E8E8"/>
-                <w:sz w:val="19"/>
-                <w:szCs w:val="19"/>
-              </w:rPr>
-              <w:t>.sync</w:t>
+            <w:r>
+              <w:rPr>
+                <w:rFonts w:ascii="Consolas" w:eastAsia="Consolas" w:hAnsi="Consolas" w:cs="Consolas"/>
+                <w:color w:val="E8E8E8"/>
+                <w:sz w:val="19"/>
+                <w:szCs w:val="19"/>
+              </w:rPr>
+              <w:t>mia.ingestion.sync</w:t>
             </w:r>
             <w:proofErr w:type="spellEnd"/>
             <w:r>
@@ -9964,7 +9661,6 @@
         <w:t xml:space="preserve"> a la cuenta de servicio con permisos sobre </w:t>
       </w:r>
       <w:proofErr w:type="spellStart"/>
-      <w:proofErr w:type="gramStart"/>
       <w:r>
         <w:t>el</w:t>
       </w:r>
@@ -9977,7 +9673,6 @@
         <w:t>env</w:t>
       </w:r>
       <w:proofErr w:type="spellEnd"/>
-      <w:proofErr w:type="gramEnd"/>
       <w:r>
         <w:t>):</w:t>
       </w:r>
@@ -10143,25 +9838,14 @@
               <w:t xml:space="preserve"> "C:\apps\mia\current\.venv\Scripts\python.exe -m </w:t>
             </w:r>
             <w:proofErr w:type="spellStart"/>
-            <w:proofErr w:type="gramStart"/>
-            <w:r>
-              <w:rPr>
-                <w:rFonts w:ascii="Consolas" w:eastAsia="Consolas" w:hAnsi="Consolas" w:cs="Consolas"/>
-                <w:color w:val="E8E8E8"/>
-                <w:sz w:val="19"/>
-                <w:szCs w:val="19"/>
-              </w:rPr>
-              <w:t>mia.ingestion</w:t>
-            </w:r>
-            <w:proofErr w:type="gramEnd"/>
-            <w:r>
-              <w:rPr>
-                <w:rFonts w:ascii="Consolas" w:eastAsia="Consolas" w:hAnsi="Consolas" w:cs="Consolas"/>
-                <w:color w:val="E8E8E8"/>
-                <w:sz w:val="19"/>
-                <w:szCs w:val="19"/>
-              </w:rPr>
-              <w:t>.sync</w:t>
+            <w:r>
+              <w:rPr>
+                <w:rFonts w:ascii="Consolas" w:eastAsia="Consolas" w:hAnsi="Consolas" w:cs="Consolas"/>
+                <w:color w:val="E8E8E8"/>
+                <w:sz w:val="19"/>
+                <w:szCs w:val="19"/>
+              </w:rPr>
+              <w:t>mia.ingestion.sync</w:t>
             </w:r>
             <w:proofErr w:type="spellEnd"/>
             <w:r>
@@ -11457,23 +11141,13 @@
               <w:t xml:space="preserve"> existentes de </w:t>
             </w:r>
             <w:proofErr w:type="spellStart"/>
-            <w:proofErr w:type="gramStart"/>
             <w:r>
               <w:rPr>
                 <w:color w:val="5A3A08"/>
                 <w:sz w:val="21"/>
                 <w:szCs w:val="21"/>
               </w:rPr>
-              <w:t>portal.sunsetbeachclub</w:t>
-            </w:r>
-            <w:proofErr w:type="gramEnd"/>
-            <w:r>
-              <w:rPr>
-                <w:color w:val="5A3A08"/>
-                <w:sz w:val="21"/>
-                <w:szCs w:val="21"/>
-              </w:rPr>
-              <w:t>.local</w:t>
+              <w:t>portal.sunsetbeachclub.local</w:t>
             </w:r>
             <w:proofErr w:type="spellEnd"/>
             <w:r>
@@ -11619,15 +11293,7 @@
       </w:r>
       <w:proofErr w:type="spellStart"/>
       <w:r>
-        <w:t>mia-</w:t>
-      </w:r>
-      <w:proofErr w:type="gramStart"/>
-      <w:r>
-        <w:t>pre.sunsetbeachclub</w:t>
-      </w:r>
-      <w:proofErr w:type="gramEnd"/>
-      <w:r>
-        <w:t>.local</w:t>
+        <w:t>mia-pre.sunsetbeachclub.local</w:t>
       </w:r>
       <w:proofErr w:type="spellEnd"/>
       <w:r>
@@ -11746,23 +11412,13 @@
           </w:p>
           <w:p>
             <w:proofErr w:type="spellStart"/>
-            <w:proofErr w:type="gramStart"/>
             <w:r>
               <w:rPr>
                 <w:color w:val="5A3A08"/>
                 <w:sz w:val="21"/>
                 <w:szCs w:val="21"/>
               </w:rPr>
-              <w:t>portal.sunsetbeachclub</w:t>
-            </w:r>
-            <w:proofErr w:type="gramEnd"/>
-            <w:r>
-              <w:rPr>
-                <w:color w:val="5A3A08"/>
-                <w:sz w:val="21"/>
-                <w:szCs w:val="21"/>
-              </w:rPr>
-              <w:t>.local</w:t>
+              <w:t>portal.sunsetbeachclub.local</w:t>
             </w:r>
             <w:proofErr w:type="spellEnd"/>
             <w:r>
@@ -11902,27 +11558,7 @@
                 <w:sz w:val="19"/>
                 <w:szCs w:val="19"/>
               </w:rPr>
-              <w:t>mia-</w:t>
-            </w:r>
-            <w:proofErr w:type="gramStart"/>
-            <w:r>
-              <w:rPr>
-                <w:rFonts w:ascii="Consolas" w:eastAsia="Consolas" w:hAnsi="Consolas" w:cs="Consolas"/>
-                <w:color w:val="E8E8E8"/>
-                <w:sz w:val="19"/>
-                <w:szCs w:val="19"/>
-              </w:rPr>
-              <w:t>pre.sunsetbeachclub</w:t>
-            </w:r>
-            <w:proofErr w:type="gramEnd"/>
-            <w:r>
-              <w:rPr>
-                <w:rFonts w:ascii="Consolas" w:eastAsia="Consolas" w:hAnsi="Consolas" w:cs="Consolas"/>
-                <w:color w:val="E8E8E8"/>
-                <w:sz w:val="19"/>
-                <w:szCs w:val="19"/>
-              </w:rPr>
-              <w:t>.local</w:t>
+              <w:t>mia-pre.sunsetbeachclub.local</w:t>
             </w:r>
             <w:proofErr w:type="spellEnd"/>
             <w:r>
@@ -12074,17 +11710,7 @@
                 <w:sz w:val="19"/>
                 <w:szCs w:val="19"/>
               </w:rPr>
-              <w:t>-Date</w:t>
-            </w:r>
-            <w:proofErr w:type="gramStart"/>
-            <w:r>
-              <w:rPr>
-                <w:rFonts w:ascii="Consolas" w:eastAsia="Consolas" w:hAnsi="Consolas" w:cs="Consolas"/>
-                <w:color w:val="E8E8E8"/>
-                <w:sz w:val="19"/>
-                <w:szCs w:val="19"/>
-              </w:rPr>
-              <w:t>).</w:t>
+              <w:t>-Date).</w:t>
             </w:r>
             <w:proofErr w:type="spellStart"/>
             <w:r>
@@ -12097,7 +11723,6 @@
               <w:t>AddYears</w:t>
             </w:r>
             <w:proofErr w:type="spellEnd"/>
-            <w:proofErr w:type="gramEnd"/>
             <w:r>
               <w:rPr>
                 <w:rFonts w:ascii="Consolas" w:eastAsia="Consolas" w:hAnsi="Consolas" w:cs="Consolas"/>
@@ -12159,7 +11784,6 @@
               <w:t xml:space="preserve"> </w:t>
             </w:r>
             <w:proofErr w:type="spellStart"/>
-            <w:proofErr w:type="gramStart"/>
             <w:r>
               <w:rPr>
                 <w:rFonts w:ascii="Consolas" w:eastAsia="Consolas" w:hAnsi="Consolas" w:cs="Consolas"/>
@@ -12170,7 +11794,6 @@
               <w:t>DigitalSignature,KeyEncipherment</w:t>
             </w:r>
             <w:proofErr w:type="spellEnd"/>
-            <w:proofErr w:type="gramEnd"/>
           </w:p>
         </w:tc>
       </w:tr>
@@ -13381,23 +13004,7 @@
                 <w:sz w:val="20"/>
                 <w:szCs w:val="20"/>
               </w:rPr>
-              <w:t>^api</w:t>
-            </w:r>
-            <w:proofErr w:type="gramStart"/>
-            <w:r>
-              <w:rPr>
-                <w:sz w:val="20"/>
-                <w:szCs w:val="20"/>
-              </w:rPr>
-              <w:t>/(</w:t>
-            </w:r>
-            <w:proofErr w:type="gramEnd"/>
-            <w:r>
-              <w:rPr>
-                <w:sz w:val="20"/>
-                <w:szCs w:val="20"/>
-              </w:rPr>
-              <w:t>.*)</w:t>
+              <w:t>^api/(.*)</w:t>
             </w:r>
           </w:p>
         </w:tc>
@@ -13657,25 +13264,14 @@
               <w:t xml:space="preserve"> </w:t>
             </w:r>
             <w:proofErr w:type="spellStart"/>
-            <w:proofErr w:type="gramStart"/>
-            <w:r>
-              <w:rPr>
-                <w:rFonts w:ascii="Consolas" w:eastAsia="Consolas" w:hAnsi="Consolas" w:cs="Consolas"/>
-                <w:color w:val="E8E8E8"/>
-                <w:sz w:val="19"/>
-                <w:szCs w:val="19"/>
-              </w:rPr>
-              <w:t>mia.main</w:t>
-            </w:r>
-            <w:proofErr w:type="gramEnd"/>
-            <w:r>
-              <w:rPr>
-                <w:rFonts w:ascii="Consolas" w:eastAsia="Consolas" w:hAnsi="Consolas" w:cs="Consolas"/>
-                <w:color w:val="E8E8E8"/>
-                <w:sz w:val="19"/>
-                <w:szCs w:val="19"/>
-              </w:rPr>
-              <w:t>:create_app</w:t>
+            <w:r>
+              <w:rPr>
+                <w:rFonts w:ascii="Consolas" w:eastAsia="Consolas" w:hAnsi="Consolas" w:cs="Consolas"/>
+                <w:color w:val="E8E8E8"/>
+                <w:sz w:val="19"/>
+                <w:szCs w:val="19"/>
+              </w:rPr>
+              <w:t>mia.main:create_app</w:t>
             </w:r>
             <w:proofErr w:type="spellEnd"/>
             <w:r>
@@ -14400,23 +13996,16 @@
         <w:spacing w:after="160" w:line="276" w:lineRule="auto"/>
       </w:pPr>
       <w:proofErr w:type="spellStart"/>
-      <w:proofErr w:type="gramStart"/>
       <w:r>
         <w:t>sunsetbeachclub.local</w:t>
       </w:r>
       <w:proofErr w:type="spellEnd"/>
-      <w:proofErr w:type="gramEnd"/>
       <w:r>
         <w:t xml:space="preserve"> es un sufijo de uso exclusivamente interno (no resuelve en internet). El registro se crea en la zona DNS interna/corporativa — normalmente integrada en Active Directory, la misma zona donde ya existe el registro de </w:t>
       </w:r>
       <w:proofErr w:type="spellStart"/>
-      <w:proofErr w:type="gramStart"/>
-      <w:r>
-        <w:t>portal.sunsetbeachclub</w:t>
-      </w:r>
-      <w:proofErr w:type="gramEnd"/>
-      <w:r>
-        <w:t>.local</w:t>
+      <w:r>
+        <w:t>portal.sunsetbeachclub.local</w:t>
       </w:r>
       <w:proofErr w:type="spellEnd"/>
       <w:r>
@@ -14593,23 +14182,7 @@
                 <w:sz w:val="20"/>
                 <w:szCs w:val="20"/>
               </w:rPr>
-              <w:t>mia-</w:t>
-            </w:r>
-            <w:proofErr w:type="gramStart"/>
-            <w:r>
-              <w:rPr>
-                <w:sz w:val="20"/>
-                <w:szCs w:val="20"/>
-              </w:rPr>
-              <w:t>pre.sunsetbeachclub</w:t>
-            </w:r>
-            <w:proofErr w:type="gramEnd"/>
-            <w:r>
-              <w:rPr>
-                <w:sz w:val="20"/>
-                <w:szCs w:val="20"/>
-              </w:rPr>
-              <w:t>.local</w:t>
+              <w:t>mia-pre.sunsetbeachclub.local</w:t>
             </w:r>
             <w:proofErr w:type="spellEnd"/>
           </w:p>
@@ -14641,21 +14214,12 @@
               <w:t xml:space="preserve">Misma IP (o nombre) que ya resuelve </w:t>
             </w:r>
             <w:proofErr w:type="spellStart"/>
-            <w:proofErr w:type="gramStart"/>
-            <w:r>
-              <w:rPr>
-                <w:sz w:val="20"/>
-                <w:szCs w:val="20"/>
-              </w:rPr>
-              <w:t>portal.sunsetbeachclub</w:t>
-            </w:r>
-            <w:proofErr w:type="gramEnd"/>
-            <w:r>
-              <w:rPr>
-                <w:sz w:val="20"/>
-                <w:szCs w:val="20"/>
-              </w:rPr>
-              <w:t>.local</w:t>
+            <w:r>
+              <w:rPr>
+                <w:sz w:val="20"/>
+                <w:szCs w:val="20"/>
+              </w:rPr>
+              <w:t>portal.sunsetbeachclub.local</w:t>
             </w:r>
             <w:proofErr w:type="spellEnd"/>
             <w:r>
@@ -14677,13 +14241,8 @@
         <w:t xml:space="preserve">Si el servidor de preproducción es distinto del que resuelve </w:t>
       </w:r>
       <w:proofErr w:type="spellStart"/>
-      <w:proofErr w:type="gramStart"/>
-      <w:r>
-        <w:t>portal.sunsetbeachclub</w:t>
-      </w:r>
-      <w:proofErr w:type="gramEnd"/>
-      <w:r>
-        <w:t>.local</w:t>
+      <w:r>
+        <w:t>portal.sunsetbeachclub.local</w:t>
       </w:r>
       <w:proofErr w:type="spellEnd"/>
       <w:r>
@@ -14736,27 +14295,7 @@
                 <w:sz w:val="19"/>
                 <w:szCs w:val="19"/>
               </w:rPr>
-              <w:t>mia-</w:t>
-            </w:r>
-            <w:proofErr w:type="gramStart"/>
-            <w:r>
-              <w:rPr>
-                <w:rFonts w:ascii="Consolas" w:eastAsia="Consolas" w:hAnsi="Consolas" w:cs="Consolas"/>
-                <w:color w:val="E8E8E8"/>
-                <w:sz w:val="19"/>
-                <w:szCs w:val="19"/>
-              </w:rPr>
-              <w:t>pre.sunsetbeachclub</w:t>
-            </w:r>
-            <w:proofErr w:type="gramEnd"/>
-            <w:r>
-              <w:rPr>
-                <w:rFonts w:ascii="Consolas" w:eastAsia="Consolas" w:hAnsi="Consolas" w:cs="Consolas"/>
-                <w:color w:val="E8E8E8"/>
-                <w:sz w:val="19"/>
-                <w:szCs w:val="19"/>
-              </w:rPr>
-              <w:t>.local</w:t>
+              <w:t>mia-pre.sunsetbeachclub.local</w:t>
             </w:r>
             <w:proofErr w:type="spellEnd"/>
           </w:p>
@@ -14838,13 +14377,8 @@
         <w:t xml:space="preserve"> -m </w:t>
       </w:r>
       <w:proofErr w:type="spellStart"/>
-      <w:proofErr w:type="gramStart"/>
-      <w:r>
-        <w:t>mia.ingestion</w:t>
-      </w:r>
-      <w:proofErr w:type="gramEnd"/>
-      <w:r>
-        <w:t>.sync</w:t>
+      <w:r>
+        <w:t>mia.ingestion.sync</w:t>
       </w:r>
       <w:proofErr w:type="spellEnd"/>
       <w:r>
@@ -14953,13 +14487,8 @@
         <w:t xml:space="preserve">Confirmar que </w:t>
       </w:r>
       <w:proofErr w:type="spellStart"/>
-      <w:proofErr w:type="gramStart"/>
-      <w:r>
-        <w:t>portal.sunsetbeachclub</w:t>
-      </w:r>
-      <w:proofErr w:type="gramEnd"/>
-      <w:r>
-        <w:t>.local</w:t>
+      <w:r>
+        <w:t>portal.sunsetbeachclub.local</w:t>
       </w:r>
       <w:proofErr w:type="spellEnd"/>
       <w:r>
@@ -15002,19 +14531,11 @@
         <w:spacing w:after="160" w:line="276" w:lineRule="auto"/>
       </w:pPr>
       <w:r>
-        <w:t xml:space="preserve">Basado </w:t>
-      </w:r>
-      <w:proofErr w:type="gramStart"/>
-      <w:r>
-        <w:t>en .</w:t>
+        <w:t>Basado en .</w:t>
       </w:r>
       <w:proofErr w:type="spellStart"/>
       <w:r>
-        <w:t>env</w:t>
-      </w:r>
-      <w:proofErr w:type="gramEnd"/>
-      <w:r>
-        <w:t>.example</w:t>
+        <w:t>env.example</w:t>
       </w:r>
       <w:proofErr w:type="spellEnd"/>
       <w:r>
@@ -15850,15 +15371,7 @@
                 <w:sz w:val="20"/>
                 <w:szCs w:val="20"/>
               </w:rPr>
-              <w:t xml:space="preserve">Nunca en texto plano fuera </w:t>
-            </w:r>
-            <w:proofErr w:type="gramStart"/>
-            <w:r>
-              <w:rPr>
-                <w:sz w:val="20"/>
-                <w:szCs w:val="20"/>
-              </w:rPr>
-              <w:t>de .</w:t>
+              <w:t>Nunca en texto plano fuera de .</w:t>
             </w:r>
             <w:proofErr w:type="spellStart"/>
             <w:r>
@@ -15869,7 +15382,6 @@
               <w:t>env</w:t>
             </w:r>
             <w:proofErr w:type="spellEnd"/>
-            <w:proofErr w:type="gramEnd"/>
           </w:p>
         </w:tc>
       </w:tr>
@@ -16815,25 +16327,14 @@
               <w:t xml:space="preserve"> -m </w:t>
             </w:r>
             <w:proofErr w:type="spellStart"/>
-            <w:proofErr w:type="gramStart"/>
-            <w:r>
-              <w:rPr>
-                <w:rFonts w:ascii="Consolas" w:eastAsia="Consolas" w:hAnsi="Consolas" w:cs="Consolas"/>
-                <w:color w:val="E8E8E8"/>
-                <w:sz w:val="19"/>
-                <w:szCs w:val="19"/>
-              </w:rPr>
-              <w:t>mia.ingestion</w:t>
-            </w:r>
-            <w:proofErr w:type="gramEnd"/>
-            <w:r>
-              <w:rPr>
-                <w:rFonts w:ascii="Consolas" w:eastAsia="Consolas" w:hAnsi="Consolas" w:cs="Consolas"/>
-                <w:color w:val="E8E8E8"/>
-                <w:sz w:val="19"/>
-                <w:szCs w:val="19"/>
-              </w:rPr>
-              <w:t>.sync</w:t>
+            <w:r>
+              <w:rPr>
+                <w:rFonts w:ascii="Consolas" w:eastAsia="Consolas" w:hAnsi="Consolas" w:cs="Consolas"/>
+                <w:color w:val="E8E8E8"/>
+                <w:sz w:val="19"/>
+                <w:szCs w:val="19"/>
+              </w:rPr>
+              <w:t>mia.ingestion.sync</w:t>
             </w:r>
             <w:proofErr w:type="spellEnd"/>
             <w:r>
@@ -16879,25 +16380,14 @@
               <w:t xml:space="preserve"> -m </w:t>
             </w:r>
             <w:proofErr w:type="spellStart"/>
-            <w:proofErr w:type="gramStart"/>
-            <w:r>
-              <w:rPr>
-                <w:rFonts w:ascii="Consolas" w:eastAsia="Consolas" w:hAnsi="Consolas" w:cs="Consolas"/>
-                <w:color w:val="E8E8E8"/>
-                <w:sz w:val="19"/>
-                <w:szCs w:val="19"/>
-              </w:rPr>
-              <w:t>mia.ingestion</w:t>
-            </w:r>
-            <w:proofErr w:type="gramEnd"/>
-            <w:r>
-              <w:rPr>
-                <w:rFonts w:ascii="Consolas" w:eastAsia="Consolas" w:hAnsi="Consolas" w:cs="Consolas"/>
-                <w:color w:val="E8E8E8"/>
-                <w:sz w:val="19"/>
-                <w:szCs w:val="19"/>
-              </w:rPr>
-              <w:t>.sync</w:t>
+            <w:r>
+              <w:rPr>
+                <w:rFonts w:ascii="Consolas" w:eastAsia="Consolas" w:hAnsi="Consolas" w:cs="Consolas"/>
+                <w:color w:val="E8E8E8"/>
+                <w:sz w:val="19"/>
+                <w:szCs w:val="19"/>
+              </w:rPr>
+              <w:t>mia.ingestion.sync</w:t>
             </w:r>
             <w:proofErr w:type="spellEnd"/>
             <w:r>
@@ -16932,25 +16422,14 @@
               <w:t xml:space="preserve"> -m </w:t>
             </w:r>
             <w:proofErr w:type="spellStart"/>
-            <w:proofErr w:type="gramStart"/>
-            <w:r>
-              <w:rPr>
-                <w:rFonts w:ascii="Consolas" w:eastAsia="Consolas" w:hAnsi="Consolas" w:cs="Consolas"/>
-                <w:color w:val="E8E8E8"/>
-                <w:sz w:val="19"/>
-                <w:szCs w:val="19"/>
-              </w:rPr>
-              <w:t>mia.ingestion</w:t>
-            </w:r>
-            <w:proofErr w:type="gramEnd"/>
-            <w:r>
-              <w:rPr>
-                <w:rFonts w:ascii="Consolas" w:eastAsia="Consolas" w:hAnsi="Consolas" w:cs="Consolas"/>
-                <w:color w:val="E8E8E8"/>
-                <w:sz w:val="19"/>
-                <w:szCs w:val="19"/>
-              </w:rPr>
-              <w:t>.sync</w:t>
+            <w:r>
+              <w:rPr>
+                <w:rFonts w:ascii="Consolas" w:eastAsia="Consolas" w:hAnsi="Consolas" w:cs="Consolas"/>
+                <w:color w:val="E8E8E8"/>
+                <w:sz w:val="19"/>
+                <w:szCs w:val="19"/>
+              </w:rPr>
+              <w:t>mia.ingestion.sync</w:t>
             </w:r>
             <w:proofErr w:type="spellEnd"/>
             <w:r>
@@ -18894,15 +18373,7 @@
                 <w:sz w:val="20"/>
                 <w:szCs w:val="20"/>
               </w:rPr>
-              <w:t xml:space="preserve">Superficie de riesgo innecesaria; usar el principio de mínimo privilegio </w:t>
-            </w:r>
-            <w:proofErr w:type="gramStart"/>
-            <w:r>
-              <w:rPr>
-                <w:sz w:val="20"/>
-                <w:szCs w:val="20"/>
-              </w:rPr>
-              <w:t>sobre .</w:t>
+              <w:t>Superficie de riesgo innecesaria; usar el principio de mínimo privilegio sobre .</w:t>
             </w:r>
             <w:proofErr w:type="spellStart"/>
             <w:r>
@@ -18913,7 +18384,6 @@
               <w:t>env</w:t>
             </w:r>
             <w:proofErr w:type="spellEnd"/>
-            <w:proofErr w:type="gramEnd"/>
             <w:r>
               <w:rPr>
                 <w:sz w:val="20"/>
@@ -19086,7 +18556,6 @@
               <w:t xml:space="preserve">Confirmar que </w:t>
             </w:r>
             <w:proofErr w:type="spellStart"/>
-            <w:proofErr w:type="gramStart"/>
             <w:r>
               <w:rPr>
                 <w:sz w:val="20"/>
@@ -19111,7 +18580,6 @@
               <w:t>env</w:t>
             </w:r>
             <w:proofErr w:type="spellEnd"/>
-            <w:proofErr w:type="gramEnd"/>
             <w:r>
               <w:rPr>
                 <w:sz w:val="20"/>
@@ -19385,6 +18853,26 @@
         <w:t>, imprescindible tras lo de hoy):</w:t>
       </w:r>
     </w:p>
+    <w:p/>
+    <w:p>
+      <w:proofErr w:type="spellStart"/>
+      <w:r>
+        <w:t>robocopy</w:t>
+      </w:r>
+      <w:proofErr w:type="spellEnd"/>
+      <w:r>
+        <w:t xml:space="preserve"> "\\tsclient\C\Users\enriq\Desktop\Proyectos\Sunset\mIA\frontend\dist" "C:\apps\mia\current\frontend\dist" /MIR /XF </w:t>
+      </w:r>
+      <w:proofErr w:type="spellStart"/>
+      <w:r>
+        <w:t>web.config</w:t>
+      </w:r>
+      <w:proofErr w:type="spellEnd"/>
+      <w:r>
+        <w:t xml:space="preserve"> /R:2 /W:5</w:t>
+      </w:r>
+    </w:p>
+    <w:p/>
     <w:p>
       <w:proofErr w:type="spellStart"/>
       <w:r>
@@ -19468,6 +18956,129 @@
       </w:r>
     </w:p>
     <w:p/>
+    <w:p/>
+    <w:p>
+      <w:pPr>
+        <w:rPr>
+          <w:b/>
+          <w:bCs/>
+        </w:rPr>
+      </w:pPr>
+      <w:r>
+        <w:rPr>
+          <w:b/>
+          <w:bCs/>
+        </w:rPr>
+        <w:t>Página de Diagnostico</w:t>
+      </w:r>
+    </w:p>
+    <w:p/>
+    <w:p>
+      <w:pPr>
+        <w:rPr>
+          <w:b/>
+          <w:bCs/>
+        </w:rPr>
+      </w:pPr>
+      <w:hyperlink r:id="rId5" w:history="1">
+        <w:r>
+          <w:rPr>
+            <w:rStyle w:val="Hipervnculo"/>
+            <w:b/>
+            <w:bCs/>
+          </w:rPr>
+          <w:t>https://mia-pre.sunsetbeachclub.local/api/admin/diagnostics/</w:t>
+        </w:r>
+      </w:hyperlink>
+    </w:p>
+    <w:p>
+      <w:pPr>
+        <w:rPr>
+          <w:b/>
+          <w:bCs/>
+        </w:rPr>
+      </w:pPr>
+      <w:hyperlink r:id="rId6" w:history="1">
+        <w:r>
+          <w:rPr>
+            <w:rStyle w:val="Hipervnculo"/>
+            <w:b/>
+            <w:bCs/>
+          </w:rPr>
+          <w:t>nominas@sunsetbeachclub.com</w:t>
+        </w:r>
+      </w:hyperlink>
+    </w:p>
+    <w:p>
+      <w:r>
+        <w:t>mIADiag123</w:t>
+      </w:r>
+    </w:p>
+    <w:p/>
+    <w:p>
+      <w:proofErr w:type="spellStart"/>
+      <w:r>
+        <w:t>blackduck</w:t>
+      </w:r>
+      <w:proofErr w:type="spellEnd"/>
+      <w:r>
+        <w:t xml:space="preserve"> </w:t>
+      </w:r>
+      <w:proofErr w:type="spellStart"/>
+      <w:r>
+        <w:t>hub</w:t>
+      </w:r>
+      <w:proofErr w:type="spellEnd"/>
+      <w:r>
+        <w:t xml:space="preserve"> Para </w:t>
+      </w:r>
+      <w:proofErr w:type="spellStart"/>
+      <w:r>
+        <w:t>COdigo</w:t>
+      </w:r>
+      <w:proofErr w:type="spellEnd"/>
+      <w:r>
+        <w:t xml:space="preserve"> </w:t>
+      </w:r>
+      <w:proofErr w:type="spellStart"/>
+      <w:r>
+        <w:t>LEGAl</w:t>
+      </w:r>
+      <w:proofErr w:type="spellEnd"/>
+    </w:p>
+    <w:p>
+      <w:r>
+        <w:t xml:space="preserve">El </w:t>
+      </w:r>
+      <w:proofErr w:type="spellStart"/>
+      <w:r>
+        <w:rPr>
+          <w:b/>
+          <w:bCs/>
+        </w:rPr>
+        <w:t>system</w:t>
+      </w:r>
+      <w:proofErr w:type="spellEnd"/>
+      <w:r>
+        <w:rPr>
+          <w:b/>
+          <w:bCs/>
+        </w:rPr>
+        <w:t xml:space="preserve"> </w:t>
+      </w:r>
+      <w:proofErr w:type="spellStart"/>
+      <w:r>
+        <w:rPr>
+          <w:b/>
+          <w:bCs/>
+        </w:rPr>
+        <w:t>prompt</w:t>
+      </w:r>
+      <w:proofErr w:type="spellEnd"/>
+      <w:r>
+        <w:t xml:space="preserve"> (o mensaje de sistema) es fundamental porque define la identidad base, los límites, el tono y las reglas de comportamiento de un modelo de inteligencia artificial antes de que el usuario escriba una sola palabra</w:t>
+      </w:r>
+    </w:p>
     <w:sectPr>
       <w:pgSz w:w="11906" w:h="16838"/>
       <w:pgMar w:top="1440" w:right="1440" w:bottom="1440" w:left="1440" w:header="708" w:footer="708" w:gutter="0"/>
@@ -20866,6 +20477,18 @@
       <w:szCs w:val="20"/>
     </w:rPr>
   </w:style>
+  <w:style w:type="character" w:styleId="Mencinsinresolver">
+    <w:name w:val="Unresolved Mention"/>
+    <w:basedOn w:val="Fuentedeprrafopredeter"/>
+    <w:uiPriority w:val="99"/>
+    <w:semiHidden/>
+    <w:unhideWhenUsed/>
+    <w:rsid w:val="00CD2C19"/>
+    <w:rPr>
+      <w:color w:val="605E5C"/>
+      <w:shd w:val="clear" w:color="auto" w:fill="E1DFDD"/>
+    </w:rPr>
+  </w:style>
 </w:styles>
 </file>
 

</xml_diff>